<commit_message>
Vídeos 3.A.9 y 3.A.11 rehechos (borradores sin voz) con los criterios del 16/10/2026
- Funciones clave recuadradas en morado que se quedan en la pizarra entre bloques (3.A.9: función de gasto y ecuación de Slutsky; 3.A.11: q = F(z⃗) y σ), con una rejilla fija para no perderlas.
- Problemas de optimización en varias líneas; κ y siglas en redonda; la pregunta de enganche y la idea final, iguales que en el documento.
- 3.A.9: 4.849 palabras, ×1,029; 3.A.11: 4.793 palabras, ×1,025; 0 avisos de pizarra. Esquema de dualidad del 3.A.9 con el PMU y el PMG en varias líneas.

Co-Authored-By: Claude Opus 5.5 <noreply@anthropic.com>
Claude-Session: https://claude.ai/code/session_01PWJgAjs4PN1Rvp3aLA4tqT
</commit_message>
<xml_diff>
--- a/oposicion/temario/tercer-ejercicio/3A09.docx
+++ b/oposicion/temario/tercer-ejercicio/3A09.docx
@@ -18594,7 +18594,7 @@
       <w:r>
         <w:drawing>
           <wp:inline>
-            <wp:extent cx="5969000" cy="3031653"/>
+            <wp:extent cx="5969000" cy="3051645"/>
             <wp:effectExtent b="0" l="0" r="0" t="0"/>
             <wp:docPr descr="" title="" id="74" name="Picture"/>
             <a:graphic>
@@ -18615,7 +18615,7 @@
                   <pic:spPr bwMode="auto">
                     <a:xfrm>
                       <a:off x="0" y="0"/>
-                      <a:ext cx="5969000" cy="3031653"/>
+                      <a:ext cx="5969000" cy="3051645"/>
                     </a:xfrm>
                     <a:prstGeom prst="rect">
                       <a:avLst/>

</xml_diff>

<commit_message>
Criterios del 17/10/2026 en 3A08, 3A09, 3A11 y 3A12
- CRITERIOS.md: fin de demostración con \findemo (∎), nexos entre bloques,
  letras de los bloques seguidas (G06), supuestos/desarrollo/implicaciones
  como bloques distinguidos, patrón fijo de negrita y cursiva, comprensión
  antes que concisión, lector que no ha estudiado los temas citados,
  demostraciones de anexo tan desarrolladas como en el tema antiguo y
  nunca «temas vecinos».
- tcee.sty y pandoc-macros.tex: orden \findemo.
- 3A08, 3A09, 3A11 y 3A12: aplicados esos criterios sin cambiar el
  contenido ni los minutos (detalle en cada revision.md).

Co-Authored-By: Claude Opus 5.5 <noreply@anthropic.com>
Claude-Session: https://claude.ai/code/session_01PWJgAjs4PN1Rvp3aLA4tqT
</commit_message>
<xml_diff>
--- a/oposicion/temario/tercer-ejercicio/3A09.docx
+++ b/oposicion/temario/tercer-ejercicio/3A09.docx
@@ -35,7 +35,7 @@
         <w:pStyle w:val="Date"/>
       </w:pPr>
       <w:r>
-        <w:t xml:space="preserve">Última actualización: 16/10/2026</w:t>
+        <w:t xml:space="preserve">Última actualización: 17/10/2026</w:t>
       </w:r>
     </w:p>
     <w:p>
@@ -2299,7 +2299,7 @@
         </w:numPr>
       </w:pPr>
       <w:r>
-        <w:t xml:space="preserve">Este bloque responde a la primera pregunta. Su conclusión anticipada: maximizar la utilidad con una renta dada y minimizar el gasto necesario para alcanzar una utilidad dada llevan a la</w:t>
+        <w:t xml:space="preserve">Una vez planteadas las preguntas, pasamos a construir las herramientas para responderlas. Este bloque responde a la primera. Su conclusión anticipada: maximizar la utilidad con una renta dada y minimizar el gasto necesario para alcanzar una utilidad dada llevan a la</w:t>
       </w:r>
       <w:r>
         <w:t xml:space="preserve"> </w:t>
@@ -4352,30 +4352,6 @@
         <w:t xml:space="preserve">Problemas primal y dual</w:t>
       </w:r>
     </w:p>
-    <w:bookmarkStart w:id="45" w:name="X7c6d98eafb5dd2ce68979be25b5ecb40da7c1bf"/>
-    <w:p>
-      <w:pPr>
-        <w:pStyle w:val="Heading3"/>
-      </w:pPr>
-      <w:r>
-        <w:t xml:space="preserve">I.2.1.</w:t>
-      </w:r>
-      <w:r>
-        <w:t xml:space="preserve"> </w:t>
-      </w:r>
-      <w:r>
-        <w:t xml:space="preserve">Problema primal: maximización de la utilidad</w:t>
-      </w:r>
-    </w:p>
-    <w:bookmarkStart w:id="28" w:name="a-idea"/>
-    <w:p>
-      <w:pPr>
-        <w:pStyle w:val="Heading4"/>
-      </w:pPr>
-      <w:r>
-        <w:t xml:space="preserve">a) Idea</w:t>
-      </w:r>
-    </w:p>
     <w:p>
       <w:pPr>
         <w:numPr>
@@ -4384,38 +4360,31 @@
         </w:numPr>
       </w:pPr>
       <w:r>
-        <w:t xml:space="preserve">El enfoque primal, como el dual, resuelve un problema económico: conjugar unas necesidades en principio ilimitadas con unos recursos escasos. Especificados ya sus componentes, necesidades (preferencias) y recursos (presupuesto), lo planteamos y resolvemos, porque es el punto de partida de la dualidad</w:t>
-      </w:r>
-      <w:r>
-        <w:t xml:space="preserve"> </w:t>
-      </w:r>
-      <w:r>
-        <w:rPr>
-          <w:rStyle w:val="Referenciaatema"/>
-        </w:rPr>
-        <w:t xml:space="preserve">[ver tema 3.A.8]</w:t>
-      </w:r>
-      <w:r>
-        <w:t xml:space="preserve">.</w:t>
+        <w:t xml:space="preserve">Descritos los ingredientes comunes, pasamos a plantear y resolver cada problema por separado: primero el primal y después el dual.</w:t>
       </w:r>
     </w:p>
-    <w:bookmarkEnd w:id="28"/>
-    <w:bookmarkStart w:id="43" w:name="b-modelo"/>
+    <w:bookmarkStart w:id="45" w:name="X7c6d98eafb5dd2ce68979be25b5ecb40da7c1bf"/>
+    <w:p>
+      <w:pPr>
+        <w:pStyle w:val="Heading3"/>
+      </w:pPr>
+      <w:r>
+        <w:t xml:space="preserve">I.2.1.</w:t>
+      </w:r>
+      <w:r>
+        <w:t xml:space="preserve"> </w:t>
+      </w:r>
+      <w:r>
+        <w:t xml:space="preserve">Problema primal: maximización de la utilidad</w:t>
+      </w:r>
+    </w:p>
+    <w:bookmarkStart w:id="28" w:name="a-idea"/>
     <w:p>
       <w:pPr>
         <w:pStyle w:val="Heading4"/>
       </w:pPr>
       <w:r>
-        <w:t xml:space="preserve">b) Modelo</w:t>
-      </w:r>
-    </w:p>
-    <w:bookmarkStart w:id="29" w:name="i-supuestos"/>
-    <w:p>
-      <w:pPr>
-        <w:pStyle w:val="Heading5"/>
-      </w:pPr>
-      <w:r>
-        <w:t xml:space="preserve">i) Supuestos</w:t>
+        <w:t xml:space="preserve">a) Idea</w:t>
       </w:r>
     </w:p>
     <w:p>
@@ -4426,6 +4395,48 @@
         </w:numPr>
       </w:pPr>
       <w:r>
+        <w:t xml:space="preserve">El enfoque primal, como el dual, resuelve un problema económico: conjugar unas necesidades en principio ilimitadas con unos recursos escasos. Especificados ya sus componentes, necesidades (preferencias) y recursos (presupuesto), lo planteamos y resolvemos, porque es el punto de partida de la dualidad</w:t>
+      </w:r>
+      <w:r>
+        <w:t xml:space="preserve"> </w:t>
+      </w:r>
+      <w:r>
+        <w:rPr>
+          <w:rStyle w:val="Referenciaatema"/>
+        </w:rPr>
+        <w:t xml:space="preserve">[ver tema 3.A.8]</w:t>
+      </w:r>
+      <w:r>
+        <w:t xml:space="preserve">.</w:t>
+      </w:r>
+    </w:p>
+    <w:bookmarkEnd w:id="28"/>
+    <w:bookmarkStart w:id="43" w:name="b-modelo"/>
+    <w:p>
+      <w:pPr>
+        <w:pStyle w:val="Heading4"/>
+      </w:pPr>
+      <w:r>
+        <w:t xml:space="preserve">b) Modelo</w:t>
+      </w:r>
+    </w:p>
+    <w:bookmarkStart w:id="29" w:name="i-supuestos"/>
+    <w:p>
+      <w:pPr>
+        <w:pStyle w:val="Heading5"/>
+      </w:pPr>
+      <w:r>
+        <w:t xml:space="preserve">i) Supuestos</w:t>
+      </w:r>
+    </w:p>
+    <w:p>
+      <w:pPr>
+        <w:numPr>
+          <w:ilvl w:val="0"/>
+          <w:numId w:val="1018"/>
+        </w:numPr>
+      </w:pPr>
+      <w:r>
         <w:t xml:space="preserve">Los de I.1: contexto estático, información perfecta, preferencias de buen comportamiento representables con una función de utilidad de buen comportamiento, bienes homogéneos y consumidor precio-aceptante.</w:t>
       </w:r>
     </w:p>
@@ -4443,7 +4454,7 @@
       <w:pPr>
         <w:numPr>
           <w:ilvl w:val="0"/>
-          <w:numId w:val="1018"/>
+          <w:numId w:val="1019"/>
         </w:numPr>
       </w:pPr>
       <w:r>
@@ -4653,7 +4664,7 @@
       <w:pPr>
         <w:numPr>
           <w:ilvl w:val="1"/>
-          <w:numId w:val="1019"/>
+          <w:numId w:val="1020"/>
         </w:numPr>
       </w:pPr>
       <w:r>
@@ -4769,7 +4780,7 @@
       <w:pPr>
         <w:numPr>
           <w:ilvl w:val="1"/>
-          <w:numId w:val="1019"/>
+          <w:numId w:val="1020"/>
         </w:numPr>
       </w:pPr>
       <w:r>
@@ -4942,7 +4953,7 @@
       <w:pPr>
         <w:numPr>
           <w:ilvl w:val="1"/>
-          <w:numId w:val="1019"/>
+          <w:numId w:val="1020"/>
         </w:numPr>
       </w:pPr>
       <w:r>
@@ -5205,7 +5216,7 @@
       <w:pPr>
         <w:numPr>
           <w:ilvl w:val="0"/>
-          <w:numId w:val="1018"/>
+          <w:numId w:val="1019"/>
         </w:numPr>
       </w:pPr>
       <w:r>
@@ -5519,7 +5530,7 @@
       <w:pPr>
         <w:numPr>
           <w:ilvl w:val="0"/>
-          <w:numId w:val="1020"/>
+          <w:numId w:val="1021"/>
         </w:numPr>
       </w:pPr>
       <w:r>
@@ -5854,7 +5865,7 @@
         <w:keepNext/>
         <w:numPr>
           <w:ilvl w:val="0"/>
-          <w:numId w:val="1020"/>
+          <w:numId w:val="1021"/>
         </w:numPr>
       </w:pPr>
       <w:r>
@@ -6004,7 +6015,7 @@
       <w:pPr>
         <w:numPr>
           <w:ilvl w:val="1"/>
-          <w:numId w:val="1021"/>
+          <w:numId w:val="1022"/>
         </w:numPr>
       </w:pPr>
       <w:r>
@@ -6022,7 +6033,7 @@
       <w:pPr>
         <w:numPr>
           <w:ilvl w:val="1"/>
-          <w:numId w:val="1021"/>
+          <w:numId w:val="1022"/>
         </w:numPr>
       </w:pPr>
       <w:r>
@@ -6105,7 +6116,7 @@
       <w:pPr>
         <w:numPr>
           <w:ilvl w:val="1"/>
-          <w:numId w:val="1021"/>
+          <w:numId w:val="1022"/>
         </w:numPr>
       </w:pPr>
       <w:r>
@@ -6324,7 +6335,7 @@
       <w:pPr>
         <w:numPr>
           <w:ilvl w:val="1"/>
-          <w:numId w:val="1021"/>
+          <w:numId w:val="1022"/>
         </w:numPr>
       </w:pPr>
       <w:r>
@@ -6455,7 +6466,7 @@
       <w:pPr>
         <w:numPr>
           <w:ilvl w:val="1"/>
-          <w:numId w:val="1021"/>
+          <w:numId w:val="1022"/>
         </w:numPr>
       </w:pPr>
       <w:r>
@@ -6598,7 +6609,7 @@
       <w:pPr>
         <w:numPr>
           <w:ilvl w:val="0"/>
-          <w:numId w:val="1020"/>
+          <w:numId w:val="1021"/>
         </w:numPr>
       </w:pPr>
       <w:r>
@@ -6973,7 +6984,7 @@
         <w:keepNext/>
         <w:numPr>
           <w:ilvl w:val="0"/>
-          <w:numId w:val="1020"/>
+          <w:numId w:val="1021"/>
         </w:numPr>
       </w:pPr>
       <w:r>
@@ -7071,7 +7082,7 @@
       <w:pPr>
         <w:numPr>
           <w:ilvl w:val="1"/>
-          <w:numId w:val="1022"/>
+          <w:numId w:val="1023"/>
         </w:numPr>
       </w:pPr>
       <w:r>
@@ -7089,7 +7100,7 @@
       <w:pPr>
         <w:numPr>
           <w:ilvl w:val="1"/>
-          <w:numId w:val="1022"/>
+          <w:numId w:val="1023"/>
         </w:numPr>
       </w:pPr>
       <w:r>
@@ -7160,7 +7171,7 @@
       <w:pPr>
         <w:numPr>
           <w:ilvl w:val="1"/>
-          <w:numId w:val="1022"/>
+          <w:numId w:val="1023"/>
         </w:numPr>
       </w:pPr>
       <w:r>
@@ -7231,7 +7242,7 @@
       <w:pPr>
         <w:numPr>
           <w:ilvl w:val="1"/>
-          <w:numId w:val="1022"/>
+          <w:numId w:val="1023"/>
         </w:numPr>
       </w:pPr>
       <w:r>
@@ -7270,7 +7281,7 @@
       <w:pPr>
         <w:numPr>
           <w:ilvl w:val="1"/>
-          <w:numId w:val="1022"/>
+          <w:numId w:val="1023"/>
         </w:numPr>
       </w:pPr>
       <w:r>
@@ -7313,7 +7324,7 @@
         <w:keepNext/>
         <w:numPr>
           <w:ilvl w:val="1"/>
-          <w:numId w:val="1022"/>
+          <w:numId w:val="1023"/>
         </w:numPr>
       </w:pPr>
       <w:r>
@@ -7513,7 +7524,7 @@
       <w:pPr>
         <w:numPr>
           <w:ilvl w:val="2"/>
-          <w:numId w:val="1023"/>
+          <w:numId w:val="1024"/>
         </w:numPr>
       </w:pPr>
       <w:r>
@@ -7889,7 +7900,7 @@
       <w:pPr>
         <w:numPr>
           <w:ilvl w:val="2"/>
-          <w:numId w:val="1023"/>
+          <w:numId w:val="1024"/>
         </w:numPr>
       </w:pPr>
       <w:r>
@@ -8085,12 +8096,20 @@
       <w:r>
         <w:t xml:space="preserve">.</w:t>
       </w:r>
+      <m:oMath>
+        <m:r>
+          <m:rPr>
+            <m:sty m:val="p"/>
+          </m:rPr>
+          <m:t>◼</m:t>
+        </m:r>
+      </m:oMath>
     </w:p>
     <w:p>
       <w:pPr>
         <w:numPr>
           <w:ilvl w:val="2"/>
-          <w:numId w:val="1023"/>
+          <w:numId w:val="1024"/>
         </w:numPr>
       </w:pPr>
       <w:r>
@@ -8111,7 +8130,7 @@
       <w:pPr>
         <w:numPr>
           <w:ilvl w:val="2"/>
-          <w:numId w:val="1023"/>
+          <w:numId w:val="1024"/>
         </w:numPr>
       </w:pPr>
       <w:r>
@@ -8122,7 +8141,7 @@
       <w:pPr>
         <w:numPr>
           <w:ilvl w:val="1"/>
-          <w:numId w:val="1022"/>
+          <w:numId w:val="1023"/>
         </w:numPr>
       </w:pPr>
       <w:r>
@@ -8607,20 +8626,20 @@
     </w:p>
     <w:bookmarkEnd w:id="42"/>
     <w:bookmarkEnd w:id="43"/>
-    <w:bookmarkStart w:id="44" w:name="e-valoración"/>
+    <w:bookmarkStart w:id="44" w:name="c-valoración"/>
     <w:p>
       <w:pPr>
         <w:pStyle w:val="Heading4"/>
       </w:pPr>
       <w:r>
-        <w:t xml:space="preserve">e) Valoración</w:t>
+        <w:t xml:space="preserve">c) Valoración</w:t>
       </w:r>
     </w:p>
     <w:p>
       <w:pPr>
         <w:numPr>
           <w:ilvl w:val="0"/>
-          <w:numId w:val="1024"/>
+          <w:numId w:val="1025"/>
         </w:numPr>
       </w:pPr>
       <w:r>
@@ -8671,7 +8690,7 @@
       <w:pPr>
         <w:numPr>
           <w:ilvl w:val="0"/>
-          <w:numId w:val="1025"/>
+          <w:numId w:val="1026"/>
         </w:numPr>
       </w:pPr>
       <w:r>
@@ -8701,7 +8720,7 @@
       <w:pPr>
         <w:numPr>
           <w:ilvl w:val="0"/>
-          <w:numId w:val="1026"/>
+          <w:numId w:val="1027"/>
         </w:numPr>
       </w:pPr>
       <w:r>
@@ -8722,7 +8741,7 @@
       <w:pPr>
         <w:numPr>
           <w:ilvl w:val="0"/>
-          <w:numId w:val="1027"/>
+          <w:numId w:val="1028"/>
         </w:numPr>
       </w:pPr>
       <w:r>
@@ -9049,7 +9068,7 @@
       <w:pPr>
         <w:numPr>
           <w:ilvl w:val="1"/>
-          <w:numId w:val="1028"/>
+          <w:numId w:val="1029"/>
         </w:numPr>
       </w:pPr>
       <w:r>
@@ -9135,7 +9154,7 @@
       <w:pPr>
         <w:numPr>
           <w:ilvl w:val="1"/>
-          <w:numId w:val="1028"/>
+          <w:numId w:val="1029"/>
         </w:numPr>
       </w:pPr>
       <w:r>
@@ -9319,7 +9338,7 @@
       <w:pPr>
         <w:numPr>
           <w:ilvl w:val="1"/>
-          <w:numId w:val="1028"/>
+          <w:numId w:val="1029"/>
         </w:numPr>
       </w:pPr>
       <w:r>
@@ -9467,7 +9486,7 @@
       <w:pPr>
         <w:numPr>
           <w:ilvl w:val="1"/>
-          <w:numId w:val="1028"/>
+          <w:numId w:val="1029"/>
         </w:numPr>
       </w:pPr>
       <w:r>
@@ -9731,7 +9750,7 @@
       <w:pPr>
         <w:numPr>
           <w:ilvl w:val="1"/>
-          <w:numId w:val="1028"/>
+          <w:numId w:val="1029"/>
         </w:numPr>
       </w:pPr>
       <w:r>
@@ -9985,7 +10004,7 @@
       <w:pPr>
         <w:numPr>
           <w:ilvl w:val="1"/>
-          <w:numId w:val="1028"/>
+          <w:numId w:val="1029"/>
         </w:numPr>
       </w:pPr>
       <w:r>
@@ -10158,7 +10177,7 @@
       <w:pPr>
         <w:numPr>
           <w:ilvl w:val="0"/>
-          <w:numId w:val="1027"/>
+          <w:numId w:val="1028"/>
         </w:numPr>
       </w:pPr>
       <w:r>
@@ -10467,7 +10486,7 @@
       <w:pPr>
         <w:numPr>
           <w:ilvl w:val="0"/>
-          <w:numId w:val="1029"/>
+          <w:numId w:val="1030"/>
         </w:numPr>
       </w:pPr>
       <w:r>
@@ -10865,7 +10884,7 @@
         <w:keepNext/>
         <w:numPr>
           <w:ilvl w:val="0"/>
-          <w:numId w:val="1029"/>
+          <w:numId w:val="1030"/>
         </w:numPr>
       </w:pPr>
       <w:r>
@@ -10963,7 +10982,7 @@
       <w:pPr>
         <w:numPr>
           <w:ilvl w:val="1"/>
-          <w:numId w:val="1030"/>
+          <w:numId w:val="1031"/>
         </w:numPr>
       </w:pPr>
       <w:r>
@@ -10981,7 +11000,7 @@
       <w:pPr>
         <w:numPr>
           <w:ilvl w:val="1"/>
-          <w:numId w:val="1030"/>
+          <w:numId w:val="1031"/>
         </w:numPr>
       </w:pPr>
       <w:r>
@@ -11052,7 +11071,7 @@
       <w:pPr>
         <w:numPr>
           <w:ilvl w:val="1"/>
-          <w:numId w:val="1030"/>
+          <w:numId w:val="1031"/>
         </w:numPr>
       </w:pPr>
       <w:r>
@@ -11259,7 +11278,7 @@
       <w:pPr>
         <w:numPr>
           <w:ilvl w:val="1"/>
-          <w:numId w:val="1030"/>
+          <w:numId w:val="1031"/>
         </w:numPr>
       </w:pPr>
       <w:r>
@@ -11360,7 +11379,7 @@
       <w:pPr>
         <w:numPr>
           <w:ilvl w:val="1"/>
-          <w:numId w:val="1030"/>
+          <w:numId w:val="1031"/>
         </w:numPr>
       </w:pPr>
       <w:r>
@@ -11694,7 +11713,7 @@
       <w:pPr>
         <w:numPr>
           <w:ilvl w:val="0"/>
-          <w:numId w:val="1029"/>
+          <w:numId w:val="1030"/>
         </w:numPr>
       </w:pPr>
       <w:r>
@@ -11751,7 +11770,7 @@
       <w:pPr>
         <w:numPr>
           <w:ilvl w:val="0"/>
-          <w:numId w:val="1029"/>
+          <w:numId w:val="1030"/>
         </w:numPr>
       </w:pPr>
       <w:r>
@@ -12217,7 +12236,7 @@
       <w:pPr>
         <w:numPr>
           <w:ilvl w:val="1"/>
-          <w:numId w:val="1031"/>
+          <w:numId w:val="1032"/>
         </w:numPr>
       </w:pPr>
       <w:r>
@@ -12298,7 +12317,7 @@
       <w:pPr>
         <w:numPr>
           <w:ilvl w:val="1"/>
-          <w:numId w:val="1031"/>
+          <w:numId w:val="1032"/>
         </w:numPr>
       </w:pPr>
       <w:r>
@@ -12484,7 +12503,7 @@
       <w:pPr>
         <w:numPr>
           <w:ilvl w:val="1"/>
-          <w:numId w:val="1031"/>
+          <w:numId w:val="1032"/>
         </w:numPr>
       </w:pPr>
       <w:r>
@@ -12527,7 +12546,7 @@
       <w:pPr>
         <w:numPr>
           <w:ilvl w:val="1"/>
-          <w:numId w:val="1031"/>
+          <w:numId w:val="1032"/>
         </w:numPr>
       </w:pPr>
       <w:r>
@@ -12573,7 +12592,7 @@
         <w:keepNext/>
         <w:numPr>
           <w:ilvl w:val="1"/>
-          <w:numId w:val="1031"/>
+          <w:numId w:val="1032"/>
         </w:numPr>
       </w:pPr>
       <w:r>
@@ -12616,7 +12635,7 @@
       <w:pPr>
         <w:numPr>
           <w:ilvl w:val="2"/>
-          <w:numId w:val="1032"/>
+          <w:numId w:val="1033"/>
         </w:numPr>
       </w:pPr>
       <w:r>
@@ -12827,7 +12846,7 @@
       <w:pPr>
         <w:numPr>
           <w:ilvl w:val="2"/>
-          <w:numId w:val="1032"/>
+          <w:numId w:val="1033"/>
         </w:numPr>
       </w:pPr>
       <w:r>
@@ -13157,7 +13176,7 @@
       <w:pPr>
         <w:numPr>
           <w:ilvl w:val="1"/>
-          <w:numId w:val="1031"/>
+          <w:numId w:val="1032"/>
         </w:numPr>
       </w:pPr>
       <w:r>
@@ -13529,7 +13548,7 @@
       <w:pPr>
         <w:numPr>
           <w:ilvl w:val="1"/>
-          <w:numId w:val="1031"/>
+          <w:numId w:val="1032"/>
         </w:numPr>
       </w:pPr>
       <w:r>
@@ -14150,7 +14169,7 @@
       <w:pPr>
         <w:numPr>
           <w:ilvl w:val="2"/>
-          <w:numId w:val="1033"/>
+          <w:numId w:val="1034"/>
         </w:numPr>
       </w:pPr>
       <w:r>
@@ -14259,7 +14278,7 @@
       <w:pPr>
         <w:numPr>
           <w:ilvl w:val="2"/>
-          <w:numId w:val="1033"/>
+          <w:numId w:val="1034"/>
         </w:numPr>
       </w:pPr>
       <w:r>
@@ -14413,7 +14432,7 @@
       <w:pPr>
         <w:numPr>
           <w:ilvl w:val="2"/>
-          <w:numId w:val="1033"/>
+          <w:numId w:val="1034"/>
         </w:numPr>
       </w:pPr>
       <w:r>
@@ -14633,7 +14652,7 @@
       <w:pPr>
         <w:numPr>
           <w:ilvl w:val="0"/>
-          <w:numId w:val="1034"/>
+          <w:numId w:val="1035"/>
         </w:numPr>
       </w:pPr>
       <w:r>
@@ -16195,20 +16214,20 @@
     </w:p>
     <w:bookmarkEnd w:id="61"/>
     <w:bookmarkEnd w:id="62"/>
-    <w:bookmarkStart w:id="63" w:name="e-valoración-1"/>
+    <w:bookmarkStart w:id="63" w:name="c-valoración-1"/>
     <w:p>
       <w:pPr>
         <w:pStyle w:val="Heading4"/>
       </w:pPr>
       <w:r>
-        <w:t xml:space="preserve">e) Valoración</w:t>
+        <w:t xml:space="preserve">c) Valoración</w:t>
       </w:r>
     </w:p>
     <w:p>
       <w:pPr>
         <w:numPr>
           <w:ilvl w:val="0"/>
-          <w:numId w:val="1035"/>
+          <w:numId w:val="1036"/>
         </w:numPr>
       </w:pPr>
       <w:r>
@@ -16237,11 +16256,11 @@
       <w:pPr>
         <w:numPr>
           <w:ilvl w:val="0"/>
-          <w:numId w:val="1036"/>
+          <w:numId w:val="1037"/>
         </w:numPr>
       </w:pPr>
       <w:r>
-        <w:t xml:space="preserve">Como los dos problemas tienen los mismos ingredientes, entre ellos se dan unas</w:t>
+        <w:t xml:space="preserve">Resueltos los dos problemas por separado, falta relacionarlos. Como tienen los mismos ingredientes, entre ellos se dan unas</w:t>
       </w:r>
       <w:r>
         <w:t xml:space="preserve"> </w:t>
@@ -16274,7 +16293,7 @@
         <w:keepNext/>
         <w:numPr>
           <w:ilvl w:val="0"/>
-          <w:numId w:val="1037"/>
+          <w:numId w:val="1038"/>
         </w:numPr>
       </w:pPr>
       <w:r>
@@ -16414,7 +16433,7 @@
       <w:pPr>
         <w:numPr>
           <w:ilvl w:val="1"/>
-          <w:numId w:val="1038"/>
+          <w:numId w:val="1039"/>
         </w:numPr>
       </w:pPr>
       <w:r>
@@ -16562,7 +16581,7 @@
       <w:pPr>
         <w:numPr>
           <w:ilvl w:val="1"/>
-          <w:numId w:val="1038"/>
+          <w:numId w:val="1039"/>
         </w:numPr>
       </w:pPr>
       <w:r>
@@ -16733,7 +16752,7 @@
       <w:pPr>
         <w:numPr>
           <w:ilvl w:val="0"/>
-          <w:numId w:val="1037"/>
+          <w:numId w:val="1038"/>
         </w:numPr>
       </w:pPr>
       <w:r>
@@ -17090,7 +17109,7 @@
       <w:pPr>
         <w:numPr>
           <w:ilvl w:val="0"/>
-          <w:numId w:val="1039"/>
+          <w:numId w:val="1040"/>
         </w:numPr>
       </w:pPr>
       <w:r>
@@ -17147,7 +17166,7 @@
       <w:pPr>
         <w:numPr>
           <w:ilvl w:val="0"/>
-          <w:numId w:val="1040"/>
+          <w:numId w:val="1041"/>
         </w:numPr>
       </w:pPr>
       <w:r>
@@ -17762,7 +17781,7 @@
       <w:pPr>
         <w:numPr>
           <w:ilvl w:val="1"/>
-          <w:numId w:val="1041"/>
+          <w:numId w:val="1042"/>
         </w:numPr>
       </w:pPr>
       <w:r>
@@ -17780,7 +17799,7 @@
       <w:pPr>
         <w:numPr>
           <w:ilvl w:val="1"/>
-          <w:numId w:val="1041"/>
+          <w:numId w:val="1042"/>
         </w:numPr>
       </w:pPr>
       <w:r>
@@ -17820,7 +17839,7 @@
       <w:pPr>
         <w:numPr>
           <w:ilvl w:val="0"/>
-          <w:numId w:val="1040"/>
+          <w:numId w:val="1041"/>
         </w:numPr>
       </w:pPr>
       <w:r>
@@ -18519,7 +18538,7 @@
       <w:pPr>
         <w:numPr>
           <w:ilvl w:val="0"/>
-          <w:numId w:val="1042"/>
+          <w:numId w:val="1043"/>
         </w:numPr>
       </w:pPr>
       <w:r>
@@ -18708,13 +18727,13 @@
       <w:pPr>
         <w:numPr>
           <w:ilvl w:val="0"/>
-          <w:numId w:val="1043"/>
+          <w:numId w:val="1044"/>
         </w:numPr>
       </w:pPr>
       <w:r>
         <w:rPr>
-          <w:b/>
-          <w:bCs/>
+          <w:i/>
+          <w:iCs/>
         </w:rPr>
         <w:t xml:space="preserve">Recapitulación</w:t>
       </w:r>
@@ -19062,11 +19081,11 @@
       <w:pPr>
         <w:numPr>
           <w:ilvl w:val="0"/>
-          <w:numId w:val="1044"/>
+          <w:numId w:val="1045"/>
         </w:numPr>
       </w:pPr>
       <w:r>
-        <w:t xml:space="preserve">Este bloque responde a la segunda pregunta. Su conclusión anticipada: la dualidad permite elegir una función de gasto o de utilidad indirecta flexible, derivar de ella demandas estimables y contrastar las restricciones de la teoría. El sistema casi ideal (AIDS) de</w:t>
+        <w:t xml:space="preserve">Una vez estudiadas las relaciones de dualidad, pasamos a ver cómo se llevan a los datos. Este bloque responde a la segunda pregunta. Su conclusión anticipada: la dualidad permite elegir una función de gasto o de utilidad indirecta flexible, derivar de ella demandas estimables y contrastar las restricciones de la teoría. El sistema casi ideal (AIDS) de</w:t>
       </w:r>
       <w:r>
         <w:t xml:space="preserve"> </w:t>
@@ -19119,7 +19138,7 @@
         <w:keepNext/>
         <w:numPr>
           <w:ilvl w:val="0"/>
-          <w:numId w:val="1045"/>
+          <w:numId w:val="1046"/>
         </w:numPr>
       </w:pPr>
       <w:r>
@@ -19220,7 +19239,7 @@
       <w:pPr>
         <w:numPr>
           <w:ilvl w:val="1"/>
-          <w:numId w:val="1046"/>
+          <w:numId w:val="1047"/>
         </w:numPr>
       </w:pPr>
       <w:r>
@@ -19283,7 +19302,7 @@
       <w:pPr>
         <w:numPr>
           <w:ilvl w:val="1"/>
-          <w:numId w:val="1046"/>
+          <w:numId w:val="1047"/>
         </w:numPr>
       </w:pPr>
       <w:r>
@@ -19301,7 +19320,7 @@
       <w:pPr>
         <w:numPr>
           <w:ilvl w:val="1"/>
-          <w:numId w:val="1046"/>
+          <w:numId w:val="1047"/>
         </w:numPr>
       </w:pPr>
       <w:r>
@@ -19319,7 +19338,7 @@
       <w:pPr>
         <w:numPr>
           <w:ilvl w:val="0"/>
-          <w:numId w:val="1045"/>
+          <w:numId w:val="1046"/>
         </w:numPr>
       </w:pPr>
       <w:r>
@@ -19390,7 +19409,7 @@
         <w:keepNext/>
         <w:numPr>
           <w:ilvl w:val="0"/>
-          <w:numId w:val="1045"/>
+          <w:numId w:val="1046"/>
         </w:numPr>
       </w:pPr>
       <w:r>
@@ -19472,7 +19491,7 @@
       <w:pPr>
         <w:numPr>
           <w:ilvl w:val="1"/>
-          <w:numId w:val="1047"/>
+          <w:numId w:val="1048"/>
         </w:numPr>
       </w:pPr>
       <w:r>
@@ -19490,7 +19509,7 @@
       <w:pPr>
         <w:numPr>
           <w:ilvl w:val="1"/>
-          <w:numId w:val="1047"/>
+          <w:numId w:val="1048"/>
         </w:numPr>
       </w:pPr>
       <w:r>
@@ -19508,7 +19527,7 @@
       <w:pPr>
         <w:numPr>
           <w:ilvl w:val="1"/>
-          <w:numId w:val="1047"/>
+          <w:numId w:val="1048"/>
         </w:numPr>
       </w:pPr>
       <w:r>
@@ -19538,7 +19557,7 @@
       <w:pPr>
         <w:numPr>
           <w:ilvl w:val="1"/>
-          <w:numId w:val="1047"/>
+          <w:numId w:val="1048"/>
         </w:numPr>
       </w:pPr>
       <w:r>
@@ -19566,32 +19585,6 @@
       </w:r>
       <w:r>
         <w:t xml:space="preserve">Pasos que sigue la literatura</w:t>
-      </w:r>
-    </w:p>
-    <w:p>
-      <w:pPr>
-        <w:numPr>
-          <w:ilvl w:val="0"/>
-          <w:numId w:val="1048"/>
-        </w:numPr>
-      </w:pPr>
-      <w:r>
-        <w:t xml:space="preserve">La estimación sigue cinco pasos, que reproducen el camino de la teoría, de las preferencias a la demanda ordinaria: (1) elegir una forma funcional, (2) especificar un sistema completo, (3) reunir los datos, (4) especificar el modelo econométrico y (5) estimar y contrastar.</w:t>
-      </w:r>
-    </w:p>
-    <w:bookmarkStart w:id="108" w:name="Xe667511b6d0ed2d2bd4c17ec39391f3b2daeab7"/>
-    <w:p>
-      <w:pPr>
-        <w:pStyle w:val="Heading3"/>
-      </w:pPr>
-      <w:r>
-        <w:t xml:space="preserve">II.2.1.</w:t>
-      </w:r>
-      <w:r>
-        <w:t xml:space="preserve"> </w:t>
-      </w:r>
-      <w:r>
-        <w:t xml:space="preserve">Elección de una función de referencia apropiada</w:t>
       </w:r>
     </w:p>
     <w:p>
@@ -19602,80 +19595,106 @@
         </w:numPr>
       </w:pPr>
       <w:r>
-        <w:t xml:space="preserve">Gracias a la dualidad, la forma funcional puede ponerse en la utilidad directa, en la FIU (y obtener las demandas por</w:t>
-      </w:r>
-      <w:r>
-        <w:t xml:space="preserve"> </w:t>
-      </w:r>
-      <w:r>
-        <w:rPr>
-          <w:smallCaps/>
-        </w:rPr>
-        <w:t xml:space="preserve">Roy</w:t>
-      </w:r>
-      <w:r>
-        <w:t xml:space="preserve">) o en la función de gasto (y obtenerlas por</w:t>
-      </w:r>
-      <w:r>
-        <w:t xml:space="preserve"> </w:t>
-      </w:r>
-      <w:r>
-        <w:rPr>
-          <w:smallCaps/>
-        </w:rPr>
-        <w:t xml:space="preserve">Shephard</w:t>
-      </w:r>
-      <w:r>
-        <w:t xml:space="preserve">). Así el sistema es coherente con la maximización</w:t>
-      </w:r>
-      <w:r>
-        <w:t xml:space="preserve"> </w:t>
-      </w:r>
-      <w:r>
-        <w:rPr>
-          <w:i/>
-          <w:iCs/>
-        </w:rPr>
-        <w:t xml:space="preserve">por construcción</w:t>
-      </w:r>
-      <w:r>
-        <w:t xml:space="preserve">. La elección es un compromiso entre</w:t>
-      </w:r>
-      <w:r>
-        <w:t xml:space="preserve"> </w:t>
-      </w:r>
-      <w:r>
-        <w:rPr>
-          <w:i/>
-          <w:iCs/>
-        </w:rPr>
-        <w:t xml:space="preserve">sencillez</w:t>
-      </w:r>
-      <w:r>
-        <w:t xml:space="preserve"> </w:t>
-      </w:r>
-      <w:r>
-        <w:t xml:space="preserve">y</w:t>
-      </w:r>
-      <w:r>
-        <w:t xml:space="preserve"> </w:t>
-      </w:r>
-      <w:r>
-        <w:rPr>
-          <w:i/>
-          <w:iCs/>
-        </w:rPr>
-        <w:t xml:space="preserve">flexibilidad</w:t>
-      </w:r>
-      <w:r>
-        <w:t xml:space="preserve">: las formas más fáciles de manejar son las más rígidas, porque predeterminan los resultados. Cada sistema nace para superar el límite del anterior (tabla 3).</w:t>
+        <w:t xml:space="preserve">Visto para qué se estiman los sistemas de demanda, pasamos a cómo se estiman. La estimación sigue cinco pasos, que reproducen el camino de la teoría, de las preferencias a la demanda ordinaria: (1) elegir una forma funcional, (2) especificar un sistema completo, (3) reunir los datos, (4) especificar el modelo econométrico y (5) estimar y contrastar.</w:t>
+      </w:r>
+    </w:p>
+    <w:bookmarkStart w:id="108" w:name="Xe667511b6d0ed2d2bd4c17ec39391f3b2daeab7"/>
+    <w:p>
+      <w:pPr>
+        <w:pStyle w:val="Heading3"/>
+      </w:pPr>
+      <w:r>
+        <w:t xml:space="preserve">II.2.1.</w:t>
+      </w:r>
+      <w:r>
+        <w:t xml:space="preserve"> </w:t>
+      </w:r>
+      <w:r>
+        <w:t xml:space="preserve">Elección de una función de referencia apropiada</w:t>
       </w:r>
     </w:p>
     <w:p>
       <w:pPr>
         <w:numPr>
           <w:ilvl w:val="0"/>
-          <w:numId w:val="1049"/>
+          <w:numId w:val="1050"/>
+        </w:numPr>
+      </w:pPr>
+      <w:r>
+        <w:t xml:space="preserve">Gracias a la dualidad, la forma funcional puede ponerse en la utilidad directa, en la FIU (y obtener las demandas por</w:t>
+      </w:r>
+      <w:r>
+        <w:t xml:space="preserve"> </w:t>
+      </w:r>
+      <w:r>
+        <w:rPr>
+          <w:smallCaps/>
+        </w:rPr>
+        <w:t xml:space="preserve">Roy</w:t>
+      </w:r>
+      <w:r>
+        <w:t xml:space="preserve">) o en la función de gasto (y obtenerlas por</w:t>
+      </w:r>
+      <w:r>
+        <w:t xml:space="preserve"> </w:t>
+      </w:r>
+      <w:r>
+        <w:rPr>
+          <w:smallCaps/>
+        </w:rPr>
+        <w:t xml:space="preserve">Shephard</w:t>
+      </w:r>
+      <w:r>
+        <w:t xml:space="preserve">). Así el sistema es coherente con la maximización</w:t>
+      </w:r>
+      <w:r>
+        <w:t xml:space="preserve"> </w:t>
+      </w:r>
+      <w:r>
+        <w:rPr>
+          <w:i/>
+          <w:iCs/>
+        </w:rPr>
+        <w:t xml:space="preserve">por construcción</w:t>
+      </w:r>
+      <w:r>
+        <w:t xml:space="preserve">. La elección es un compromiso entre</w:t>
+      </w:r>
+      <w:r>
+        <w:t xml:space="preserve"> </w:t>
+      </w:r>
+      <w:r>
+        <w:rPr>
+          <w:i/>
+          <w:iCs/>
+        </w:rPr>
+        <w:t xml:space="preserve">sencillez</w:t>
+      </w:r>
+      <w:r>
+        <w:t xml:space="preserve"> </w:t>
+      </w:r>
+      <w:r>
+        <w:t xml:space="preserve">y</w:t>
+      </w:r>
+      <w:r>
+        <w:t xml:space="preserve"> </w:t>
+      </w:r>
+      <w:r>
+        <w:rPr>
+          <w:i/>
+          <w:iCs/>
+        </w:rPr>
+        <w:t xml:space="preserve">flexibilidad</w:t>
+      </w:r>
+      <w:r>
+        <w:t xml:space="preserve">: las formas más fáciles de manejar son las más rígidas, porque predeterminan los resultados. Cada sistema nace para superar el límite del anterior (tabla 3).</w:t>
+      </w:r>
+    </w:p>
+    <w:p>
+      <w:pPr>
+        <w:numPr>
+          <w:ilvl w:val="0"/>
+          <w:numId w:val="1050"/>
         </w:numPr>
       </w:pPr>
       <w:r>
@@ -20177,7 +20196,7 @@
       <w:pPr>
         <w:numPr>
           <w:ilvl w:val="0"/>
-          <w:numId w:val="1050"/>
+          <w:numId w:val="1051"/>
         </w:numPr>
       </w:pPr>
       <w:r>
@@ -20211,22 +20230,26 @@
     </w:p>
     <w:p>
       <w:pPr>
+        <w:pStyle w:val="FirstParagraph"/>
+        <w:keepNext/>
+      </w:pPr>
+      <w:r>
+        <w:rPr>
+          <w:i/>
+          <w:iCs/>
+        </w:rPr>
+        <w:t xml:space="preserve">i) Supuestos</w:t>
+      </w:r>
+    </w:p>
+    <w:p>
+      <w:pPr>
         <w:numPr>
           <w:ilvl w:val="0"/>
-          <w:numId w:val="1051"/>
+          <w:numId w:val="1052"/>
         </w:numPr>
       </w:pPr>
       <w:r>
-        <w:rPr>
-          <w:b/>
-          <w:bCs/>
-          <w:i/>
-          <w:iCs/>
-        </w:rPr>
-        <w:t xml:space="preserve">i) Supuestos</w:t>
-      </w:r>
-      <w:r>
-        <w:t xml:space="preserve">: utilidad de</w:t>
+        <w:t xml:space="preserve">Utilidad de</w:t>
       </w:r>
       <w:r>
         <w:t xml:space="preserve"> </w:t>
@@ -20595,22 +20618,26 @@
     </w:p>
     <w:p>
       <w:pPr>
+        <w:pStyle w:val="FirstParagraph"/>
+        <w:keepNext/>
+      </w:pPr>
+      <w:r>
+        <w:rPr>
+          <w:i/>
+          <w:iCs/>
+        </w:rPr>
+        <w:t xml:space="preserve">ii) Desarrollo</w:t>
+      </w:r>
+    </w:p>
+    <w:p>
+      <w:pPr>
         <w:numPr>
           <w:ilvl w:val="0"/>
-          <w:numId w:val="1051"/>
+          <w:numId w:val="1053"/>
         </w:numPr>
       </w:pPr>
       <w:r>
-        <w:rPr>
-          <w:b/>
-          <w:bCs/>
-          <w:i/>
-          <w:iCs/>
-        </w:rPr>
-        <w:t xml:space="preserve">ii) Desarrollo</w:t>
-      </w:r>
-      <w:r>
-        <w:t xml:space="preserve">: maximizando, el gasto en cada bien es</w:t>
+        <w:t xml:space="preserve">Maximizando, el gasto en cada bien es</w:t>
       </w:r>
     </w:p>
     <w:p>
@@ -20873,54 +20900,58 @@
     </w:p>
     <w:p>
       <w:pPr>
-        <w:numPr>
-          <w:ilvl w:val="0"/>
-          <w:numId w:val="1051"/>
-        </w:numPr>
+        <w:pStyle w:val="FirstParagraph"/>
+        <w:keepNext/>
       </w:pPr>
       <w:r>
         <w:rPr>
-          <w:b/>
-          <w:bCs/>
           <w:i/>
           <w:iCs/>
         </w:rPr>
         <w:t xml:space="preserve">iii) Implicaciones</w:t>
-      </w:r>
-      <w:r>
-        <w:t xml:space="preserve">: el gasto en cada bien es lineal en los precios y en la renta, y las curvas de</w:t>
-      </w:r>
-      <w:r>
-        <w:t xml:space="preserve"> </w:t>
-      </w:r>
-      <w:r>
-        <w:rPr>
-          <w:smallCaps/>
-        </w:rPr>
-        <w:t xml:space="preserve">Engel</w:t>
-      </w:r>
-      <w:r>
-        <w:t xml:space="preserve"> </w:t>
-      </w:r>
-      <w:r>
-        <w:t xml:space="preserve">son rectas que no pasan por el origen, de modo que distingue bienes necesarios y de lujo.</w:t>
-      </w:r>
-    </w:p>
-    <w:bookmarkEnd w:id="83"/>
-    <w:bookmarkStart w:id="84" w:name="d-evidencia-empírica"/>
-    <w:p>
-      <w:pPr>
-        <w:pStyle w:val="Heading5"/>
-      </w:pPr>
-      <w:r>
-        <w:t xml:space="preserve">d) Evidencia empírica</w:t>
       </w:r>
     </w:p>
     <w:p>
       <w:pPr>
         <w:numPr>
           <w:ilvl w:val="0"/>
-          <w:numId w:val="1052"/>
+          <w:numId w:val="1054"/>
+        </w:numPr>
+      </w:pPr>
+      <w:r>
+        <w:t xml:space="preserve">El gasto en cada bien es lineal en los precios y en la renta, y las curvas de</w:t>
+      </w:r>
+      <w:r>
+        <w:t xml:space="preserve"> </w:t>
+      </w:r>
+      <w:r>
+        <w:rPr>
+          <w:smallCaps/>
+        </w:rPr>
+        <w:t xml:space="preserve">Engel</w:t>
+      </w:r>
+      <w:r>
+        <w:t xml:space="preserve"> </w:t>
+      </w:r>
+      <w:r>
+        <w:t xml:space="preserve">son rectas que no pasan por el origen, de modo que distingue bienes necesarios y de lujo.</w:t>
+      </w:r>
+    </w:p>
+    <w:bookmarkEnd w:id="83"/>
+    <w:bookmarkStart w:id="84" w:name="c-evidencia-empírica"/>
+    <w:p>
+      <w:pPr>
+        <w:pStyle w:val="Heading5"/>
+      </w:pPr>
+      <w:r>
+        <w:t xml:space="preserve">c) Evidencia empírica</w:t>
+      </w:r>
+    </w:p>
+    <w:p>
+      <w:pPr>
+        <w:numPr>
+          <w:ilvl w:val="0"/>
+          <w:numId w:val="1055"/>
         </w:numPr>
       </w:pPr>
       <w:r>
@@ -20986,20 +21017,20 @@
       </w:r>
     </w:p>
     <w:bookmarkEnd w:id="84"/>
-    <w:bookmarkStart w:id="85" w:name="e-valoración-2"/>
+    <w:bookmarkStart w:id="85" w:name="d-valoración"/>
     <w:p>
       <w:pPr>
         <w:pStyle w:val="Heading5"/>
       </w:pPr>
       <w:r>
-        <w:t xml:space="preserve">e) Valoración</w:t>
+        <w:t xml:space="preserve">d) Valoración</w:t>
       </w:r>
     </w:p>
     <w:p>
       <w:pPr>
         <w:numPr>
           <w:ilvl w:val="0"/>
-          <w:numId w:val="1053"/>
+          <w:numId w:val="1056"/>
         </w:numPr>
       </w:pPr>
       <w:r>
@@ -21072,7 +21103,7 @@
       <w:pPr>
         <w:numPr>
           <w:ilvl w:val="0"/>
-          <w:numId w:val="1054"/>
+          <w:numId w:val="1057"/>
         </w:numPr>
       </w:pPr>
       <w:r>
@@ -21163,57 +21194,53 @@
     </w:p>
     <w:p>
       <w:pPr>
-        <w:numPr>
-          <w:ilvl w:val="0"/>
-          <w:numId w:val="1055"/>
-        </w:numPr>
+        <w:pStyle w:val="FirstParagraph"/>
+        <w:keepNext/>
       </w:pPr>
       <w:r>
         <w:rPr>
-          <w:b/>
-          <w:bCs/>
           <w:i/>
           <w:iCs/>
         </w:rPr>
         <w:t xml:space="preserve">i) Supuestos</w:t>
-      </w:r>
-      <w:r>
-        <w:t xml:space="preserve">: la ecuación de</w:t>
-      </w:r>
-      <w:r>
-        <w:t xml:space="preserve"> </w:t>
-      </w:r>
-      <w:r>
-        <w:rPr>
-          <w:smallCaps/>
-        </w:rPr>
-        <w:t xml:space="preserve">Slutsky</w:t>
-      </w:r>
-      <w:r>
-        <w:t xml:space="preserve"> </w:t>
-      </w:r>
-      <w:r>
-        <w:t xml:space="preserve">en diferencias logarítmicas, con coeficientes constantes.</w:t>
       </w:r>
     </w:p>
     <w:p>
       <w:pPr>
         <w:numPr>
           <w:ilvl w:val="0"/>
-          <w:numId w:val="1055"/>
+          <w:numId w:val="1058"/>
         </w:numPr>
       </w:pPr>
       <w:r>
-        <w:rPr>
-          <w:b/>
-          <w:bCs/>
+        <w:t xml:space="preserve">La ecuación de</w:t>
+      </w:r>
+      <w:r>
+        <w:t xml:space="preserve"> </w:t>
+      </w:r>
+      <w:r>
+        <w:rPr>
+          <w:smallCaps/>
+        </w:rPr>
+        <w:t xml:space="preserve">Slutsky</w:t>
+      </w:r>
+      <w:r>
+        <w:t xml:space="preserve"> </w:t>
+      </w:r>
+      <w:r>
+        <w:t xml:space="preserve">en diferencias logarítmicas, con coeficientes constantes.</w:t>
+      </w:r>
+    </w:p>
+    <w:p>
+      <w:pPr>
+        <w:pStyle w:val="FirstParagraph"/>
+      </w:pPr>
+      <w:r>
+        <w:rPr>
           <w:i/>
           <w:iCs/>
         </w:rPr>
         <w:t xml:space="preserve">ii) Desarrollo</w:t>
-      </w:r>
-      <w:r>
-        <w:t xml:space="preserve">:</w:t>
       </w:r>
     </w:p>
     <w:p>
@@ -21745,22 +21772,26 @@
     </w:p>
     <w:p>
       <w:pPr>
+        <w:pStyle w:val="FirstParagraph"/>
+        <w:keepNext/>
+      </w:pPr>
+      <w:r>
+        <w:rPr>
+          <w:i/>
+          <w:iCs/>
+        </w:rPr>
+        <w:t xml:space="preserve">iii) Implicaciones</w:t>
+      </w:r>
+    </w:p>
+    <w:p>
+      <w:pPr>
         <w:numPr>
           <w:ilvl w:val="0"/>
-          <w:numId w:val="1055"/>
+          <w:numId w:val="1060"/>
         </w:numPr>
       </w:pPr>
       <w:r>
-        <w:rPr>
-          <w:b/>
-          <w:bCs/>
-          <w:i/>
-          <w:iCs/>
-        </w:rPr>
-        <w:t xml:space="preserve">iii) Implicaciones</w:t>
-      </w:r>
-      <w:r>
-        <w:t xml:space="preserve">: la teoría se traduce en restricciones lineales sobre los parámetros, que se imponen o contrastan directamente:</w:t>
+        <w:t xml:space="preserve">La teoría se traduce en restricciones lineales sobre los parámetros, que se imponen o contrastan directamente:</w:t>
       </w:r>
       <w:r>
         <w:t xml:space="preserve"> </w:t>
@@ -22009,20 +22040,20 @@
       </w:r>
     </w:p>
     <w:bookmarkEnd w:id="88"/>
-    <w:bookmarkStart w:id="89" w:name="d-evidencia-empírica-1"/>
+    <w:bookmarkStart w:id="89" w:name="c-evidencia-empírica-1"/>
     <w:p>
       <w:pPr>
         <w:pStyle w:val="Heading5"/>
       </w:pPr>
       <w:r>
-        <w:t xml:space="preserve">d) Evidencia empírica</w:t>
+        <w:t xml:space="preserve">c) Evidencia empírica</w:t>
       </w:r>
     </w:p>
     <w:p>
       <w:pPr>
         <w:numPr>
           <w:ilvl w:val="0"/>
-          <w:numId w:val="1056"/>
+          <w:numId w:val="1061"/>
         </w:numPr>
       </w:pPr>
       <w:r>
@@ -22067,20 +22098,20 @@
       </w:r>
     </w:p>
     <w:bookmarkEnd w:id="89"/>
-    <w:bookmarkStart w:id="90" w:name="e-valoración-3"/>
+    <w:bookmarkStart w:id="90" w:name="d-valoración-1"/>
     <w:p>
       <w:pPr>
         <w:pStyle w:val="Heading5"/>
       </w:pPr>
       <w:r>
-        <w:t xml:space="preserve">e) Valoración</w:t>
+        <w:t xml:space="preserve">d) Valoración</w:t>
       </w:r>
     </w:p>
     <w:p>
       <w:pPr>
         <w:numPr>
           <w:ilvl w:val="0"/>
-          <w:numId w:val="1057"/>
+          <w:numId w:val="1062"/>
         </w:numPr>
       </w:pPr>
       <w:r>
@@ -22160,7 +22191,7 @@
       <w:pPr>
         <w:numPr>
           <w:ilvl w:val="0"/>
-          <w:numId w:val="1058"/>
+          <w:numId w:val="1063"/>
         </w:numPr>
       </w:pPr>
       <w:r>
@@ -22282,22 +22313,26 @@
     </w:p>
     <w:p>
       <w:pPr>
+        <w:pStyle w:val="FirstParagraph"/>
+        <w:keepNext/>
+      </w:pPr>
+      <w:r>
+        <w:rPr>
+          <w:i/>
+          <w:iCs/>
+        </w:rPr>
+        <w:t xml:space="preserve">i) Supuestos</w:t>
+      </w:r>
+    </w:p>
+    <w:p>
+      <w:pPr>
         <w:numPr>
           <w:ilvl w:val="0"/>
-          <w:numId w:val="1059"/>
+          <w:numId w:val="1064"/>
         </w:numPr>
       </w:pPr>
       <w:r>
-        <w:rPr>
-          <w:b/>
-          <w:bCs/>
-          <w:i/>
-          <w:iCs/>
-        </w:rPr>
-        <w:t xml:space="preserve">i) Supuestos</w:t>
-      </w:r>
-      <w:r>
-        <w:t xml:space="preserve">: se especifica la FIU (versión</w:t>
+        <w:t xml:space="preserve">Se especifica la FIU (versión</w:t>
       </w:r>
       <w:r>
         <w:t xml:space="preserve"> </w:t>
@@ -22316,7 +22351,6 @@
     <w:p>
       <w:pPr>
         <w:pStyle w:val="BodyText"/>
-        <w:keepNext/>
       </w:pPr>
       <m:oMathPara>
         <m:oMathParaPr>
@@ -22667,22 +22701,26 @@
     </w:p>
     <w:p>
       <w:pPr>
+        <w:pStyle w:val="FirstParagraph"/>
+        <w:keepNext/>
+      </w:pPr>
+      <w:r>
+        <w:rPr>
+          <w:i/>
+          <w:iCs/>
+        </w:rPr>
+        <w:t xml:space="preserve">ii) Desarrollo</w:t>
+      </w:r>
+    </w:p>
+    <w:p>
+      <w:pPr>
         <w:numPr>
           <w:ilvl w:val="0"/>
-          <w:numId w:val="1059"/>
+          <w:numId w:val="1065"/>
         </w:numPr>
       </w:pPr>
       <w:r>
-        <w:rPr>
-          <w:b/>
-          <w:bCs/>
-          <w:i/>
-          <w:iCs/>
-        </w:rPr>
-        <w:t xml:space="preserve">ii) Desarrollo</w:t>
-      </w:r>
-      <w:r>
-        <w:t xml:space="preserve">: la identidad de</w:t>
+        <w:t xml:space="preserve">La identidad de</w:t>
       </w:r>
       <w:r>
         <w:t xml:space="preserve"> </w:t>
@@ -22832,7 +22870,6 @@
     <w:p>
       <w:pPr>
         <w:pStyle w:val="BodyText"/>
-        <w:keepNext/>
       </w:pPr>
       <m:oMathPara>
         <m:oMathParaPr>
@@ -23111,83 +23148,87 @@
     </w:p>
     <w:p>
       <w:pPr>
-        <w:numPr>
-          <w:ilvl w:val="0"/>
-          <w:numId w:val="1059"/>
-        </w:numPr>
+        <w:pStyle w:val="FirstParagraph"/>
+        <w:keepNext/>
       </w:pPr>
       <w:r>
         <w:rPr>
-          <w:b/>
-          <w:bCs/>
           <w:i/>
           <w:iCs/>
         </w:rPr>
         <w:t xml:space="preserve">iii) Implicaciones</w:t>
-      </w:r>
-      <w:r>
-        <w:t xml:space="preserve">: es muy flexible y condiciona poco los resultados; la simetría se impone con</w:t>
-      </w:r>
-      <w:r>
-        <w:t xml:space="preserve"> </w:t>
-      </w:r>
-      <m:oMath>
-        <m:sSub>
-          <m:e>
-            <m:r>
-              <m:t>β</m:t>
-            </m:r>
-          </m:e>
-          <m:sub>
-            <m:r>
-              <m:t>i</m:t>
-            </m:r>
-            <m:r>
-              <m:t>j</m:t>
-            </m:r>
-          </m:sub>
-        </m:sSub>
-        <m:r>
-          <m:rPr>
-            <m:sty m:val="p"/>
-          </m:rPr>
-          <m:t>=</m:t>
-        </m:r>
-        <m:sSub>
-          <m:e>
-            <m:r>
-              <m:t>β</m:t>
-            </m:r>
-          </m:e>
-          <m:sub>
-            <m:r>
-              <m:t>j</m:t>
-            </m:r>
-            <m:r>
-              <m:t>i</m:t>
-            </m:r>
-          </m:sub>
-        </m:sSub>
-      </m:oMath>
-      <w:r>
-        <w:t xml:space="preserve">.</w:t>
-      </w:r>
-    </w:p>
-    <w:bookmarkEnd w:id="93"/>
-    <w:bookmarkStart w:id="94" w:name="d-evidencia-empírica-2"/>
-    <w:p>
-      <w:pPr>
-        <w:pStyle w:val="Heading5"/>
-      </w:pPr>
-      <w:r>
-        <w:t xml:space="preserve">d) Evidencia empírica</w:t>
       </w:r>
     </w:p>
     <w:p>
       <w:pPr>
         <w:numPr>
           <w:ilvl w:val="0"/>
-          <w:numId w:val="1060"/>
+          <w:numId w:val="1066"/>
+        </w:numPr>
+      </w:pPr>
+      <w:r>
+        <w:t xml:space="preserve">Es muy flexible y condiciona poco los resultados; la simetría se impone con</w:t>
+      </w:r>
+      <w:r>
+        <w:t xml:space="preserve"> </w:t>
+      </w:r>
+      <m:oMath>
+        <m:sSub>
+          <m:e>
+            <m:r>
+              <m:t>β</m:t>
+            </m:r>
+          </m:e>
+          <m:sub>
+            <m:r>
+              <m:t>i</m:t>
+            </m:r>
+            <m:r>
+              <m:t>j</m:t>
+            </m:r>
+          </m:sub>
+        </m:sSub>
+        <m:r>
+          <m:rPr>
+            <m:sty m:val="p"/>
+          </m:rPr>
+          <m:t>=</m:t>
+        </m:r>
+        <m:sSub>
+          <m:e>
+            <m:r>
+              <m:t>β</m:t>
+            </m:r>
+          </m:e>
+          <m:sub>
+            <m:r>
+              <m:t>j</m:t>
+            </m:r>
+            <m:r>
+              <m:t>i</m:t>
+            </m:r>
+          </m:sub>
+        </m:sSub>
+      </m:oMath>
+      <w:r>
+        <w:t xml:space="preserve">.</w:t>
+      </w:r>
+    </w:p>
+    <w:bookmarkEnd w:id="93"/>
+    <w:bookmarkStart w:id="94" w:name="c-evidencia-empírica-2"/>
+    <w:p>
+      <w:pPr>
+        <w:pStyle w:val="Heading5"/>
+      </w:pPr>
+      <w:r>
+        <w:t xml:space="preserve">c) Evidencia empírica</w:t>
+      </w:r>
+    </w:p>
+    <w:p>
+      <w:pPr>
+        <w:numPr>
+          <w:ilvl w:val="0"/>
+          <w:numId w:val="1067"/>
         </w:numPr>
       </w:pPr>
       <w:r>
@@ -23245,20 +23286,20 @@
       </w:r>
     </w:p>
     <w:bookmarkEnd w:id="94"/>
-    <w:bookmarkStart w:id="95" w:name="e-valoración-4"/>
+    <w:bookmarkStart w:id="95" w:name="d-valoración-2"/>
     <w:p>
       <w:pPr>
         <w:pStyle w:val="Heading5"/>
       </w:pPr>
       <w:r>
-        <w:t xml:space="preserve">e) Valoración</w:t>
+        <w:t xml:space="preserve">d) Valoración</w:t>
       </w:r>
     </w:p>
     <w:p>
       <w:pPr>
         <w:numPr>
           <w:ilvl w:val="0"/>
-          <w:numId w:val="1061"/>
+          <w:numId w:val="1068"/>
         </w:numPr>
       </w:pPr>
       <w:r>
@@ -23344,7 +23385,7 @@
       <w:pPr>
         <w:numPr>
           <w:ilvl w:val="0"/>
-          <w:numId w:val="1062"/>
+          <w:numId w:val="1069"/>
         </w:numPr>
       </w:pPr>
       <w:r>
@@ -23423,22 +23464,26 @@
     </w:p>
     <w:p>
       <w:pPr>
+        <w:pStyle w:val="FirstParagraph"/>
+        <w:keepNext/>
+      </w:pPr>
+      <w:r>
+        <w:rPr>
+          <w:i/>
+          <w:iCs/>
+        </w:rPr>
+        <w:t xml:space="preserve">i) Supuestos</w:t>
+      </w:r>
+    </w:p>
+    <w:p>
+      <w:pPr>
         <w:numPr>
           <w:ilvl w:val="0"/>
-          <w:numId w:val="1063"/>
+          <w:numId w:val="1070"/>
         </w:numPr>
       </w:pPr>
       <w:r>
-        <w:rPr>
-          <w:b/>
-          <w:bCs/>
-          <w:i/>
-          <w:iCs/>
-        </w:rPr>
-        <w:t xml:space="preserve">i) Supuestos</w:t>
-      </w:r>
-      <w:r>
-        <w:t xml:space="preserve">: una función de gasto de la clase</w:t>
+        <w:t xml:space="preserve">Una función de gasto de la clase</w:t>
       </w:r>
       <w:r>
         <w:t xml:space="preserve"> </w:t>
@@ -24214,22 +24259,26 @@
     </w:p>
     <w:p>
       <w:pPr>
+        <w:pStyle w:val="FirstParagraph"/>
+        <w:keepNext/>
+      </w:pPr>
+      <w:r>
+        <w:rPr>
+          <w:i/>
+          <w:iCs/>
+        </w:rPr>
+        <w:t xml:space="preserve">ii) Desarrollo</w:t>
+      </w:r>
+    </w:p>
+    <w:p>
+      <w:pPr>
         <w:numPr>
           <w:ilvl w:val="0"/>
-          <w:numId w:val="1063"/>
+          <w:numId w:val="1071"/>
         </w:numPr>
       </w:pPr>
       <w:r>
-        <w:rPr>
-          <w:b/>
-          <w:bCs/>
-          <w:i/>
-          <w:iCs/>
-        </w:rPr>
-        <w:t xml:space="preserve">ii) Desarrollo</w:t>
-      </w:r>
-      <w:r>
-        <w:t xml:space="preserve">: por</w:t>
+        <w:t xml:space="preserve">Por</w:t>
       </w:r>
       <w:r>
         <w:t xml:space="preserve"> </w:t>
@@ -24701,30 +24750,22 @@
     </w:p>
     <w:p>
       <w:pPr>
+        <w:pStyle w:val="FirstParagraph"/>
         <w:keepNext/>
-        <w:numPr>
-          <w:ilvl w:val="0"/>
-          <w:numId w:val="1063"/>
-        </w:numPr>
       </w:pPr>
       <w:r>
         <w:rPr>
-          <w:b/>
-          <w:bCs/>
           <w:i/>
           <w:iCs/>
         </w:rPr>
         <w:t xml:space="preserve">iii) Implicaciones</w:t>
-      </w:r>
-      <w:r>
-        <w:t xml:space="preserve">:</w:t>
       </w:r>
     </w:p>
     <w:p>
       <w:pPr>
         <w:numPr>
-          <w:ilvl w:val="1"/>
-          <w:numId w:val="1064"/>
+          <w:ilvl w:val="0"/>
+          <w:numId w:val="1072"/>
         </w:numPr>
       </w:pPr>
       <w:r>
@@ -25006,8 +25047,8 @@
     <w:p>
       <w:pPr>
         <w:numPr>
-          <w:ilvl w:val="1"/>
-          <w:numId w:val="1064"/>
+          <w:ilvl w:val="0"/>
+          <w:numId w:val="1072"/>
         </w:numPr>
       </w:pPr>
       <w:r>
@@ -25194,8 +25235,8 @@
     <w:p>
       <w:pPr>
         <w:numPr>
-          <w:ilvl w:val="1"/>
-          <w:numId w:val="1064"/>
+          <w:ilvl w:val="0"/>
+          <w:numId w:val="1072"/>
         </w:numPr>
       </w:pPr>
       <w:r>
@@ -25754,7 +25795,7 @@
     <w:p>
       <w:pPr>
         <w:numPr>
-          <w:ilvl w:val="1"/>
+          <w:ilvl w:val="0"/>
           <w:numId w:val="1000"/>
         </w:numPr>
       </w:pPr>
@@ -25780,8 +25821,8 @@
     <w:p>
       <w:pPr>
         <w:numPr>
-          <w:ilvl w:val="1"/>
-          <w:numId w:val="1064"/>
+          <w:ilvl w:val="0"/>
+          <w:numId w:val="1072"/>
         </w:numPr>
       </w:pPr>
       <w:r>
@@ -25824,7 +25865,7 @@
       <w:pPr>
         <w:numPr>
           <w:ilvl w:val="0"/>
-          <w:numId w:val="1065"/>
+          <w:numId w:val="1073"/>
         </w:numPr>
       </w:pPr>
       <w:r>
@@ -25953,7 +25994,7 @@
       </w:r>
     </w:p>
     <w:bookmarkEnd w:id="99"/>
-    <w:bookmarkStart w:id="100" w:name="d-evidencia-empírica-3"/>
+    <w:bookmarkStart w:id="100" w:name="d-evidencia-empírica"/>
     <w:p>
       <w:pPr>
         <w:pStyle w:val="Heading5"/>
@@ -25966,7 +26007,7 @@
       <w:pPr>
         <w:numPr>
           <w:ilvl w:val="0"/>
-          <w:numId w:val="1066"/>
+          <w:numId w:val="1074"/>
         </w:numPr>
       </w:pPr>
       <w:r>
@@ -26012,7 +26053,7 @@
       </w:r>
     </w:p>
     <w:bookmarkEnd w:id="100"/>
-    <w:bookmarkStart w:id="101" w:name="e-valoración-5"/>
+    <w:bookmarkStart w:id="101" w:name="e-valoración"/>
     <w:p>
       <w:pPr>
         <w:pStyle w:val="Heading5"/>
@@ -26025,7 +26066,7 @@
       <w:pPr>
         <w:numPr>
           <w:ilvl w:val="0"/>
-          <w:numId w:val="1067"/>
+          <w:numId w:val="1075"/>
         </w:numPr>
       </w:pPr>
       <w:r>
@@ -26071,7 +26112,7 @@
       <w:pPr>
         <w:numPr>
           <w:ilvl w:val="0"/>
-          <w:numId w:val="1068"/>
+          <w:numId w:val="1076"/>
         </w:numPr>
       </w:pPr>
       <w:r>
@@ -26184,7 +26225,7 @@
       <w:pPr>
         <w:numPr>
           <w:ilvl w:val="0"/>
-          <w:numId w:val="1069"/>
+          <w:numId w:val="1077"/>
         </w:numPr>
       </w:pPr>
       <w:r>
@@ -26663,20 +26704,20 @@
       </w:r>
     </w:p>
     <w:bookmarkEnd w:id="104"/>
-    <w:bookmarkStart w:id="106" w:name="e-valoración-6"/>
+    <w:bookmarkStart w:id="106" w:name="c-valoración-2"/>
     <w:p>
       <w:pPr>
         <w:pStyle w:val="Heading5"/>
       </w:pPr>
       <w:r>
-        <w:t xml:space="preserve">e) Valoración</w:t>
+        <w:t xml:space="preserve">c) Valoración</w:t>
       </w:r>
     </w:p>
     <w:p>
       <w:pPr>
         <w:numPr>
           <w:ilvl w:val="0"/>
-          <w:numId w:val="1070"/>
+          <w:numId w:val="1078"/>
         </w:numPr>
       </w:pPr>
       <w:r>
@@ -27997,7 +28038,7 @@
       <w:pPr>
         <w:numPr>
           <w:ilvl w:val="0"/>
-          <w:numId w:val="1071"/>
+          <w:numId w:val="1079"/>
         </w:numPr>
       </w:pPr>
       <w:r>
@@ -28374,7 +28415,7 @@
         <w:keepNext/>
         <w:numPr>
           <w:ilvl w:val="0"/>
-          <w:numId w:val="1071"/>
+          <w:numId w:val="1079"/>
         </w:numPr>
       </w:pPr>
       <w:r>
@@ -28507,7 +28548,7 @@
       <w:pPr>
         <w:numPr>
           <w:ilvl w:val="1"/>
-          <w:numId w:val="1072"/>
+          <w:numId w:val="1080"/>
         </w:numPr>
       </w:pPr>
       <w:r>
@@ -28525,7 +28566,7 @@
       <w:pPr>
         <w:numPr>
           <w:ilvl w:val="1"/>
-          <w:numId w:val="1072"/>
+          <w:numId w:val="1080"/>
         </w:numPr>
       </w:pPr>
       <w:r>
@@ -28543,7 +28584,7 @@
       <w:pPr>
         <w:numPr>
           <w:ilvl w:val="1"/>
-          <w:numId w:val="1072"/>
+          <w:numId w:val="1080"/>
         </w:numPr>
       </w:pPr>
       <w:r>
@@ -28563,7 +28604,7 @@
       <w:pPr>
         <w:numPr>
           <w:ilvl w:val="0"/>
-          <w:numId w:val="1071"/>
+          <w:numId w:val="1079"/>
         </w:numPr>
       </w:pPr>
       <w:r>
@@ -28590,7 +28631,7 @@
       <w:pPr>
         <w:numPr>
           <w:ilvl w:val="0"/>
-          <w:numId w:val="1073"/>
+          <w:numId w:val="1081"/>
         </w:numPr>
       </w:pPr>
       <w:r>
@@ -28680,7 +28721,7 @@
       <w:pPr>
         <w:numPr>
           <w:ilvl w:val="0"/>
-          <w:numId w:val="1073"/>
+          <w:numId w:val="1081"/>
         </w:numPr>
       </w:pPr>
       <w:r>
@@ -28761,7 +28802,7 @@
       <w:pPr>
         <w:numPr>
           <w:ilvl w:val="0"/>
-          <w:numId w:val="1073"/>
+          <w:numId w:val="1081"/>
         </w:numPr>
       </w:pPr>
       <w:r>
@@ -28849,7 +28890,7 @@
       <w:pPr>
         <w:numPr>
           <w:ilvl w:val="0"/>
-          <w:numId w:val="1074"/>
+          <w:numId w:val="1082"/>
         </w:numPr>
       </w:pPr>
       <w:r>
@@ -28893,7 +28934,7 @@
       <w:pPr>
         <w:numPr>
           <w:ilvl w:val="0"/>
-          <w:numId w:val="1074"/>
+          <w:numId w:val="1082"/>
         </w:numPr>
       </w:pPr>
       <w:r>
@@ -28978,7 +29019,7 @@
       <w:pPr>
         <w:numPr>
           <w:ilvl w:val="0"/>
-          <w:numId w:val="1075"/>
+          <w:numId w:val="1083"/>
         </w:numPr>
       </w:pPr>
       <w:r>
@@ -29022,7 +29063,7 @@
         <w:keepNext/>
         <w:numPr>
           <w:ilvl w:val="0"/>
-          <w:numId w:val="1075"/>
+          <w:numId w:val="1083"/>
         </w:numPr>
       </w:pPr>
       <w:r>
@@ -29091,7 +29132,7 @@
       <w:pPr>
         <w:numPr>
           <w:ilvl w:val="1"/>
-          <w:numId w:val="1076"/>
+          <w:numId w:val="1084"/>
         </w:numPr>
       </w:pPr>
       <w:r>
@@ -29218,7 +29259,7 @@
       <w:pPr>
         <w:numPr>
           <w:ilvl w:val="1"/>
-          <w:numId w:val="1076"/>
+          <w:numId w:val="1084"/>
         </w:numPr>
       </w:pPr>
       <w:r>
@@ -29309,7 +29350,7 @@
       <w:pPr>
         <w:numPr>
           <w:ilvl w:val="1"/>
-          <w:numId w:val="1076"/>
+          <w:numId w:val="1084"/>
         </w:numPr>
       </w:pPr>
       <w:r>
@@ -29406,13 +29447,13 @@
       <w:pPr>
         <w:numPr>
           <w:ilvl w:val="0"/>
-          <w:numId w:val="1075"/>
+          <w:numId w:val="1083"/>
         </w:numPr>
       </w:pPr>
       <w:r>
         <w:rPr>
-          <w:b/>
-          <w:bCs/>
+          <w:i/>
+          <w:iCs/>
         </w:rPr>
         <w:t xml:space="preserve">Usos</w:t>
       </w:r>
@@ -29494,7 +29535,7 @@
       <w:pPr>
         <w:numPr>
           <w:ilvl w:val="0"/>
-          <w:numId w:val="1075"/>
+          <w:numId w:val="1083"/>
         </w:numPr>
       </w:pPr>
       <w:r>
@@ -29523,13 +29564,13 @@
         <w:keepNext/>
         <w:numPr>
           <w:ilvl w:val="0"/>
-          <w:numId w:val="1077"/>
+          <w:numId w:val="1085"/>
         </w:numPr>
       </w:pPr>
       <w:r>
         <w:rPr>
-          <w:b/>
-          <w:bCs/>
+          <w:i/>
+          <w:iCs/>
         </w:rPr>
         <w:t xml:space="preserve">Aportaciones</w:t>
       </w:r>
@@ -29541,7 +29582,7 @@
       <w:pPr>
         <w:numPr>
           <w:ilvl w:val="1"/>
-          <w:numId w:val="1078"/>
+          <w:numId w:val="1086"/>
         </w:numPr>
       </w:pPr>
       <w:r>
@@ -29552,7 +29593,7 @@
       <w:pPr>
         <w:numPr>
           <w:ilvl w:val="1"/>
-          <w:numId w:val="1078"/>
+          <w:numId w:val="1086"/>
         </w:numPr>
       </w:pPr>
       <w:r>
@@ -29563,7 +29604,7 @@
       <w:pPr>
         <w:numPr>
           <w:ilvl w:val="1"/>
-          <w:numId w:val="1078"/>
+          <w:numId w:val="1086"/>
         </w:numPr>
       </w:pPr>
       <w:r>
@@ -29608,13 +29649,13 @@
         <w:keepNext/>
         <w:numPr>
           <w:ilvl w:val="0"/>
-          <w:numId w:val="1077"/>
+          <w:numId w:val="1085"/>
         </w:numPr>
       </w:pPr>
       <w:r>
         <w:rPr>
-          <w:b/>
-          <w:bCs/>
+          <w:i/>
+          <w:iCs/>
         </w:rPr>
         <w:t xml:space="preserve">Limitaciones</w:t>
       </w:r>
@@ -29626,7 +29667,7 @@
       <w:pPr>
         <w:numPr>
           <w:ilvl w:val="1"/>
-          <w:numId w:val="1079"/>
+          <w:numId w:val="1087"/>
         </w:numPr>
       </w:pPr>
       <w:r>
@@ -29725,7 +29766,7 @@
       <w:pPr>
         <w:numPr>
           <w:ilvl w:val="1"/>
-          <w:numId w:val="1079"/>
+          <w:numId w:val="1087"/>
         </w:numPr>
       </w:pPr>
       <w:r>
@@ -29803,7 +29844,7 @@
       <w:pPr>
         <w:numPr>
           <w:ilvl w:val="1"/>
-          <w:numId w:val="1079"/>
+          <w:numId w:val="1087"/>
         </w:numPr>
       </w:pPr>
       <w:r>
@@ -29842,7 +29883,7 @@
       <w:pPr>
         <w:numPr>
           <w:ilvl w:val="0"/>
-          <w:numId w:val="1077"/>
+          <w:numId w:val="1085"/>
         </w:numPr>
       </w:pPr>
       <w:r>
@@ -29865,13 +29906,13 @@
       <w:pPr>
         <w:numPr>
           <w:ilvl w:val="0"/>
-          <w:numId w:val="1077"/>
+          <w:numId w:val="1085"/>
         </w:numPr>
       </w:pPr>
       <w:r>
         <w:rPr>
-          <w:b/>
-          <w:bCs/>
+          <w:i/>
+          <w:iCs/>
         </w:rPr>
         <w:t xml:space="preserve">Recapitulación y enlace</w:t>
       </w:r>
@@ -30026,11 +30067,11 @@
       <w:pPr>
         <w:numPr>
           <w:ilvl w:val="0"/>
-          <w:numId w:val="1080"/>
+          <w:numId w:val="1088"/>
         </w:numPr>
       </w:pPr>
       <w:r>
-        <w:t xml:space="preserve">Este bloque responde a la tercera y la cuarta preguntas. Su conclusión anticipada: conocidas las herramientas, la dualidad tiene una aplicación teórica, la</w:t>
+        <w:t xml:space="preserve">Una vez vistos la teoría de la dualidad y su uso empírico, pasamos a analizar sus aplicaciones. Este bloque responde a la tercera y la cuarta preguntas. Su conclusión anticipada: la dualidad tiene una aplicación teórica, la</w:t>
       </w:r>
       <w:r>
         <w:t xml:space="preserve"> </w:t>
@@ -30077,7 +30118,7 @@
       <w:pPr>
         <w:numPr>
           <w:ilvl w:val="0"/>
-          <w:numId w:val="1081"/>
+          <w:numId w:val="1089"/>
         </w:numPr>
       </w:pPr>
       <w:r>
@@ -30172,15 +30213,28 @@
         <w:keepNext/>
         <w:numPr>
           <w:ilvl w:val="0"/>
-          <w:numId w:val="1081"/>
+          <w:numId w:val="1089"/>
         </w:numPr>
       </w:pPr>
       <w:r>
         <w:rPr>
+          <w:i/>
+          <w:iCs/>
+        </w:rPr>
+        <w:t xml:space="preserve">Respuesta</w:t>
+      </w:r>
+      <w:r>
+        <w:t xml:space="preserve">: el</w:t>
+      </w:r>
+      <w:r>
+        <w:t xml:space="preserve"> </w:t>
+      </w:r>
+      <w:r>
+        <w:rPr>
           <w:b/>
           <w:bCs/>
         </w:rPr>
-        <w:t xml:space="preserve">Teorema de integrabilidad</w:t>
+        <w:t xml:space="preserve">teorema de integrabilidad</w:t>
       </w:r>
       <w:r>
         <w:t xml:space="preserve"> </w:t>
@@ -30389,7 +30443,7 @@
       <w:pPr>
         <w:numPr>
           <w:ilvl w:val="1"/>
-          <w:numId w:val="1082"/>
+          <w:numId w:val="1090"/>
         </w:numPr>
       </w:pPr>
       <w:r>
@@ -30517,7 +30571,7 @@
       <w:pPr>
         <w:numPr>
           <w:ilvl w:val="1"/>
-          <w:numId w:val="1082"/>
+          <w:numId w:val="1090"/>
         </w:numPr>
       </w:pPr>
       <w:r>
@@ -30906,7 +30960,7 @@
       <w:pPr>
         <w:numPr>
           <w:ilvl w:val="1"/>
-          <w:numId w:val="1082"/>
+          <w:numId w:val="1090"/>
         </w:numPr>
       </w:pPr>
       <w:r>
@@ -31101,13 +31155,13 @@
         <w:keepNext/>
         <w:numPr>
           <w:ilvl w:val="0"/>
-          <w:numId w:val="1081"/>
+          <w:numId w:val="1089"/>
         </w:numPr>
       </w:pPr>
       <w:r>
         <w:rPr>
-          <w:b/>
-          <w:bCs/>
+          <w:i/>
+          <w:iCs/>
         </w:rPr>
         <w:t xml:space="preserve">Intuición de la demostración</w:t>
       </w:r>
@@ -31166,7 +31220,7 @@
       <w:pPr>
         <w:numPr>
           <w:ilvl w:val="1"/>
-          <w:numId w:val="1083"/>
+          <w:numId w:val="1091"/>
         </w:numPr>
       </w:pPr>
       <w:r>
@@ -31941,7 +31995,7 @@
       <w:pPr>
         <w:numPr>
           <w:ilvl w:val="1"/>
-          <w:numId w:val="1083"/>
+          <w:numId w:val="1091"/>
         </w:numPr>
       </w:pPr>
       <w:r>
@@ -32018,7 +32072,7 @@
       <w:pPr>
         <w:numPr>
           <w:ilvl w:val="1"/>
-          <w:numId w:val="1083"/>
+          <w:numId w:val="1091"/>
         </w:numPr>
       </w:pPr>
       <w:r>
@@ -32985,7 +33039,7 @@
       <w:pPr>
         <w:numPr>
           <w:ilvl w:val="0"/>
-          <w:numId w:val="1084"/>
+          <w:numId w:val="1092"/>
         </w:numPr>
       </w:pPr>
       <w:r>
@@ -33156,13 +33210,13 @@
         <w:keepNext/>
         <w:numPr>
           <w:ilvl w:val="0"/>
-          <w:numId w:val="1084"/>
+          <w:numId w:val="1092"/>
         </w:numPr>
       </w:pPr>
       <w:r>
         <w:rPr>
-          <w:b/>
-          <w:bCs/>
+          <w:i/>
+          <w:iCs/>
         </w:rPr>
         <w:t xml:space="preserve">Relevancia</w:t>
       </w:r>
@@ -33174,7 +33228,7 @@
       <w:pPr>
         <w:numPr>
           <w:ilvl w:val="1"/>
-          <w:numId w:val="1085"/>
+          <w:numId w:val="1093"/>
         </w:numPr>
       </w:pPr>
       <w:r>
@@ -33192,7 +33246,7 @@
       <w:pPr>
         <w:numPr>
           <w:ilvl w:val="1"/>
-          <w:numId w:val="1085"/>
+          <w:numId w:val="1093"/>
         </w:numPr>
       </w:pPr>
       <w:r>
@@ -33210,7 +33264,7 @@
       <w:pPr>
         <w:numPr>
           <w:ilvl w:val="1"/>
-          <w:numId w:val="1085"/>
+          <w:numId w:val="1093"/>
         </w:numPr>
       </w:pPr>
       <w:r>
@@ -33264,13 +33318,13 @@
       <w:pPr>
         <w:numPr>
           <w:ilvl w:val="0"/>
-          <w:numId w:val="1084"/>
+          <w:numId w:val="1092"/>
         </w:numPr>
       </w:pPr>
       <w:r>
         <w:rPr>
-          <w:b/>
-          <w:bCs/>
+          <w:i/>
+          <w:iCs/>
         </w:rPr>
         <w:t xml:space="preserve">Recapitulación</w:t>
       </w:r>
@@ -33349,7 +33403,18 @@
       <w:pPr>
         <w:numPr>
           <w:ilvl w:val="0"/>
-          <w:numId w:val="1086"/>
+          <w:numId w:val="1094"/>
+        </w:numPr>
+      </w:pPr>
+      <w:r>
+        <w:t xml:space="preserve">La integrabilidad nos ha llevado de la demanda a las preferencias; la segunda aplicación usa la dualidad entre demandas para descomponer el efecto de un cambio de precio.</w:t>
+      </w:r>
+    </w:p>
+    <w:p>
+      <w:pPr>
+        <w:numPr>
+          <w:ilvl w:val="0"/>
+          <w:numId w:val="1094"/>
         </w:numPr>
       </w:pPr>
       <w:r>
@@ -33555,7 +33620,7 @@
       <w:pPr>
         <w:numPr>
           <w:ilvl w:val="0"/>
-          <w:numId w:val="1086"/>
+          <w:numId w:val="1094"/>
         </w:numPr>
       </w:pPr>
       <w:r>
@@ -34038,7 +34103,7 @@
       <w:pPr>
         <w:numPr>
           <w:ilvl w:val="0"/>
-          <w:numId w:val="1086"/>
+          <w:numId w:val="1094"/>
         </w:numPr>
       </w:pPr>
       <w:r>
@@ -34966,12 +35031,20 @@
       <w:r>
         <w:t xml:space="preserve">).</w:t>
       </w:r>
+      <m:oMath>
+        <m:r>
+          <m:rPr>
+            <m:sty m:val="p"/>
+          </m:rPr>
+          <m:t>◼</m:t>
+        </m:r>
+      </m:oMath>
     </w:p>
     <w:p>
       <w:pPr>
         <w:numPr>
           <w:ilvl w:val="1"/>
-          <w:numId w:val="1087"/>
+          <w:numId w:val="1095"/>
         </w:numPr>
       </w:pPr>
       <w:r>
@@ -35023,7 +35096,7 @@
       <w:pPr>
         <w:numPr>
           <w:ilvl w:val="1"/>
-          <w:numId w:val="1087"/>
+          <w:numId w:val="1095"/>
         </w:numPr>
       </w:pPr>
       <w:r>
@@ -35378,7 +35451,7 @@
       <w:pPr>
         <w:numPr>
           <w:ilvl w:val="1"/>
-          <w:numId w:val="1087"/>
+          <w:numId w:val="1095"/>
         </w:numPr>
       </w:pPr>
       <w:r>
@@ -35416,7 +35489,7 @@
       <w:pPr>
         <w:numPr>
           <w:ilvl w:val="0"/>
-          <w:numId w:val="1086"/>
+          <w:numId w:val="1094"/>
         </w:numPr>
       </w:pPr>
       <w:r>
@@ -35469,27 +35542,27 @@
         <w:keepNext/>
         <w:numPr>
           <w:ilvl w:val="0"/>
-          <w:numId w:val="1086"/>
+          <w:numId w:val="1094"/>
         </w:numPr>
       </w:pPr>
       <w:r>
         <w:rPr>
-          <w:b/>
-          <w:bCs/>
+          <w:i/>
+          <w:iCs/>
         </w:rPr>
         <w:t xml:space="preserve">Propiedades de la matriz de</w:t>
       </w:r>
       <w:r>
         <w:rPr>
-          <w:b/>
-          <w:bCs/>
-        </w:rPr>
-        <w:t xml:space="preserve"> </w:t>
-      </w:r>
-      <w:r>
-        <w:rPr>
-          <w:b/>
-          <w:bCs/>
+          <w:i/>
+          <w:iCs/>
+        </w:rPr>
+        <w:t xml:space="preserve"> </w:t>
+      </w:r>
+      <w:r>
+        <w:rPr>
+          <w:i/>
+          <w:iCs/>
           <w:smallCaps/>
         </w:rPr>
         <w:t xml:space="preserve">Slutsky</w:t>
@@ -35505,7 +35578,7 @@
       <w:pPr>
         <w:numPr>
           <w:ilvl w:val="1"/>
-          <w:numId w:val="1088"/>
+          <w:numId w:val="1096"/>
         </w:numPr>
       </w:pPr>
       <w:r>
@@ -35550,7 +35623,7 @@
       <w:pPr>
         <w:numPr>
           <w:ilvl w:val="1"/>
-          <w:numId w:val="1088"/>
+          <w:numId w:val="1096"/>
         </w:numPr>
       </w:pPr>
       <w:r>
@@ -35611,7 +35684,7 @@
       <w:pPr>
         <w:numPr>
           <w:ilvl w:val="1"/>
-          <w:numId w:val="1088"/>
+          <w:numId w:val="1096"/>
         </w:numPr>
       </w:pPr>
       <m:oMath>
@@ -35837,7 +35910,7 @@
         <w:keepNext/>
         <w:numPr>
           <w:ilvl w:val="0"/>
-          <w:numId w:val="1089"/>
+          <w:numId w:val="1097"/>
         </w:numPr>
       </w:pPr>
       <w:r>
@@ -35880,7 +35953,7 @@
       <w:pPr>
         <w:numPr>
           <w:ilvl w:val="1"/>
-          <w:numId w:val="1090"/>
+          <w:numId w:val="1098"/>
         </w:numPr>
       </w:pPr>
       <w:r>
@@ -35930,7 +36003,7 @@
       <w:pPr>
         <w:numPr>
           <w:ilvl w:val="1"/>
-          <w:numId w:val="1090"/>
+          <w:numId w:val="1098"/>
         </w:numPr>
       </w:pPr>
       <w:r>
@@ -36007,7 +36080,7 @@
       <w:pPr>
         <w:numPr>
           <w:ilvl w:val="0"/>
-          <w:numId w:val="1089"/>
+          <w:numId w:val="1097"/>
         </w:numPr>
       </w:pPr>
       <w:r>
@@ -37133,7 +37206,7 @@
       <w:pPr>
         <w:numPr>
           <w:ilvl w:val="0"/>
-          <w:numId w:val="1091"/>
+          <w:numId w:val="1099"/>
         </w:numPr>
       </w:pPr>
       <w:r>
@@ -37479,7 +37552,7 @@
       <w:pPr>
         <w:numPr>
           <w:ilvl w:val="0"/>
-          <w:numId w:val="1091"/>
+          <w:numId w:val="1099"/>
         </w:numPr>
       </w:pPr>
       <w:r>
@@ -39230,7 +39303,7 @@
       <w:pPr>
         <w:numPr>
           <w:ilvl w:val="0"/>
-          <w:numId w:val="1092"/>
+          <w:numId w:val="1100"/>
         </w:numPr>
       </w:pPr>
       <w:r>
@@ -39398,13 +39471,13 @@
       <w:pPr>
         <w:numPr>
           <w:ilvl w:val="0"/>
-          <w:numId w:val="1092"/>
+          <w:numId w:val="1100"/>
         </w:numPr>
       </w:pPr>
       <w:r>
         <w:rPr>
-          <w:b/>
-          <w:bCs/>
+          <w:i/>
+          <w:iCs/>
         </w:rPr>
         <w:t xml:space="preserve">Recapitulación</w:t>
       </w:r>
@@ -39460,11 +39533,11 @@
       <w:pPr>
         <w:numPr>
           <w:ilvl w:val="0"/>
-          <w:numId w:val="1093"/>
+          <w:numId w:val="1101"/>
         </w:numPr>
       </w:pPr>
       <w:r>
-        <w:t xml:space="preserve">La</w:t>
+        <w:t xml:space="preserve">Una vez separados los efectos sustitución y renta, pasamos a la tercera aplicación: medir en dinero cuánto gana o pierde el consumidor. La</w:t>
       </w:r>
       <w:r>
         <w:t xml:space="preserve"> </w:t>
@@ -39549,7 +39622,7 @@
       <w:pPr>
         <w:numPr>
           <w:ilvl w:val="0"/>
-          <w:numId w:val="1093"/>
+          <w:numId w:val="1101"/>
         </w:numPr>
       </w:pPr>
       <w:r>
@@ -39606,7 +39679,7 @@
       <w:pPr>
         <w:numPr>
           <w:ilvl w:val="0"/>
-          <w:numId w:val="1093"/>
+          <w:numId w:val="1101"/>
         </w:numPr>
       </w:pPr>
       <w:r>
@@ -39876,7 +39949,7 @@
       <w:pPr>
         <w:numPr>
           <w:ilvl w:val="0"/>
-          <w:numId w:val="1093"/>
+          <w:numId w:val="1101"/>
         </w:numPr>
       </w:pPr>
       <w:r>
@@ -40370,7 +40443,7 @@
         <w:keepNext/>
         <w:numPr>
           <w:ilvl w:val="0"/>
-          <w:numId w:val="1094"/>
+          <w:numId w:val="1102"/>
         </w:numPr>
       </w:pPr>
       <w:r>
@@ -40455,7 +40528,7 @@
       <w:pPr>
         <w:numPr>
           <w:ilvl w:val="1"/>
-          <w:numId w:val="1095"/>
+          <w:numId w:val="1103"/>
         </w:numPr>
       </w:pPr>
       <w:r>
@@ -40466,8 +40539,8 @@
       </w:r>
       <w:r>
         <w:rPr>
-          <w:i/>
-          <w:iCs/>
+          <w:b/>
+          <w:bCs/>
         </w:rPr>
         <w:t xml:space="preserve">excedente del consumidor</w:t>
       </w:r>
@@ -40482,7 +40555,7 @@
       <w:pPr>
         <w:numPr>
           <w:ilvl w:val="1"/>
-          <w:numId w:val="1095"/>
+          <w:numId w:val="1103"/>
         </w:numPr>
       </w:pPr>
       <w:r>
@@ -40850,7 +40923,7 @@
         <w:keepNext/>
         <w:numPr>
           <w:ilvl w:val="0"/>
-          <w:numId w:val="1096"/>
+          <w:numId w:val="1104"/>
         </w:numPr>
       </w:pPr>
       <w:r>
@@ -40874,7 +40947,7 @@
       <w:pPr>
         <w:numPr>
           <w:ilvl w:val="1"/>
-          <w:numId w:val="1097"/>
+          <w:numId w:val="1105"/>
         </w:numPr>
       </w:pPr>
       <w:r>
@@ -40969,7 +41042,7 @@
       <w:pPr>
         <w:numPr>
           <w:ilvl w:val="1"/>
-          <w:numId w:val="1097"/>
+          <w:numId w:val="1105"/>
         </w:numPr>
       </w:pPr>
       <w:r>
@@ -41226,7 +41299,7 @@
       <w:pPr>
         <w:numPr>
           <w:ilvl w:val="0"/>
-          <w:numId w:val="1096"/>
+          <w:numId w:val="1104"/>
         </w:numPr>
       </w:pPr>
       <w:r>
@@ -41272,11 +41345,11 @@
       <w:pPr>
         <w:numPr>
           <w:ilvl w:val="0"/>
-          <w:numId w:val="1098"/>
+          <w:numId w:val="1106"/>
         </w:numPr>
       </w:pPr>
       <w:r>
-        <w:t xml:space="preserve">La herramienta que traduce la utilidad a unidades monetarias es la</w:t>
+        <w:t xml:space="preserve">Para evitar los problemas del excedente, la herramienta que traduce la utilidad a unidades monetarias es la</w:t>
       </w:r>
       <w:r>
         <w:t xml:space="preserve"> </w:t>
@@ -41769,7 +41842,7 @@
       <w:pPr>
         <w:numPr>
           <w:ilvl w:val="0"/>
-          <w:numId w:val="1098"/>
+          <w:numId w:val="1106"/>
         </w:numPr>
       </w:pPr>
       <w:r>
@@ -41997,7 +42070,7 @@
       <w:pPr>
         <w:numPr>
           <w:ilvl w:val="0"/>
-          <w:numId w:val="1099"/>
+          <w:numId w:val="1107"/>
         </w:numPr>
       </w:pPr>
       <w:r>
@@ -43044,7 +43117,7 @@
       <w:pPr>
         <w:numPr>
           <w:ilvl w:val="0"/>
-          <w:numId w:val="1100"/>
+          <w:numId w:val="1108"/>
         </w:numPr>
       </w:pPr>
       <w:r>
@@ -44074,7 +44147,7 @@
       <w:pPr>
         <w:numPr>
           <w:ilvl w:val="0"/>
-          <w:numId w:val="1101"/>
+          <w:numId w:val="1109"/>
         </w:numPr>
       </w:pPr>
       <w:r>
@@ -44117,13 +44190,13 @@
       <w:pPr>
         <w:numPr>
           <w:ilvl w:val="0"/>
-          <w:numId w:val="1101"/>
+          <w:numId w:val="1109"/>
         </w:numPr>
       </w:pPr>
       <w:r>
         <w:rPr>
-          <w:b/>
-          <w:bCs/>
+          <w:i/>
+          <w:iCs/>
         </w:rPr>
         <w:t xml:space="preserve">Las tres medidas juntas</w:t>
       </w:r>
@@ -44350,7 +44423,7 @@
       <w:pPr>
         <w:numPr>
           <w:ilvl w:val="0"/>
-          <w:numId w:val="1102"/>
+          <w:numId w:val="1110"/>
         </w:numPr>
       </w:pPr>
       <w:r>
@@ -44845,7 +44918,7 @@
       <w:pPr>
         <w:numPr>
           <w:ilvl w:val="0"/>
-          <w:numId w:val="1102"/>
+          <w:numId w:val="1110"/>
         </w:numPr>
       </w:pPr>
       <w:r>
@@ -44899,7 +44972,7 @@
         <w:keepNext/>
         <w:numPr>
           <w:ilvl w:val="0"/>
-          <w:numId w:val="1102"/>
+          <w:numId w:val="1110"/>
         </w:numPr>
       </w:pPr>
       <w:r>
@@ -44907,8 +44980,8 @@
       </w:r>
       <w:r>
         <w:rPr>
-          <w:b/>
-          <w:bCs/>
+          <w:i/>
+          <w:iCs/>
         </w:rPr>
         <w:t xml:space="preserve">Cuál usar</w:t>
       </w:r>
@@ -44920,7 +44993,7 @@
       <w:pPr>
         <w:numPr>
           <w:ilvl w:val="1"/>
-          <w:numId w:val="1103"/>
+          <w:numId w:val="1111"/>
         </w:numPr>
       </w:pPr>
       <w:r>
@@ -45064,7 +45137,7 @@
       <w:pPr>
         <w:numPr>
           <w:ilvl w:val="1"/>
-          <w:numId w:val="1103"/>
+          <w:numId w:val="1111"/>
         </w:numPr>
       </w:pPr>
       <w:r>
@@ -45349,11 +45422,11 @@
       <w:pPr>
         <w:numPr>
           <w:ilvl w:val="0"/>
-          <w:numId w:val="1104"/>
+          <w:numId w:val="1112"/>
         </w:numPr>
       </w:pPr>
       <w:r>
-        <w:t xml:space="preserve">Si no se conoce la función de gasto ni la demanda, sino solo las cestas observadas</w:t>
+        <w:t xml:space="preserve">Las medidas anteriores exigen conocer la función de gasto. Si no se conoce ni ella ni la demanda, sino solo las cestas observadas</w:t>
       </w:r>
       <w:r>
         <w:t xml:space="preserve"> </w:t>
@@ -45764,22 +45837,22 @@
       </w:r>
       <w:r>
         <w:rPr>
-          <w:i/>
-          <w:iCs/>
+          <w:b/>
+          <w:bCs/>
         </w:rPr>
         <w:t xml:space="preserve">variación de</w:t>
       </w:r>
       <w:r>
         <w:rPr>
-          <w:i/>
-          <w:iCs/>
-        </w:rPr>
-        <w:t xml:space="preserve"> </w:t>
-      </w:r>
-      <w:r>
-        <w:rPr>
-          <w:i/>
-          <w:iCs/>
+          <w:b/>
+          <w:bCs/>
+        </w:rPr>
+        <w:t xml:space="preserve"> </w:t>
+      </w:r>
+      <w:r>
+        <w:rPr>
+          <w:b/>
+          <w:bCs/>
           <w:smallCaps/>
         </w:rPr>
         <w:t xml:space="preserve">Laspeyres</w:t>
@@ -45803,22 +45876,22 @@
       </w:r>
       <w:r>
         <w:rPr>
-          <w:i/>
-          <w:iCs/>
+          <w:b/>
+          <w:bCs/>
         </w:rPr>
         <w:t xml:space="preserve">de</w:t>
       </w:r>
       <w:r>
         <w:rPr>
-          <w:i/>
-          <w:iCs/>
-        </w:rPr>
-        <w:t xml:space="preserve"> </w:t>
-      </w:r>
-      <w:r>
-        <w:rPr>
-          <w:i/>
-          <w:iCs/>
+          <w:b/>
+          <w:bCs/>
+        </w:rPr>
+        <w:t xml:space="preserve"> </w:t>
+      </w:r>
+      <w:r>
+        <w:rPr>
+          <w:b/>
+          <w:bCs/>
           <w:smallCaps/>
         </w:rPr>
         <w:t xml:space="preserve">Paasche</w:t>
@@ -45954,7 +46027,7 @@
       <w:pPr>
         <w:numPr>
           <w:ilvl w:val="0"/>
-          <w:numId w:val="1104"/>
+          <w:numId w:val="1112"/>
         </w:numPr>
       </w:pPr>
       <w:r>
@@ -46273,7 +46346,18 @@
         </m:d>
       </m:oMath>
       <w:r>
-        <w:t xml:space="preserve">. La diferencia es el</w:t>
+        <w:t xml:space="preserve">.</w:t>
+      </w:r>
+      <m:oMath>
+        <m:r>
+          <m:rPr>
+            <m:sty m:val="p"/>
+          </m:rPr>
+          <m:t>◼</m:t>
+        </m:r>
+      </m:oMath>
+      <w:r>
+        <w:t xml:space="preserve">La diferencia es el</w:t>
       </w:r>
       <w:r>
         <w:t xml:space="preserve"> </w:t>
@@ -46383,11 +46467,11 @@
       <w:pPr>
         <w:numPr>
           <w:ilvl w:val="0"/>
-          <w:numId w:val="1105"/>
+          <w:numId w:val="1113"/>
         </w:numPr>
       </w:pPr>
       <w:r>
-        <w:t xml:space="preserve">Otra forma de medir los cambios de bienestar son los</w:t>
+        <w:t xml:space="preserve">Una vez estudiadas las variaciones, pasamos a otra forma de medir los cambios de bienestar: los los</w:t>
       </w:r>
       <w:r>
         <w:t xml:space="preserve"> </w:t>
@@ -46440,7 +46524,7 @@
       <w:pPr>
         <w:numPr>
           <w:ilvl w:val="0"/>
-          <w:numId w:val="1105"/>
+          <w:numId w:val="1113"/>
         </w:numPr>
       </w:pPr>
       <w:r>
@@ -47024,7 +47108,7 @@
       <w:pPr>
         <w:numPr>
           <w:ilvl w:val="0"/>
-          <w:numId w:val="1105"/>
+          <w:numId w:val="1113"/>
         </w:numPr>
       </w:pPr>
       <w:r>
@@ -47463,7 +47547,7 @@
       <w:pPr>
         <w:numPr>
           <w:ilvl w:val="1"/>
-          <w:numId w:val="1106"/>
+          <w:numId w:val="1114"/>
         </w:numPr>
       </w:pPr>
       <w:r>
@@ -48098,7 +48182,7 @@
       <w:pPr>
         <w:numPr>
           <w:ilvl w:val="1"/>
-          <w:numId w:val="1106"/>
+          <w:numId w:val="1114"/>
         </w:numPr>
       </w:pPr>
       <w:r>
@@ -48155,7 +48239,7 @@
       <w:pPr>
         <w:numPr>
           <w:ilvl w:val="1"/>
-          <w:numId w:val="1106"/>
+          <w:numId w:val="1114"/>
         </w:numPr>
       </w:pPr>
       <w:r>
@@ -48472,7 +48556,7 @@
       <w:pPr>
         <w:numPr>
           <w:ilvl w:val="0"/>
-          <w:numId w:val="1107"/>
+          <w:numId w:val="1115"/>
         </w:numPr>
       </w:pPr>
       <w:r>
@@ -48797,13 +48881,13 @@
         <w:keepNext/>
         <w:numPr>
           <w:ilvl w:val="0"/>
-          <w:numId w:val="1107"/>
+          <w:numId w:val="1115"/>
         </w:numPr>
       </w:pPr>
       <w:r>
         <w:rPr>
-          <w:b/>
-          <w:bCs/>
+          <w:i/>
+          <w:iCs/>
         </w:rPr>
         <w:t xml:space="preserve">Magnitud del sesgo de sustitución</w:t>
       </w:r>
@@ -48815,7 +48899,7 @@
       <w:pPr>
         <w:numPr>
           <w:ilvl w:val="1"/>
-          <w:numId w:val="1108"/>
+          <w:numId w:val="1116"/>
         </w:numPr>
       </w:pPr>
       <w:r>
@@ -48913,7 +48997,7 @@
       <w:pPr>
         <w:numPr>
           <w:ilvl w:val="1"/>
-          <w:numId w:val="1108"/>
+          <w:numId w:val="1116"/>
         </w:numPr>
       </w:pPr>
       <w:r>
@@ -48971,7 +49055,7 @@
       <w:pPr>
         <w:numPr>
           <w:ilvl w:val="1"/>
-          <w:numId w:val="1108"/>
+          <w:numId w:val="1116"/>
         </w:numPr>
       </w:pPr>
       <w:r>
@@ -50242,13 +50326,13 @@
       <w:pPr>
         <w:numPr>
           <w:ilvl w:val="0"/>
-          <w:numId w:val="1109"/>
+          <w:numId w:val="1117"/>
         </w:numPr>
       </w:pPr>
       <w:r>
         <w:rPr>
-          <w:b/>
-          <w:bCs/>
+          <w:i/>
+          <w:iCs/>
         </w:rPr>
         <w:t xml:space="preserve">Recapitulación</w:t>
       </w:r>
@@ -50283,7 +50367,7 @@
         <w:keepNext/>
         <w:numPr>
           <w:ilvl w:val="0"/>
-          <w:numId w:val="1110"/>
+          <w:numId w:val="1118"/>
         </w:numPr>
       </w:pPr>
       <w:r>
@@ -50303,7 +50387,7 @@
       <w:pPr>
         <w:numPr>
           <w:ilvl w:val="1"/>
-          <w:numId w:val="1111"/>
+          <w:numId w:val="1119"/>
         </w:numPr>
       </w:pPr>
       <w:r>
@@ -50314,7 +50398,7 @@
       <w:pPr>
         <w:numPr>
           <w:ilvl w:val="1"/>
-          <w:numId w:val="1111"/>
+          <w:numId w:val="1119"/>
         </w:numPr>
       </w:pPr>
       <w:r>
@@ -50325,7 +50409,7 @@
       <w:pPr>
         <w:numPr>
           <w:ilvl w:val="1"/>
-          <w:numId w:val="1111"/>
+          <w:numId w:val="1119"/>
         </w:numPr>
       </w:pPr>
       <w:r>
@@ -50414,7 +50498,7 @@
       <w:pPr>
         <w:numPr>
           <w:ilvl w:val="0"/>
-          <w:numId w:val="1110"/>
+          <w:numId w:val="1118"/>
         </w:numPr>
       </w:pPr>
       <w:r>
@@ -50435,7 +50519,7 @@
         <w:keepNext/>
         <w:numPr>
           <w:ilvl w:val="0"/>
-          <w:numId w:val="1110"/>
+          <w:numId w:val="1118"/>
         </w:numPr>
       </w:pPr>
       <w:r>
@@ -50455,7 +50539,7 @@
       <w:pPr>
         <w:numPr>
           <w:ilvl w:val="1"/>
-          <w:numId w:val="1112"/>
+          <w:numId w:val="1120"/>
         </w:numPr>
       </w:pPr>
       <w:r>
@@ -50493,7 +50577,7 @@
       <w:pPr>
         <w:numPr>
           <w:ilvl w:val="1"/>
-          <w:numId w:val="1112"/>
+          <w:numId w:val="1120"/>
         </w:numPr>
       </w:pPr>
       <w:r>
@@ -50540,7 +50624,7 @@
       <w:pPr>
         <w:numPr>
           <w:ilvl w:val="1"/>
-          <w:numId w:val="1112"/>
+          <w:numId w:val="1120"/>
         </w:numPr>
       </w:pPr>
       <w:r>
@@ -50623,7 +50707,7 @@
       <w:pPr>
         <w:numPr>
           <w:ilvl w:val="1"/>
-          <w:numId w:val="1112"/>
+          <w:numId w:val="1120"/>
         </w:numPr>
       </w:pPr>
       <w:r>
@@ -50664,7 +50748,7 @@
       <w:pPr>
         <w:numPr>
           <w:ilvl w:val="0"/>
-          <w:numId w:val="1110"/>
+          <w:numId w:val="1118"/>
         </w:numPr>
       </w:pPr>
       <w:r>
@@ -50696,7 +50780,7 @@
       <w:pPr>
         <w:numPr>
           <w:ilvl w:val="0"/>
-          <w:numId w:val="1110"/>
+          <w:numId w:val="1118"/>
         </w:numPr>
       </w:pPr>
       <w:r>
@@ -50744,7 +50828,7 @@
         <w:pStyle w:val="Cajadeanotaciones"/>
         <w:numPr>
           <w:ilvl w:val="0"/>
-          <w:numId w:val="1113"/>
+          <w:numId w:val="1121"/>
         </w:numPr>
       </w:pPr>
       <w:r>
@@ -50806,7 +50890,7 @@
         <w:pStyle w:val="Cajadeanotaciones"/>
         <w:numPr>
           <w:ilvl w:val="0"/>
-          <w:numId w:val="1113"/>
+          <w:numId w:val="1121"/>
         </w:numPr>
       </w:pPr>
       <w:r>
@@ -50856,7 +50940,7 @@
         <w:pStyle w:val="Cajadeanotaciones"/>
         <w:numPr>
           <w:ilvl w:val="0"/>
-          <w:numId w:val="1113"/>
+          <w:numId w:val="1121"/>
         </w:numPr>
       </w:pPr>
       <w:r>
@@ -50918,7 +51002,7 @@
         <w:pStyle w:val="Cajadeanotaciones"/>
         <w:numPr>
           <w:ilvl w:val="0"/>
-          <w:numId w:val="1113"/>
+          <w:numId w:val="1121"/>
         </w:numPr>
       </w:pPr>
       <w:r>
@@ -51014,7 +51098,7 @@
       <w:pPr>
         <w:numPr>
           <w:ilvl w:val="0"/>
-          <w:numId w:val="1114"/>
+          <w:numId w:val="1122"/>
         </w:numPr>
       </w:pPr>
       <w:r>
@@ -52881,7 +52965,7 @@
       <w:pPr>
         <w:numPr>
           <w:ilvl w:val="0"/>
-          <w:numId w:val="1115"/>
+          <w:numId w:val="1123"/>
         </w:numPr>
       </w:pPr>
       <w:r>
@@ -52963,7 +53047,7 @@
       <w:pPr>
         <w:numPr>
           <w:ilvl w:val="0"/>
-          <w:numId w:val="1115"/>
+          <w:numId w:val="1123"/>
         </w:numPr>
       </w:pPr>
       <w:r>
@@ -53068,7 +53152,7 @@
       <w:pPr>
         <w:numPr>
           <w:ilvl w:val="0"/>
-          <w:numId w:val="1115"/>
+          <w:numId w:val="1123"/>
         </w:numPr>
       </w:pPr>
       <w:r>
@@ -53104,7 +53188,7 @@
       <w:pPr>
         <w:numPr>
           <w:ilvl w:val="0"/>
-          <w:numId w:val="1116"/>
+          <w:numId w:val="1124"/>
         </w:numPr>
       </w:pPr>
       <w:r>
@@ -53325,7 +53409,7 @@
       <w:pPr>
         <w:numPr>
           <w:ilvl w:val="0"/>
-          <w:numId w:val="1116"/>
+          <w:numId w:val="1124"/>
         </w:numPr>
       </w:pPr>
       <w:r>
@@ -54024,7 +54108,7 @@
       <w:pPr>
         <w:numPr>
           <w:ilvl w:val="0"/>
-          <w:numId w:val="1116"/>
+          <w:numId w:val="1124"/>
         </w:numPr>
       </w:pPr>
       <w:r>
@@ -54337,7 +54421,7 @@
       <w:pPr>
         <w:numPr>
           <w:ilvl w:val="0"/>
-          <w:numId w:val="1116"/>
+          <w:numId w:val="1124"/>
         </w:numPr>
       </w:pPr>
       <w:r>
@@ -54472,7 +54556,7 @@
       <w:pPr>
         <w:numPr>
           <w:ilvl w:val="0"/>
-          <w:numId w:val="1116"/>
+          <w:numId w:val="1124"/>
         </w:numPr>
       </w:pPr>
       <w:r>
@@ -54671,7 +54755,7 @@
       <w:pPr>
         <w:numPr>
           <w:ilvl w:val="0"/>
-          <w:numId w:val="1117"/>
+          <w:numId w:val="1125"/>
         </w:numPr>
       </w:pPr>
       <w:r>
@@ -54707,7 +54791,7 @@
       <w:pPr>
         <w:numPr>
           <w:ilvl w:val="0"/>
-          <w:numId w:val="1118"/>
+          <w:numId w:val="1126"/>
         </w:numPr>
       </w:pPr>
       <w:r>
@@ -55415,12 +55499,20 @@
       <w:r>
         <w:t xml:space="preserve">en utilidad.</w:t>
       </w:r>
+      <m:oMath>
+        <m:r>
+          <m:rPr>
+            <m:sty m:val="p"/>
+          </m:rPr>
+          <m:t>◼</m:t>
+        </m:r>
+      </m:oMath>
     </w:p>
     <w:p>
       <w:pPr>
         <w:numPr>
           <w:ilvl w:val="0"/>
-          <w:numId w:val="1118"/>
+          <w:numId w:val="1126"/>
         </w:numPr>
       </w:pPr>
       <w:r>
@@ -56192,6 +56284,14 @@
       <w:r>
         <w:t xml:space="preserve">.</w:t>
       </w:r>
+      <m:oMath>
+        <m:r>
+          <m:rPr>
+            <m:sty m:val="p"/>
+          </m:rPr>
+          <m:t>◼</m:t>
+        </m:r>
+      </m:oMath>
     </w:p>
     <w:bookmarkEnd w:id="171"/>
     <w:bookmarkStart w:id="172" w:name="der:shephard"/>
@@ -56216,7 +56316,7 @@
       <w:pPr>
         <w:numPr>
           <w:ilvl w:val="0"/>
-          <w:numId w:val="1119"/>
+          <w:numId w:val="1127"/>
         </w:numPr>
       </w:pPr>
       <w:r>
@@ -56784,7 +56884,23 @@
       <w:pPr>
         <w:numPr>
           <w:ilvl w:val="0"/>
-          <w:numId w:val="1119"/>
+          <w:numId w:val="1000"/>
+        </w:numPr>
+      </w:pPr>
+      <m:oMath>
+        <m:r>
+          <m:rPr>
+            <m:sty m:val="p"/>
+          </m:rPr>
+          <m:t>◼</m:t>
+        </m:r>
+      </m:oMath>
+    </w:p>
+    <w:p>
+      <w:pPr>
+        <w:numPr>
+          <w:ilvl w:val="0"/>
+          <w:numId w:val="1127"/>
         </w:numPr>
       </w:pPr>
       <w:r>
@@ -57393,12 +57509,20 @@
       <w:r>
         <w:t xml:space="preserve">.</w:t>
       </w:r>
+      <m:oMath>
+        <m:r>
+          <m:rPr>
+            <m:sty m:val="p"/>
+          </m:rPr>
+          <m:t>◼</m:t>
+        </m:r>
+      </m:oMath>
     </w:p>
     <w:p>
       <w:pPr>
         <w:numPr>
           <w:ilvl w:val="0"/>
-          <w:numId w:val="1119"/>
+          <w:numId w:val="1127"/>
         </w:numPr>
       </w:pPr>
       <w:r>
@@ -57466,7 +57590,7 @@
       <w:pPr>
         <w:numPr>
           <w:ilvl w:val="0"/>
-          <w:numId w:val="1120"/>
+          <w:numId w:val="1128"/>
         </w:numPr>
       </w:pPr>
       <w:r>
@@ -57738,7 +57862,7 @@
         <w:keepNext/>
         <w:numPr>
           <w:ilvl w:val="0"/>
-          <w:numId w:val="1120"/>
+          <w:numId w:val="1128"/>
         </w:numPr>
       </w:pPr>
       <w:r>
@@ -57756,7 +57880,7 @@
       <w:pPr>
         <w:numPr>
           <w:ilvl w:val="1"/>
-          <w:numId w:val="1121"/>
+          <w:numId w:val="1129"/>
         </w:numPr>
       </w:pPr>
       <m:oMath>
@@ -57893,7 +58017,7 @@
       <w:pPr>
         <w:numPr>
           <w:ilvl w:val="1"/>
-          <w:numId w:val="1121"/>
+          <w:numId w:val="1129"/>
         </w:numPr>
       </w:pPr>
       <m:oMath>
@@ -58112,7 +58236,7 @@
       <w:pPr>
         <w:numPr>
           <w:ilvl w:val="0"/>
-          <w:numId w:val="1120"/>
+          <w:numId w:val="1128"/>
         </w:numPr>
       </w:pPr>
       <w:r>
@@ -58355,7 +58479,7 @@
       <w:pPr>
         <w:numPr>
           <w:ilvl w:val="0"/>
-          <w:numId w:val="1120"/>
+          <w:numId w:val="1128"/>
         </w:numPr>
       </w:pPr>
       <w:r>
@@ -58619,13 +58743,13 @@
       <w:pPr>
         <w:numPr>
           <w:ilvl w:val="0"/>
-          <w:numId w:val="1120"/>
+          <w:numId w:val="1128"/>
         </w:numPr>
       </w:pPr>
       <w:r>
         <w:rPr>
-          <w:b/>
-          <w:bCs/>
+          <w:i/>
+          <w:iCs/>
         </w:rPr>
         <w:t xml:space="preserve">Uso en la teoría de la demanda</w:t>
       </w:r>
@@ -58803,7 +58927,7 @@
       <w:pPr>
         <w:numPr>
           <w:ilvl w:val="0"/>
-          <w:numId w:val="1122"/>
+          <w:numId w:val="1130"/>
         </w:numPr>
       </w:pPr>
       <w:r>
@@ -58972,7 +59096,7 @@
       <w:pPr>
         <w:numPr>
           <w:ilvl w:val="0"/>
-          <w:numId w:val="1122"/>
+          <w:numId w:val="1130"/>
         </w:numPr>
       </w:pPr>
       <m:oMath>
@@ -59262,12 +59386,20 @@
       <w:r>
         <w:t xml:space="preserve">.</w:t>
       </w:r>
+      <m:oMath>
+        <m:r>
+          <m:rPr>
+            <m:sty m:val="p"/>
+          </m:rPr>
+          <m:t>◼</m:t>
+        </m:r>
+      </m:oMath>
     </w:p>
     <w:p>
       <w:pPr>
         <w:numPr>
           <w:ilvl w:val="0"/>
-          <w:numId w:val="1122"/>
+          <w:numId w:val="1130"/>
         </w:numPr>
       </w:pPr>
       <m:oMath>
@@ -59511,12 +59643,20 @@
       <w:r>
         <w:t xml:space="preserve">.</w:t>
       </w:r>
+      <m:oMath>
+        <m:r>
+          <m:rPr>
+            <m:sty m:val="p"/>
+          </m:rPr>
+          <m:t>◼</m:t>
+        </m:r>
+      </m:oMath>
     </w:p>
     <w:p>
       <w:pPr>
         <w:numPr>
           <w:ilvl w:val="0"/>
-          <w:numId w:val="1122"/>
+          <w:numId w:val="1130"/>
         </w:numPr>
       </w:pPr>
       <w:r>
@@ -60068,12 +60208,20 @@
       <w:r>
         <w:t xml:space="preserve">. Para un bien inferior, las desigualdades se invierten.</w:t>
       </w:r>
+      <m:oMath>
+        <m:r>
+          <m:rPr>
+            <m:sty m:val="p"/>
+          </m:rPr>
+          <m:t>◼</m:t>
+        </m:r>
+      </m:oMath>
     </w:p>
     <w:p>
       <w:pPr>
         <w:numPr>
           <w:ilvl w:val="0"/>
-          <w:numId w:val="1122"/>
+          <w:numId w:val="1130"/>
         </w:numPr>
       </w:pPr>
       <m:oMath>
@@ -60365,12 +60513,20 @@
       <w:r>
         <w:t xml:space="preserve">.</w:t>
       </w:r>
+      <m:oMath>
+        <m:r>
+          <m:rPr>
+            <m:sty m:val="p"/>
+          </m:rPr>
+          <m:t>◼</m:t>
+        </m:r>
+      </m:oMath>
     </w:p>
     <w:p>
       <w:pPr>
         <w:numPr>
           <w:ilvl w:val="0"/>
-          <w:numId w:val="1122"/>
+          <w:numId w:val="1130"/>
         </w:numPr>
       </w:pPr>
       <w:r>
@@ -61612,7 +61768,7 @@
       <w:pPr>
         <w:numPr>
           <w:ilvl w:val="0"/>
-          <w:numId w:val="1123"/>
+          <w:numId w:val="1131"/>
         </w:numPr>
       </w:pPr>
       <w:r>
@@ -62175,7 +62331,7 @@
       <w:pPr>
         <w:numPr>
           <w:ilvl w:val="0"/>
-          <w:numId w:val="1123"/>
+          <w:numId w:val="1131"/>
         </w:numPr>
       </w:pPr>
       <w:r>
@@ -62425,7 +62581,7 @@
       <w:pPr>
         <w:numPr>
           <w:ilvl w:val="0"/>
-          <w:numId w:val="1123"/>
+          <w:numId w:val="1131"/>
         </w:numPr>
       </w:pPr>
       <w:r>
@@ -62781,12 +62937,20 @@
       <w:r>
         <w:t xml:space="preserve">la ecuación (36); del mismo modo para la VE.</w:t>
       </w:r>
+      <m:oMath>
+        <m:r>
+          <m:rPr>
+            <m:sty m:val="p"/>
+          </m:rPr>
+          <m:t>◼</m:t>
+        </m:r>
+      </m:oMath>
     </w:p>
     <w:p>
       <w:pPr>
         <w:numPr>
           <w:ilvl w:val="0"/>
-          <w:numId w:val="1123"/>
+          <w:numId w:val="1131"/>
         </w:numPr>
       </w:pPr>
       <w:r>
@@ -62887,7 +63051,7 @@
       <w:pPr>
         <w:numPr>
           <w:ilvl w:val="0"/>
-          <w:numId w:val="1124"/>
+          <w:numId w:val="1132"/>
         </w:numPr>
       </w:pPr>
       <w:r>
@@ -63090,7 +63254,7 @@
       <w:pPr>
         <w:numPr>
           <w:ilvl w:val="0"/>
-          <w:numId w:val="1124"/>
+          <w:numId w:val="1132"/>
         </w:numPr>
       </w:pPr>
       <w:r>
@@ -63128,7 +63292,7 @@
       <w:pPr>
         <w:numPr>
           <w:ilvl w:val="0"/>
-          <w:numId w:val="1124"/>
+          <w:numId w:val="1132"/>
         </w:numPr>
       </w:pPr>
       <w:r>
@@ -63315,7 +63479,7 @@
       <w:pPr>
         <w:numPr>
           <w:ilvl w:val="0"/>
-          <w:numId w:val="1124"/>
+          <w:numId w:val="1132"/>
         </w:numPr>
       </w:pPr>
       <w:r>
@@ -63442,7 +63606,7 @@
       <w:pPr>
         <w:numPr>
           <w:ilvl w:val="0"/>
-          <w:numId w:val="1124"/>
+          <w:numId w:val="1132"/>
         </w:numPr>
       </w:pPr>
       <w:r>
@@ -63626,7 +63790,7 @@
       <w:pPr>
         <w:numPr>
           <w:ilvl w:val="0"/>
-          <w:numId w:val="1124"/>
+          <w:numId w:val="1132"/>
         </w:numPr>
       </w:pPr>
       <w:r>
@@ -63697,7 +63861,7 @@
       <w:pPr>
         <w:numPr>
           <w:ilvl w:val="0"/>
-          <w:numId w:val="1124"/>
+          <w:numId w:val="1132"/>
         </w:numPr>
       </w:pPr>
       <w:r>
@@ -63838,7 +64002,7 @@
       <w:pPr>
         <w:numPr>
           <w:ilvl w:val="0"/>
-          <w:numId w:val="1124"/>
+          <w:numId w:val="1132"/>
         </w:numPr>
       </w:pPr>
       <w:r>
@@ -68351,6 +68515,14 @@
       <w:r>
         <w:t xml:space="preserve">.</w:t>
       </w:r>
+      <m:oMath>
+        <m:r>
+          <m:rPr>
+            <m:sty m:val="p"/>
+          </m:rPr>
+          <m:t>◼</m:t>
+        </m:r>
+      </m:oMath>
     </w:p>
   </w:footnote>
   <w:footnote w:id="54">
@@ -69899,7 +70071,18 @@
         </m:sSub>
       </m:oMath>
       <w:r>
-        <w:t xml:space="preserve">. La integrabilidad solo restringe de verdad con tres bienes o más.</w:t>
+        <w:t xml:space="preserve">.</w:t>
+      </w:r>
+      <m:oMath>
+        <m:r>
+          <m:rPr>
+            <m:sty m:val="p"/>
+          </m:rPr>
+          <m:t>◼</m:t>
+        </m:r>
+      </m:oMath>
+      <w:r>
+        <w:t xml:space="preserve">La integrabilidad solo restringe de verdad con tres bienes o más.</w:t>
       </w:r>
     </w:p>
   </w:footnote>
@@ -70750,6 +70933,14 @@
       <w:r>
         <w:t xml:space="preserve">.</w:t>
       </w:r>
+      <m:oMath>
+        <m:r>
+          <m:rPr>
+            <m:sty m:val="p"/>
+          </m:rPr>
+          <m:t>◼</m:t>
+        </m:r>
+      </m:oMath>
     </w:p>
   </w:footnote>
   <w:footnote w:id="129">
@@ -71465,6 +71656,14 @@
       <w:r>
         <w:t xml:space="preserve">: ignorar la sustitución lleva a subestimar el encarecimiento medido con la utilidad final.</w:t>
       </w:r>
+      <m:oMath>
+        <m:r>
+          <m:rPr>
+            <m:sty m:val="p"/>
+          </m:rPr>
+          <m:t>◼</m:t>
+        </m:r>
+      </m:oMath>
     </w:p>
   </w:footnote>
   <w:footnote w:id="158">
@@ -71649,6 +71848,14 @@
       <w:r>
         <w:t xml:space="preserve">, y no queda ningún efecto sustitución.</w:t>
       </w:r>
+      <m:oMath>
+        <m:r>
+          <m:rPr>
+            <m:sty m:val="p"/>
+          </m:rPr>
+          <m:t>◼</m:t>
+        </m:r>
+      </m:oMath>
     </w:p>
   </w:footnote>
 </w:footnotes>
@@ -72004,34 +72211,7 @@
     <w:abstractNumId w:val="991"/>
   </w:num>
   <w:num w:numId="1021">
-    <w:abstractNumId w:val="99201"/>
-    <w:lvlOverride w:ilvl="0">
-      <w:startOverride w:val="1"/>
-    </w:lvlOverride>
-    <w:lvlOverride w:ilvl="1">
-      <w:startOverride w:val="1"/>
-    </w:lvlOverride>
-    <w:lvlOverride w:ilvl="2">
-      <w:startOverride w:val="1"/>
-    </w:lvlOverride>
-    <w:lvlOverride w:ilvl="3">
-      <w:startOverride w:val="1"/>
-    </w:lvlOverride>
-    <w:lvlOverride w:ilvl="4">
-      <w:startOverride w:val="1"/>
-    </w:lvlOverride>
-    <w:lvlOverride w:ilvl="5">
-      <w:startOverride w:val="1"/>
-    </w:lvlOverride>
-    <w:lvlOverride w:ilvl="6">
-      <w:startOverride w:val="1"/>
-    </w:lvlOverride>
-    <w:lvlOverride w:ilvl="7">
-      <w:startOverride w:val="1"/>
-    </w:lvlOverride>
-    <w:lvlOverride w:ilvl="8">
-      <w:startOverride w:val="1"/>
-    </w:lvlOverride>
+    <w:abstractNumId w:val="991"/>
   </w:num>
   <w:num w:numId="1022">
     <w:abstractNumId w:val="99201"/>
@@ -72064,27 +72244,6 @@
     </w:lvlOverride>
   </w:num>
   <w:num w:numId="1023">
-    <w:abstractNumId w:val="991"/>
-  </w:num>
-  <w:num w:numId="1024">
-    <w:abstractNumId w:val="991"/>
-  </w:num>
-  <w:num w:numId="1025">
-    <w:abstractNumId w:val="991"/>
-  </w:num>
-  <w:num w:numId="1026">
-    <w:abstractNumId w:val="991"/>
-  </w:num>
-  <w:num w:numId="1027">
-    <w:abstractNumId w:val="991"/>
-  </w:num>
-  <w:num w:numId="1028">
-    <w:abstractNumId w:val="991"/>
-  </w:num>
-  <w:num w:numId="1029">
-    <w:abstractNumId w:val="991"/>
-  </w:num>
-  <w:num w:numId="1030">
     <w:abstractNumId w:val="99201"/>
     <w:lvlOverride w:ilvl="0">
       <w:startOverride w:val="1"/>
@@ -72113,6 +72272,27 @@
     <w:lvlOverride w:ilvl="8">
       <w:startOverride w:val="1"/>
     </w:lvlOverride>
+  </w:num>
+  <w:num w:numId="1024">
+    <w:abstractNumId w:val="991"/>
+  </w:num>
+  <w:num w:numId="1025">
+    <w:abstractNumId w:val="991"/>
+  </w:num>
+  <w:num w:numId="1026">
+    <w:abstractNumId w:val="991"/>
+  </w:num>
+  <w:num w:numId="1027">
+    <w:abstractNumId w:val="991"/>
+  </w:num>
+  <w:num w:numId="1028">
+    <w:abstractNumId w:val="991"/>
+  </w:num>
+  <w:num w:numId="1029">
+    <w:abstractNumId w:val="991"/>
+  </w:num>
+  <w:num w:numId="1030">
+    <w:abstractNumId w:val="991"/>
   </w:num>
   <w:num w:numId="1031">
     <w:abstractNumId w:val="99201"/>
@@ -72145,24 +72325,6 @@
     </w:lvlOverride>
   </w:num>
   <w:num w:numId="1032">
-    <w:abstractNumId w:val="991"/>
-  </w:num>
-  <w:num w:numId="1033">
-    <w:abstractNumId w:val="991"/>
-  </w:num>
-  <w:num w:numId="1034">
-    <w:abstractNumId w:val="991"/>
-  </w:num>
-  <w:num w:numId="1035">
-    <w:abstractNumId w:val="991"/>
-  </w:num>
-  <w:num w:numId="1036">
-    <w:abstractNumId w:val="991"/>
-  </w:num>
-  <w:num w:numId="1037">
-    <w:abstractNumId w:val="991"/>
-  </w:num>
-  <w:num w:numId="1038">
     <w:abstractNumId w:val="99201"/>
     <w:lvlOverride w:ilvl="0">
       <w:startOverride w:val="1"/>
@@ -72192,28 +72354,25 @@
       <w:startOverride w:val="1"/>
     </w:lvlOverride>
   </w:num>
-  <w:num w:numId="1039">
+  <w:num w:numId="1033">
     <w:abstractNumId w:val="991"/>
   </w:num>
-  <w:num w:numId="1040">
+  <w:num w:numId="1034">
     <w:abstractNumId w:val="991"/>
   </w:num>
-  <w:num w:numId="1041">
+  <w:num w:numId="1035">
     <w:abstractNumId w:val="991"/>
   </w:num>
-  <w:num w:numId="1042">
+  <w:num w:numId="1036">
     <w:abstractNumId w:val="991"/>
   </w:num>
-  <w:num w:numId="1043">
+  <w:num w:numId="1037">
     <w:abstractNumId w:val="991"/>
   </w:num>
-  <w:num w:numId="1044">
+  <w:num w:numId="1038">
     <w:abstractNumId w:val="991"/>
   </w:num>
-  <w:num w:numId="1045">
-    <w:abstractNumId w:val="991"/>
-  </w:num>
-  <w:num w:numId="1046">
+  <w:num w:numId="1039">
     <w:abstractNumId w:val="99201"/>
     <w:lvlOverride w:ilvl="0">
       <w:startOverride w:val="1"/>
@@ -72242,6 +72401,27 @@
     <w:lvlOverride w:ilvl="8">
       <w:startOverride w:val="1"/>
     </w:lvlOverride>
+  </w:num>
+  <w:num w:numId="1040">
+    <w:abstractNumId w:val="991"/>
+  </w:num>
+  <w:num w:numId="1041">
+    <w:abstractNumId w:val="991"/>
+  </w:num>
+  <w:num w:numId="1042">
+    <w:abstractNumId w:val="991"/>
+  </w:num>
+  <w:num w:numId="1043">
+    <w:abstractNumId w:val="991"/>
+  </w:num>
+  <w:num w:numId="1044">
+    <w:abstractNumId w:val="991"/>
+  </w:num>
+  <w:num w:numId="1045">
+    <w:abstractNumId w:val="991"/>
+  </w:num>
+  <w:num w:numId="1046">
+    <w:abstractNumId w:val="991"/>
   </w:num>
   <w:num w:numId="1047">
     <w:abstractNumId w:val="99201"/>
@@ -72274,7 +72454,34 @@
     </w:lvlOverride>
   </w:num>
   <w:num w:numId="1048">
-    <w:abstractNumId w:val="991"/>
+    <w:abstractNumId w:val="99201"/>
+    <w:lvlOverride w:ilvl="0">
+      <w:startOverride w:val="1"/>
+    </w:lvlOverride>
+    <w:lvlOverride w:ilvl="1">
+      <w:startOverride w:val="1"/>
+    </w:lvlOverride>
+    <w:lvlOverride w:ilvl="2">
+      <w:startOverride w:val="1"/>
+    </w:lvlOverride>
+    <w:lvlOverride w:ilvl="3">
+      <w:startOverride w:val="1"/>
+    </w:lvlOverride>
+    <w:lvlOverride w:ilvl="4">
+      <w:startOverride w:val="1"/>
+    </w:lvlOverride>
+    <w:lvlOverride w:ilvl="5">
+      <w:startOverride w:val="1"/>
+    </w:lvlOverride>
+    <w:lvlOverride w:ilvl="6">
+      <w:startOverride w:val="1"/>
+    </w:lvlOverride>
+    <w:lvlOverride w:ilvl="7">
+      <w:startOverride w:val="1"/>
+    </w:lvlOverride>
+    <w:lvlOverride w:ilvl="8">
+      <w:startOverride w:val="1"/>
+    </w:lvlOverride>
   </w:num>
   <w:num w:numId="1049">
     <w:abstractNumId w:val="991"/>
@@ -72367,6 +72574,30 @@
     <w:abstractNumId w:val="991"/>
   </w:num>
   <w:num w:numId="1079">
+    <w:abstractNumId w:val="991"/>
+  </w:num>
+  <w:num w:numId="1080">
+    <w:abstractNumId w:val="991"/>
+  </w:num>
+  <w:num w:numId="1081">
+    <w:abstractNumId w:val="991"/>
+  </w:num>
+  <w:num w:numId="1082">
+    <w:abstractNumId w:val="991"/>
+  </w:num>
+  <w:num w:numId="1083">
+    <w:abstractNumId w:val="991"/>
+  </w:num>
+  <w:num w:numId="1084">
+    <w:abstractNumId w:val="991"/>
+  </w:num>
+  <w:num w:numId="1085">
+    <w:abstractNumId w:val="991"/>
+  </w:num>
+  <w:num w:numId="1086">
+    <w:abstractNumId w:val="991"/>
+  </w:num>
+  <w:num w:numId="1087">
     <w:abstractNumId w:val="99201"/>
     <w:lvlOverride w:ilvl="0">
       <w:startOverride w:val="1"/>
@@ -72396,13 +72627,13 @@
       <w:startOverride w:val="1"/>
     </w:lvlOverride>
   </w:num>
-  <w:num w:numId="1080">
+  <w:num w:numId="1088">
     <w:abstractNumId w:val="991"/>
   </w:num>
-  <w:num w:numId="1081">
+  <w:num w:numId="1089">
     <w:abstractNumId w:val="991"/>
   </w:num>
-  <w:num w:numId="1082">
+  <w:num w:numId="1090">
     <w:abstractNumId w:val="99201"/>
     <w:lvlOverride w:ilvl="0">
       <w:startOverride w:val="1"/>
@@ -72432,7 +72663,7 @@
       <w:startOverride w:val="1"/>
     </w:lvlOverride>
   </w:num>
-  <w:num w:numId="1083">
+  <w:num w:numId="1091">
     <w:abstractNumId w:val="99201"/>
     <w:lvlOverride w:ilvl="0">
       <w:startOverride w:val="1"/>
@@ -72461,30 +72692,6 @@
     <w:lvlOverride w:ilvl="8">
       <w:startOverride w:val="1"/>
     </w:lvlOverride>
-  </w:num>
-  <w:num w:numId="1084">
-    <w:abstractNumId w:val="991"/>
-  </w:num>
-  <w:num w:numId="1085">
-    <w:abstractNumId w:val="991"/>
-  </w:num>
-  <w:num w:numId="1086">
-    <w:abstractNumId w:val="991"/>
-  </w:num>
-  <w:num w:numId="1087">
-    <w:abstractNumId w:val="991"/>
-  </w:num>
-  <w:num w:numId="1088">
-    <w:abstractNumId w:val="991"/>
-  </w:num>
-  <w:num w:numId="1089">
-    <w:abstractNumId w:val="991"/>
-  </w:num>
-  <w:num w:numId="1090">
-    <w:abstractNumId w:val="991"/>
-  </w:num>
-  <w:num w:numId="1091">
-    <w:abstractNumId w:val="991"/>
   </w:num>
   <w:num w:numId="1092">
     <w:abstractNumId w:val="991"/>
@@ -72574,6 +72781,30 @@
     <w:abstractNumId w:val="991"/>
   </w:num>
   <w:num w:numId="1121">
+    <w:abstractNumId w:val="991"/>
+  </w:num>
+  <w:num w:numId="1122">
+    <w:abstractNumId w:val="991"/>
+  </w:num>
+  <w:num w:numId="1123">
+    <w:abstractNumId w:val="991"/>
+  </w:num>
+  <w:num w:numId="1124">
+    <w:abstractNumId w:val="991"/>
+  </w:num>
+  <w:num w:numId="1125">
+    <w:abstractNumId w:val="991"/>
+  </w:num>
+  <w:num w:numId="1126">
+    <w:abstractNumId w:val="991"/>
+  </w:num>
+  <w:num w:numId="1127">
+    <w:abstractNumId w:val="991"/>
+  </w:num>
+  <w:num w:numId="1128">
+    <w:abstractNumId w:val="991"/>
+  </w:num>
+  <w:num w:numId="1129">
     <w:abstractNumId w:val="99201"/>
     <w:lvlOverride w:ilvl="0">
       <w:startOverride w:val="1"/>
@@ -72603,13 +72834,13 @@
       <w:startOverride w:val="1"/>
     </w:lvlOverride>
   </w:num>
-  <w:num w:numId="1122">
+  <w:num w:numId="1130">
     <w:abstractNumId w:val="991"/>
   </w:num>
-  <w:num w:numId="1123">
+  <w:num w:numId="1131">
     <w:abstractNumId w:val="991"/>
   </w:num>
-  <w:num w:numId="1124">
+  <w:num w:numId="1132">
     <w:abstractNumId w:val="991"/>
   </w:num>
 </w:numbering>

</xml_diff>

<commit_message>
Licencia CC BY-NC-ND 4.0 en todos los formatos del temario
- PDF del tema: línea pequeña en gris en la portada (© año · iconos CC
  enlazados) y metadatos XMP con hyperxmp (dc:rights, WebStatement).
- Web: <link rel="license">, copyright en el JSON-LD y línea completa en el pie.
- Word: «© año Víctor Gutiérrez Marcos · CC BY-NC-ND 4.0» a la izquierda del
  pie (en todas las partes) y licencia en las propiedades del documento.
- Ficha de repaso: en el pie y en los metadatos (siguen 4 páginas).
- Vídeo: rótulo en la portada y el cierre; licencia en el -youtube.txt.
- LICENSE.md en la raíz y regla en CRITERIOS.md.
- Temas revisados y fichas reconstruidos.

Co-Authored-By: Claude Opus 5.5 <noreply@anthropic.com>
Claude-Session: https://claude.ai/code/session_01PWJgAjs4PN1Rvp3aLA4tqT
</commit_message>
<xml_diff>
--- a/oposicion/temario/tercer-ejercicio/3A09.docx
+++ b/oposicion/temario/tercer-ejercicio/3A09.docx
@@ -67257,8 +67257,22 @@
   <w:p>
     <w:pPr>
       <w:pStyle w:val="Footer"/>
-      <w:jc w:val="right"/>
+      <w:tabs>
+        <w:tab w:val="right" w:pos="9412"/>
+      </w:tabs>
+      <w:jc w:val="left"/>
     </w:pPr>
+    <w:r>
+      <w:rPr>
+        <w:i/>
+        <w:color w:val="767171"/>
+        <w:sz w:val="14"/>
+      </w:rPr>
+      <w:t xml:space="preserve">© 2026 Víctor Gutiérrez Marcos · CC BY-NC-ND 4.0</w:t>
+    </w:r>
+    <w:r>
+      <w:tab/>
+    </w:r>
     <w:r/>
     <w:r>
       <w:rPr>
@@ -67301,8 +67315,22 @@
   <w:p>
     <w:pPr>
       <w:pStyle w:val="Footer"/>
-      <w:jc w:val="right"/>
+      <w:tabs>
+        <w:tab w:val="right" w:pos="9412"/>
+      </w:tabs>
+      <w:jc w:val="left"/>
     </w:pPr>
+    <w:r>
+      <w:rPr>
+        <w:i/>
+        <w:color w:val="767171"/>
+        <w:sz w:val="14"/>
+      </w:rPr>
+      <w:t xml:space="preserve">© 2026 Víctor Gutiérrez Marcos · CC BY-NC-ND 4.0</w:t>
+    </w:r>
+    <w:r>
+      <w:tab/>
+    </w:r>
     <w:r/>
     <w:r>
       <w:rPr>
@@ -67353,8 +67381,22 @@
   <w:p>
     <w:pPr>
       <w:pStyle w:val="Footer"/>
-      <w:jc w:val="right"/>
+      <w:tabs>
+        <w:tab w:val="right" w:pos="9412"/>
+      </w:tabs>
+      <w:jc w:val="left"/>
     </w:pPr>
+    <w:r>
+      <w:rPr>
+        <w:i/>
+        <w:color w:val="767171"/>
+        <w:sz w:val="14"/>
+      </w:rPr>
+      <w:t xml:space="preserve">© 2026 Víctor Gutiérrez Marcos · CC BY-NC-ND 4.0</w:t>
+    </w:r>
+    <w:r>
+      <w:tab/>
+    </w:r>
     <w:r/>
     <w:r>
       <w:rPr>

</xml_diff>

<commit_message>
Ninguna fórmula destacada separada de la frase que la presenta: dentro de la viñeta o del párrafo (3.A.9, 3.A.10, 3.A.16), regla en CRITERIOS y comprobación en verificar-tema.py
Co-Authored-By: Claude Opus 5.5 <noreply@anthropic.com>
Claude-Session: https://claude.ai/code/session_01PWJgAjs4PN1Rvp3aLA4tqT
</commit_message>
<xml_diff>
--- a/oposicion/temario/tercer-ejercicio/3A09.docx
+++ b/oposicion/temario/tercer-ejercicio/3A09.docx
@@ -13208,12 +13208,15 @@
       <w:r>
         <w:t xml:space="preserve">como puede reoptimizar y sustituir los bienes que se encarecen por los que se abaratan, gasta como mucho eso:</w:t>
       </w:r>
+      <w:r>
+        <w:t xml:space="preserve"> </w:t>
+      </w:r>
+      <w:bookmarkStart w:id="73" w:name="eq_concavidad_fg"/>
+      <w:bookmarkEnd w:id="73"/>
     </w:p>
-    <w:bookmarkStart w:id="73" w:name="eq_concavidad_fg"/>
-    <w:bookmarkEnd w:id="73"/>
     <w:p>
       <w:pPr>
-        <w:pStyle w:val="FirstParagraph"/>
+        <w:pStyle w:val="BodyText"/>
         <w:keepNext/>
       </w:pPr>
       <m:oMathPara>

</xml_diff>

<commit_message>
Temas 3.A.8, 3.A.9, 3.A.11, 3.A.12, 3.A.16, 3.A.17 y 3.A.21 reconstruidos con las plantillas nuevas
PDF, web, Word y ficha de repaso de los siete temas regenerados con reconstruir-todos.py (dos pasadas): mismas páginas de tema, anexos y bibliografía que antes y misma letra en las fichas; marcadores del PDF corregidos; web con un solo h1, texto alternativo, pie y menú del sitio, tema oscuro legible y citas como en el PDF; las remisiones entre temas revisados enlazan a la página, no al PDF. estado.json con las huellas de la fuente y la letra de la ficha. verificar-tema.py: los bloques a)/i) en otro nivel son aviso (3.A.9 y 3.A.16 los tienen); construir-tema.py tolera que el .bat de LyX ya no esté. (El 3.A.10 y el 3.A.13 quedan fuera: los está trabajando otra sesión.)

Co-Authored-By: Claude Fable 5.1 <noreply@anthropic.com>
Claude-Session: https://claude.ai/code/session_01U1qGW9Z1ES1hvR4ih98cS2
</commit_message>
<xml_diff>
--- a/oposicion/temario/tercer-ejercicio/3A09.docx
+++ b/oposicion/temario/tercer-ejercicio/3A09.docx
@@ -113,13 +113,7 @@
           <w:rPr>
             <w:rStyle w:val="Hyperlink"/>
           </w:rPr>
-          <w:t xml:space="preserve"> </w:t>
-        </w:r>
-        <w:r>
-          <w:rPr>
-            <w:rStyle w:val="Hyperlink"/>
-          </w:rPr>
-          <w:t xml:space="preserve">2015</w:t>
+          <w:t xml:space="preserve">, 2015</w:t>
         </w:r>
       </w:hyperlink>
       <w:r>
@@ -140,13 +134,7 @@
           <w:rPr>
             <w:rStyle w:val="Hyperlink"/>
           </w:rPr>
-          <w:t xml:space="preserve"> </w:t>
-        </w:r>
-        <w:r>
-          <w:rPr>
-            <w:rStyle w:val="Hyperlink"/>
-          </w:rPr>
-          <w:t xml:space="preserve">2025</w:t>
+          <w:t xml:space="preserve">, 2025</w:t>
         </w:r>
       </w:hyperlink>
       <w:r>
@@ -1211,13 +1199,7 @@
           <w:rPr>
             <w:rStyle w:val="Hyperlink"/>
           </w:rPr>
-          <w:t xml:space="preserve"> </w:t>
-        </w:r>
-        <w:r>
-          <w:rPr>
-            <w:rStyle w:val="Hyperlink"/>
-          </w:rPr>
-          <w:t xml:space="preserve">1939</w:t>
+          <w:t xml:space="preserve">, 1939</w:t>
         </w:r>
       </w:hyperlink>
       <w:r>
@@ -1353,13 +1335,7 @@
           <w:rPr>
             <w:rStyle w:val="Hyperlink"/>
           </w:rPr>
-          <w:t xml:space="preserve"> </w:t>
-        </w:r>
-        <w:r>
-          <w:rPr>
-            <w:rStyle w:val="Hyperlink"/>
-          </w:rPr>
-          <w:t xml:space="preserve">2015</w:t>
+          <w:t xml:space="preserve">, 2015</w:t>
         </w:r>
       </w:hyperlink>
       <w:r>
@@ -1457,13 +1433,7 @@
           <w:rPr>
             <w:rStyle w:val="Hyperlink"/>
           </w:rPr>
-          <w:t xml:space="preserve"> </w:t>
-        </w:r>
-        <w:r>
-          <w:rPr>
-            <w:rStyle w:val="Hyperlink"/>
-          </w:rPr>
-          <w:t xml:space="preserve">1995</w:t>
+          <w:t xml:space="preserve">, 1995</w:t>
         </w:r>
       </w:hyperlink>
       <w:r>
@@ -1484,13 +1454,7 @@
           <w:rPr>
             <w:rStyle w:val="Hyperlink"/>
           </w:rPr>
-          <w:t xml:space="preserve"> </w:t>
-        </w:r>
-        <w:r>
-          <w:rPr>
-            <w:rStyle w:val="Hyperlink"/>
-          </w:rPr>
-          <w:t xml:space="preserve">2008</w:t>
+          <w:t xml:space="preserve">, 2008</w:t>
         </w:r>
       </w:hyperlink>
       <w:r>
@@ -2651,7 +2615,7 @@
           <wp:inline>
             <wp:extent cx="5670550" cy="1833824"/>
             <wp:effectExtent b="0" l="0" r="0" t="0"/>
-            <wp:docPr descr="" title="" id="29" name="Picture"/>
+            <wp:docPr descr="Gráfico 1.– De las preferencias a las dos demandas: los mismos ingredientes, con los papeles cambiados" title="" id="29" name="Picture"/>
             <a:graphic>
               <a:graphicData uri="http://schemas.openxmlformats.org/drawingml/2006/picture">
                 <pic:pic>
@@ -5608,7 +5572,7 @@
           <wp:inline>
             <wp:extent cx="2688152" cy="2272238"/>
             <wp:effectExtent b="0" l="0" r="0" t="0"/>
-            <wp:docPr descr="" title="" id="40" name="Picture"/>
+            <wp:docPr descr="Gráfico 2.– Problema primal: la curva de indiferencia más alta alcanzable con la renta \overline{W}" title="" id="40" name="Picture"/>
             <a:graphic>
               <a:graphicData uri="http://schemas.openxmlformats.org/drawingml/2006/picture">
                 <pic:pic>
@@ -6190,13 +6154,7 @@
           <w:rPr>
             <w:rStyle w:val="Hyperlink"/>
           </w:rPr>
-          <w:t xml:space="preserve"> </w:t>
-        </w:r>
-        <w:r>
-          <w:rPr>
-            <w:rStyle w:val="Hyperlink"/>
-          </w:rPr>
-          <w:t xml:space="preserve">1995</w:t>
+          <w:t xml:space="preserve">, 1995</w:t>
         </w:r>
       </w:hyperlink>
       <w:r>
@@ -6242,13 +6200,7 @@
           <w:rPr>
             <w:rStyle w:val="Hyperlink"/>
           </w:rPr>
-          <w:t xml:space="preserve"> </w:t>
-        </w:r>
-        <w:r>
-          <w:rPr>
-            <w:rStyle w:val="Hyperlink"/>
-          </w:rPr>
-          <w:t xml:space="preserve">2011, cap. 1</w:t>
+          <w:t xml:space="preserve">, 2011, cap. 1</w:t>
         </w:r>
       </w:hyperlink>
       <w:r>
@@ -6836,13 +6788,7 @@
           <w:rPr>
             <w:rStyle w:val="Hyperlink"/>
           </w:rPr>
-          <w:t xml:space="preserve"> </w:t>
-        </w:r>
-        <w:r>
-          <w:rPr>
-            <w:rStyle w:val="Hyperlink"/>
-          </w:rPr>
-          <w:t xml:space="preserve">2011, cap. 1</w:t>
+          <w:t xml:space="preserve">, 2011, cap. 1</w:t>
         </w:r>
       </w:hyperlink>
       <w:r>
@@ -7314,13 +7260,7 @@
           <w:rPr>
             <w:rStyle w:val="Hyperlink"/>
           </w:rPr>
-          <w:t xml:space="preserve"> </w:t>
-        </w:r>
-        <w:r>
-          <w:rPr>
-            <w:rStyle w:val="Hyperlink"/>
-          </w:rPr>
-          <w:t xml:space="preserve">1995</w:t>
+          <w:t xml:space="preserve">, 1995</w:t>
         </w:r>
       </w:hyperlink>
       <w:r>
@@ -8346,16 +8286,8 @@
         </m:r>
       </m:oMath>
       <w:r>
-        <w:t xml:space="preserve">.</w:t>
-      </w:r>
-      <m:oMath>
-        <m:r>
-          <m:rPr>
-            <m:sty m:val="p"/>
-          </m:rPr>
-          <m:t>◼</m:t>
-        </m:r>
-      </m:oMath>
+        <w:t xml:space="preserve">. ∎</w:t>
+      </w:r>
     </w:p>
     <w:p>
       <w:pPr>
@@ -8453,13 +8385,7 @@
           <w:rPr>
             <w:rStyle w:val="Hyperlink"/>
           </w:rPr>
-          <w:t xml:space="preserve"> </w:t>
-        </w:r>
-        <w:r>
-          <w:rPr>
-            <w:rStyle w:val="Hyperlink"/>
-          </w:rPr>
-          <w:t xml:space="preserve">1947</w:t>
+          <w:t xml:space="preserve">, 1947</w:t>
         </w:r>
       </w:hyperlink>
       <w:r>
@@ -8800,7 +8726,7 @@
           <wp:inline>
             <wp:extent cx="3581400" cy="2567681"/>
             <wp:effectExtent b="0" l="0" r="0" t="0"/>
-            <wp:docPr descr="" title="" id="51" name="Picture"/>
+            <wp:docPr descr="Gráfico 3.– Cuasiconvexidad de la función indirecta de utilidad: con el presupuesto promedio no se alcanza más utilidad que con el mejor de los extremos" title="" id="51" name="Picture"/>
             <a:graphic>
               <a:graphicData uri="http://schemas.openxmlformats.org/drawingml/2006/picture">
                 <pic:pic>
@@ -9602,13 +9528,7 @@
           <w:rPr>
             <w:rStyle w:val="Hyperlink"/>
           </w:rPr>
-          <w:t xml:space="preserve"> </w:t>
-        </w:r>
-        <w:r>
-          <w:rPr>
-            <w:rStyle w:val="Hyperlink"/>
-          </w:rPr>
-          <w:t xml:space="preserve">1995</w:t>
+          <w:t xml:space="preserve">, 1995</w:t>
         </w:r>
       </w:hyperlink>
       <w:r>
@@ -10462,13 +10382,7 @@
           <w:rPr>
             <w:rStyle w:val="Hyperlink"/>
           </w:rPr>
-          <w:t xml:space="preserve"> </w:t>
-        </w:r>
-        <w:r>
-          <w:rPr>
-            <w:rStyle w:val="Hyperlink"/>
-          </w:rPr>
-          <w:t xml:space="preserve">1995</w:t>
+          <w:t xml:space="preserve">, 1995</w:t>
         </w:r>
       </w:hyperlink>
       <w:r>
@@ -10649,7 +10563,7 @@
           <wp:inline>
             <wp:extent cx="2654512" cy="2275296"/>
             <wp:effectExtent b="0" l="0" r="0" t="0"/>
-            <wp:docPr descr="" title="" id="65" name="Picture"/>
+            <wp:docPr descr="Gráfico 4.– Problema dual: la recta isogasto más baja que alcanza la utilidad \overline{U}" title="" id="65" name="Picture"/>
             <a:graphic>
               <a:graphicData uri="http://schemas.openxmlformats.org/drawingml/2006/picture">
                 <pic:pic>
@@ -11294,13 +11208,7 @@
           <w:rPr>
             <w:rStyle w:val="Hyperlink"/>
           </w:rPr>
-          <w:t xml:space="preserve"> </w:t>
-        </w:r>
-        <w:r>
-          <w:rPr>
-            <w:rStyle w:val="Hyperlink"/>
-          </w:rPr>
-          <w:t xml:space="preserve">1995</w:t>
+          <w:t xml:space="preserve">, 1995</w:t>
         </w:r>
       </w:hyperlink>
       <w:r>
@@ -12572,13 +12480,7 @@
           <w:rPr>
             <w:rStyle w:val="Hyperlink"/>
           </w:rPr>
-          <w:t xml:space="preserve"> </w:t>
-        </w:r>
-        <w:r>
-          <w:rPr>
-            <w:rStyle w:val="Hyperlink"/>
-          </w:rPr>
-          <w:t xml:space="preserve">1995</w:t>
+          <w:t xml:space="preserve">, 1995</w:t>
         </w:r>
       </w:hyperlink>
       <w:r>
@@ -13597,13 +13499,7 @@
           <w:rPr>
             <w:rStyle w:val="Hyperlink"/>
           </w:rPr>
-          <w:t xml:space="preserve"> </w:t>
-        </w:r>
-        <w:r>
-          <w:rPr>
-            <w:rStyle w:val="Hyperlink"/>
-          </w:rPr>
-          <w:t xml:space="preserve">1953</w:t>
+          <w:t xml:space="preserve">, 1953</w:t>
         </w:r>
       </w:hyperlink>
       <w:r>
@@ -13624,13 +13520,7 @@
           <w:rPr>
             <w:rStyle w:val="Hyperlink"/>
           </w:rPr>
-          <w:t xml:space="preserve"> </w:t>
-        </w:r>
-        <w:r>
-          <w:rPr>
-            <w:rStyle w:val="Hyperlink"/>
-          </w:rPr>
-          <w:t xml:space="preserve">1957</w:t>
+          <w:t xml:space="preserve">, 1957</w:t>
         </w:r>
       </w:hyperlink>
       <w:r>
@@ -14949,7 +14839,7 @@
           <wp:inline>
             <wp:extent cx="3282950" cy="3020801"/>
             <wp:effectExtent b="0" l="0" r="0" t="0"/>
-            <wp:docPr descr="" title="" id="77" name="Picture"/>
+            <wp:docPr descr="Gráfico 5.– Concavidad de la función de gasto y lema de Shephard" title="" id="77" name="Picture"/>
             <a:graphic>
               <a:graphicData uri="http://schemas.openxmlformats.org/drawingml/2006/picture">
                 <pic:pic>
@@ -16780,13 +16670,7 @@
           <w:rPr>
             <w:rStyle w:val="Hyperlink"/>
           </w:rPr>
-          <w:t xml:space="preserve"> </w:t>
-        </w:r>
-        <w:r>
-          <w:rPr>
-            <w:rStyle w:val="Hyperlink"/>
-          </w:rPr>
-          <w:t xml:space="preserve">1995</w:t>
+          <w:t xml:space="preserve">, 1995</w:t>
         </w:r>
       </w:hyperlink>
       <w:r>
@@ -17381,7 +17265,7 @@
           <wp:inline>
             <wp:extent cx="3000088" cy="2342576"/>
             <wp:effectExtent b="0" l="0" r="0" t="0"/>
-            <wp:docPr descr="" title="" id="87" name="Picture"/>
+            <wp:docPr descr="Gráfico 6.– Teorema básico de la dualidad: con \overline{W}=E^* y \overline{U}=U^*, el primal y el dual eligen la misma cesta" title="" id="87" name="Picture"/>
             <a:graphic>
               <a:graphicData uri="http://schemas.openxmlformats.org/drawingml/2006/picture">
                 <pic:pic>
@@ -19070,7 +18954,7 @@
           <wp:inline>
             <wp:extent cx="5969000" cy="3051645"/>
             <wp:effectExtent b="0" l="0" r="0" t="0"/>
-            <wp:docPr descr="" title="" id="96" name="Picture"/>
+            <wp:docPr descr="Gráfico 7.– Esquema de dualidad: problemas, soluciones, funciones valor y relaciones entre ellas" title="" id="96" name="Picture"/>
             <a:graphic>
               <a:graphicData uri="http://schemas.openxmlformats.org/drawingml/2006/picture">
                 <pic:pic>
@@ -19718,13 +19602,7 @@
           <w:rPr>
             <w:rStyle w:val="Hyperlink"/>
           </w:rPr>
-          <w:t xml:space="preserve"> </w:t>
-        </w:r>
-        <w:r>
-          <w:rPr>
-            <w:rStyle w:val="Hyperlink"/>
-          </w:rPr>
-          <w:t xml:space="preserve">1980b, cap. 1</w:t>
+          <w:t xml:space="preserve">, 1980b, cap. 1</w:t>
         </w:r>
       </w:hyperlink>
       <w:r>
@@ -19783,13 +19661,7 @@
           <w:rPr>
             <w:rStyle w:val="Hyperlink"/>
           </w:rPr>
-          <w:t xml:space="preserve"> </w:t>
-        </w:r>
-        <w:r>
-          <w:rPr>
-            <w:rStyle w:val="Hyperlink"/>
-          </w:rPr>
-          <w:t xml:space="preserve">1997</w:t>
+          <w:t xml:space="preserve">, 1997</w:t>
         </w:r>
       </w:hyperlink>
       <w:r>
@@ -19994,13 +19866,7 @@
           <w:rPr>
             <w:rStyle w:val="Hyperlink"/>
           </w:rPr>
-          <w:t xml:space="preserve"> </w:t>
-        </w:r>
-        <w:r>
-          <w:rPr>
-            <w:rStyle w:val="Hyperlink"/>
-          </w:rPr>
-          <w:t xml:space="preserve">1980a</w:t>
+          <w:t xml:space="preserve">, 1980a</w:t>
         </w:r>
       </w:hyperlink>
       <w:r>
@@ -21087,13 +20953,7 @@
           <w:rPr>
             <w:rStyle w:val="Hyperlink"/>
           </w:rPr>
-          <w:t xml:space="preserve"> </w:t>
-        </w:r>
-        <w:r>
-          <w:rPr>
-            <w:rStyle w:val="Hyperlink"/>
-          </w:rPr>
-          <w:t xml:space="preserve">1947</w:t>
+          <w:t xml:space="preserve">, 1947</w:t>
         </w:r>
       </w:hyperlink>
       <w:r>
@@ -21114,13 +20974,7 @@
           <w:rPr>
             <w:rStyle w:val="Hyperlink"/>
           </w:rPr>
-          <w:t xml:space="preserve"> </w:t>
-        </w:r>
-        <w:r>
-          <w:rPr>
-            <w:rStyle w:val="Hyperlink"/>
-          </w:rPr>
-          <w:t xml:space="preserve">1950</w:t>
+          <w:t xml:space="preserve">, 1950</w:t>
         </w:r>
       </w:hyperlink>
       <w:r>
@@ -21141,13 +20995,7 @@
           <w:rPr>
             <w:rStyle w:val="Hyperlink"/>
           </w:rPr>
-          <w:t xml:space="preserve"> </w:t>
-        </w:r>
-        <w:r>
-          <w:rPr>
-            <w:rStyle w:val="Hyperlink"/>
-          </w:rPr>
-          <w:t xml:space="preserve">1954</w:t>
+          <w:t xml:space="preserve">, 1954</w:t>
         </w:r>
       </w:hyperlink>
       <w:r>
@@ -21685,13 +21533,7 @@
           <w:rPr>
             <w:rStyle w:val="Hyperlink"/>
           </w:rPr>
-          <w:t xml:space="preserve"> </w:t>
-        </w:r>
-        <w:r>
-          <w:rPr>
-            <w:rStyle w:val="Hyperlink"/>
-          </w:rPr>
-          <w:t xml:space="preserve">1964</w:t>
+          <w:t xml:space="preserve">, 1964</w:t>
         </w:r>
       </w:hyperlink>
       <w:r>
@@ -21712,13 +21554,7 @@
           <w:rPr>
             <w:rStyle w:val="Hyperlink"/>
           </w:rPr>
-          <w:t xml:space="preserve"> </w:t>
-        </w:r>
-        <w:r>
-          <w:rPr>
-            <w:rStyle w:val="Hyperlink"/>
-          </w:rPr>
-          <w:t xml:space="preserve">1965</w:t>
+          <w:t xml:space="preserve">, 1965</w:t>
         </w:r>
       </w:hyperlink>
       <w:r>
@@ -22833,13 +22669,7 @@
           <w:rPr>
             <w:rStyle w:val="Hyperlink"/>
           </w:rPr>
-          <w:t xml:space="preserve"> </w:t>
-        </w:r>
-        <w:r>
-          <w:rPr>
-            <w:rStyle w:val="Hyperlink"/>
-          </w:rPr>
-          <w:t xml:space="preserve">1975</w:t>
+          <w:t xml:space="preserve">, 1975</w:t>
         </w:r>
       </w:hyperlink>
       <w:r>
@@ -26781,13 +26611,7 @@
           <w:rPr>
             <w:rStyle w:val="Hyperlink"/>
           </w:rPr>
-          <w:t xml:space="preserve"> </w:t>
-        </w:r>
-        <w:r>
-          <w:rPr>
-            <w:rStyle w:val="Hyperlink"/>
-          </w:rPr>
-          <w:t xml:space="preserve">1997</w:t>
+          <w:t xml:space="preserve">, 1997</w:t>
         </w:r>
       </w:hyperlink>
       <w:r>
@@ -27278,13 +27102,7 @@
           <w:rPr>
             <w:rStyle w:val="Hyperlink"/>
           </w:rPr>
-          <w:t xml:space="preserve"> </w:t>
-        </w:r>
-        <w:r>
-          <w:rPr>
-            <w:rStyle w:val="Hyperlink"/>
-          </w:rPr>
-          <w:t xml:space="preserve">1981</w:t>
+          <w:t xml:space="preserve">, 1981</w:t>
         </w:r>
       </w:hyperlink>
       <w:r>
@@ -27602,13 +27420,7 @@
                 <w:rPr>
                   <w:rStyle w:val="Hyperlink"/>
                 </w:rPr>
-                <w:t xml:space="preserve"> </w:t>
-              </w:r>
-              <w:r>
-                <w:rPr>
-                  <w:rStyle w:val="Hyperlink"/>
-                </w:rPr>
-                <w:t xml:space="preserve">1954</w:t>
+                <w:t xml:space="preserve">, 1954</w:t>
               </w:r>
             </w:hyperlink>
             <w:r>
@@ -27896,13 +27708,7 @@
                 <w:rPr>
                   <w:rStyle w:val="Hyperlink"/>
                 </w:rPr>
-                <w:t xml:space="preserve"> </w:t>
-              </w:r>
-              <w:r>
-                <w:rPr>
-                  <w:rStyle w:val="Hyperlink"/>
-                </w:rPr>
-                <w:t xml:space="preserve">1975</w:t>
+                <w:t xml:space="preserve">, 1975</w:t>
               </w:r>
             </w:hyperlink>
             <w:r>
@@ -28037,13 +27843,7 @@
                 <w:rPr>
                   <w:rStyle w:val="Hyperlink"/>
                 </w:rPr>
-                <w:t xml:space="preserve"> </w:t>
-              </w:r>
-              <w:r>
-                <w:rPr>
-                  <w:rStyle w:val="Hyperlink"/>
-                </w:rPr>
-                <w:t xml:space="preserve">1980a</w:t>
+                <w:t xml:space="preserve">, 1980a</w:t>
               </w:r>
             </w:hyperlink>
             <w:r>
@@ -28233,13 +28033,7 @@
                 <w:rPr>
                   <w:rStyle w:val="Hyperlink"/>
                 </w:rPr>
-                <w:t xml:space="preserve"> </w:t>
-              </w:r>
-              <w:r>
-                <w:rPr>
-                  <w:rStyle w:val="Hyperlink"/>
-                </w:rPr>
-                <w:t xml:space="preserve">1997</w:t>
+                <w:t xml:space="preserve">, 1997</w:t>
               </w:r>
             </w:hyperlink>
             <w:r>
@@ -29097,13 +28891,7 @@
           <w:rPr>
             <w:rStyle w:val="Hyperlink"/>
           </w:rPr>
-          <w:t xml:space="preserve"> </w:t>
-        </w:r>
-        <w:r>
-          <w:rPr>
-            <w:rStyle w:val="Hyperlink"/>
-          </w:rPr>
-          <w:t xml:space="preserve">1957</w:t>
+          <w:t xml:space="preserve">, 1957</w:t>
         </w:r>
       </w:hyperlink>
       <w:r>
@@ -29124,13 +28912,7 @@
           <w:rPr>
             <w:rStyle w:val="Hyperlink"/>
           </w:rPr>
-          <w:t xml:space="preserve"> </w:t>
-        </w:r>
-        <w:r>
-          <w:rPr>
-            <w:rStyle w:val="Hyperlink"/>
-          </w:rPr>
-          <w:t xml:space="preserve">1959</w:t>
+          <w:t xml:space="preserve">, 1959</w:t>
         </w:r>
       </w:hyperlink>
       <w:r>
@@ -29283,13 +29065,7 @@
           <w:rPr>
             <w:rStyle w:val="Hyperlink"/>
           </w:rPr>
-          <w:t xml:space="preserve"> </w:t>
-        </w:r>
-        <w:r>
-          <w:rPr>
-            <w:rStyle w:val="Hyperlink"/>
-          </w:rPr>
-          <w:t xml:space="preserve">2026d</w:t>
+          <w:t xml:space="preserve">, 2026d</w:t>
         </w:r>
       </w:hyperlink>
       <w:r>
@@ -29364,13 +29140,7 @@
           <w:rPr>
             <w:rStyle w:val="Hyperlink"/>
           </w:rPr>
-          <w:t xml:space="preserve"> </w:t>
-        </w:r>
-        <w:r>
-          <w:rPr>
-            <w:rStyle w:val="Hyperlink"/>
-          </w:rPr>
-          <w:t xml:space="preserve">s. f.</w:t>
+          <w:t xml:space="preserve">, s. f.</w:t>
         </w:r>
       </w:hyperlink>
       <w:r>
@@ -29510,13 +29280,7 @@
           <w:rPr>
             <w:rStyle w:val="Hyperlink"/>
           </w:rPr>
-          <w:t xml:space="preserve"> </w:t>
-        </w:r>
-        <w:r>
-          <w:rPr>
-            <w:rStyle w:val="Hyperlink"/>
-          </w:rPr>
-          <w:t xml:space="preserve">1969</w:t>
+          <w:t xml:space="preserve">, 1969</w:t>
         </w:r>
       </w:hyperlink>
       <w:r>
@@ -29579,13 +29343,7 @@
           <w:rPr>
             <w:rStyle w:val="Hyperlink"/>
           </w:rPr>
-          <w:t xml:space="preserve"> </w:t>
-        </w:r>
-        <w:r>
-          <w:rPr>
-            <w:rStyle w:val="Hyperlink"/>
-          </w:rPr>
-          <w:t xml:space="preserve">1981</w:t>
+          <w:t xml:space="preserve">, 1981</w:t>
         </w:r>
       </w:hyperlink>
       <w:r>
@@ -29730,13 +29488,7 @@
           <w:rPr>
             <w:rStyle w:val="Hyperlink"/>
           </w:rPr>
-          <w:t xml:space="preserve"> </w:t>
-        </w:r>
-        <w:r>
-          <w:rPr>
-            <w:rStyle w:val="Hyperlink"/>
-          </w:rPr>
-          <w:t xml:space="preserve">2015, 21-22</w:t>
+          <w:t xml:space="preserve">, 2015, 21-22</w:t>
         </w:r>
       </w:hyperlink>
       <w:r>
@@ -29948,13 +29700,7 @@
           <w:rPr>
             <w:rStyle w:val="Hyperlink"/>
           </w:rPr>
-          <w:t xml:space="preserve"> </w:t>
-        </w:r>
-        <w:r>
-          <w:rPr>
-            <w:rStyle w:val="Hyperlink"/>
-          </w:rPr>
-          <w:t xml:space="preserve">1980b</w:t>
+          <w:t xml:space="preserve">, 1980b</w:t>
         </w:r>
       </w:hyperlink>
       <w:r>
@@ -30036,13 +29782,7 @@
           <w:rPr>
             <w:rStyle w:val="Hyperlink"/>
           </w:rPr>
-          <w:t xml:space="preserve"> </w:t>
-        </w:r>
-        <w:r>
-          <w:rPr>
-            <w:rStyle w:val="Hyperlink"/>
-          </w:rPr>
-          <w:t xml:space="preserve">2003</w:t>
+          <w:t xml:space="preserve">, 2003</w:t>
         </w:r>
       </w:hyperlink>
       <w:r>
@@ -30148,13 +29888,7 @@
           <w:rPr>
             <w:rStyle w:val="Hyperlink"/>
           </w:rPr>
-          <w:t xml:space="preserve"> </w:t>
-        </w:r>
-        <w:r>
-          <w:rPr>
-            <w:rStyle w:val="Hyperlink"/>
-          </w:rPr>
-          <w:t xml:space="preserve">2012</w:t>
+          <w:t xml:space="preserve">, 2012</w:t>
         </w:r>
       </w:hyperlink>
       <w:r>
@@ -30261,13 +29995,7 @@
           <w:rPr>
             <w:rStyle w:val="Hyperlink"/>
           </w:rPr>
-          <w:t xml:space="preserve"> </w:t>
-        </w:r>
-        <w:r>
-          <w:rPr>
-            <w:rStyle w:val="Hyperlink"/>
-          </w:rPr>
-          <w:t xml:space="preserve">1997</w:t>
+          <w:t xml:space="preserve">, 1997</w:t>
         </w:r>
       </w:hyperlink>
       <w:r>
@@ -31078,13 +30806,7 @@
           <w:rPr>
             <w:rStyle w:val="Hyperlink"/>
           </w:rPr>
-          <w:t xml:space="preserve"> </w:t>
-        </w:r>
-        <w:r>
-          <w:rPr>
-            <w:rStyle w:val="Hyperlink"/>
-          </w:rPr>
-          <w:t xml:space="preserve">1995, párr. 3.H</w:t>
+          <w:t xml:space="preserve">, 1995, párr. 3.H</w:t>
         </w:r>
       </w:hyperlink>
       <w:r>
@@ -31130,13 +30852,7 @@
           <w:rPr>
             <w:rStyle w:val="Hyperlink"/>
           </w:rPr>
-          <w:t xml:space="preserve"> </w:t>
-        </w:r>
-        <w:r>
-          <w:rPr>
-            <w:rStyle w:val="Hyperlink"/>
-          </w:rPr>
-          <w:t xml:space="preserve">2011</w:t>
+          <w:t xml:space="preserve">, 2011</w:t>
         </w:r>
       </w:hyperlink>
       <w:r>
@@ -31941,13 +31657,7 @@
           <w:rPr>
             <w:rStyle w:val="Hyperlink"/>
           </w:rPr>
-          <w:t xml:space="preserve"> </w:t>
-        </w:r>
-        <w:r>
-          <w:rPr>
-            <w:rStyle w:val="Hyperlink"/>
-          </w:rPr>
-          <w:t xml:space="preserve">1995</w:t>
+          <w:t xml:space="preserve">, 1995</w:t>
         </w:r>
       </w:hyperlink>
       <w:r>
@@ -32815,13 +32525,7 @@
           <w:rPr>
             <w:rStyle w:val="Hyperlink"/>
           </w:rPr>
-          <w:t xml:space="preserve"> </w:t>
-        </w:r>
-        <w:r>
-          <w:rPr>
-            <w:rStyle w:val="Hyperlink"/>
-          </w:rPr>
-          <w:t xml:space="preserve">1995, párr. 3.H</w:t>
+          <w:t xml:space="preserve">, 1995, párr. 3.H</w:t>
         </w:r>
       </w:hyperlink>
       <w:r>
@@ -33712,13 +33416,7 @@
           <w:rPr>
             <w:rStyle w:val="Hyperlink"/>
           </w:rPr>
-          <w:t xml:space="preserve"> </w:t>
-        </w:r>
-        <w:r>
-          <w:rPr>
-            <w:rStyle w:val="Hyperlink"/>
-          </w:rPr>
-          <w:t xml:space="preserve">1995, párr. 3.H</w:t>
+          <w:t xml:space="preserve">, 1995, párr. 3.H</w:t>
         </w:r>
       </w:hyperlink>
       <w:r>
@@ -33752,7 +33450,7 @@
           <wp:inline>
             <wp:extent cx="3211103" cy="2538301"/>
             <wp:effectExtent b="0" l="0" r="0" t="0"/>
-            <wp:docPr descr="" title="" id="156" name="Picture"/>
+            <wp:docPr descr="Gráfico 8.– Recuperación de la utilidad a partir de la función indirecta de utilidad" title="" id="156" name="Picture"/>
             <a:graphic>
               <a:graphicData uri="http://schemas.openxmlformats.org/drawingml/2006/picture">
                 <pic:pic>
@@ -34175,13 +33873,7 @@
           <w:rPr>
             <w:rStyle w:val="Hyperlink"/>
           </w:rPr>
-          <w:t xml:space="preserve"> </w:t>
-        </w:r>
-        <w:r>
-          <w:rPr>
-            <w:rStyle w:val="Hyperlink"/>
-          </w:rPr>
-          <w:t xml:space="preserve">1981</w:t>
+          <w:t xml:space="preserve">, 1981</w:t>
         </w:r>
       </w:hyperlink>
       <w:r>
@@ -35933,16 +35625,8 @@
         </m:r>
       </m:oMath>
       <w:r>
-        <w:t xml:space="preserve">).</w:t>
-      </w:r>
-      <m:oMath>
-        <m:r>
-          <m:rPr>
-            <m:sty m:val="p"/>
-          </m:rPr>
-          <m:t>◼</m:t>
-        </m:r>
-      </m:oMath>
+        <w:t xml:space="preserve">). ∎</w:t>
+      </w:r>
     </w:p>
     <w:p>
       <w:pPr>
@@ -37073,13 +36757,7 @@
           <w:rPr>
             <w:rStyle w:val="Hyperlink"/>
           </w:rPr>
-          <w:t xml:space="preserve"> </w:t>
-        </w:r>
-        <w:r>
-          <w:rPr>
-            <w:rStyle w:val="Hyperlink"/>
-          </w:rPr>
-          <w:t xml:space="preserve">1899</w:t>
+          <w:t xml:space="preserve">, 1899</w:t>
         </w:r>
       </w:hyperlink>
       <w:r>
@@ -40624,13 +40302,7 @@
           <w:rPr>
             <w:rStyle w:val="Hyperlink"/>
           </w:rPr>
-          <w:t xml:space="preserve"> </w:t>
-        </w:r>
-        <w:r>
-          <w:rPr>
-            <w:rStyle w:val="Hyperlink"/>
-          </w:rPr>
-          <w:t xml:space="preserve">s. f.</w:t>
+          <w:t xml:space="preserve">, s. f.</w:t>
         </w:r>
       </w:hyperlink>
       <w:r>
@@ -41342,7 +41014,7 @@
           <wp:inline>
             <wp:extent cx="2993971" cy="2256947"/>
             <wp:effectExtent b="0" l="0" r="0" t="0"/>
-            <wp:docPr descr="" title="" id="176" name="Picture"/>
+            <wp:docPr descr="Gráfico 9.– El problema de medir el bienestar: la bajada de p_1 lleva al consumidor a una curva de indiferencia más alta, pero ¿cuánto ha mejorado?" title="" id="176" name="Picture"/>
             <a:graphic>
               <a:graphicData uri="http://schemas.openxmlformats.org/drawingml/2006/picture">
                 <pic:pic>
@@ -41807,7 +41479,7 @@
           <wp:inline>
             <wp:extent cx="2984500" cy="1670809"/>
             <wp:effectExtent b="0" l="0" r="0" t="0"/>
-            <wp:docPr descr="" title="" id="182" name="Picture"/>
+            <wp:docPr descr="Gráfico 10.– Variación del excedente del consumidor ante una bajada de p_1: el área a la izquierda de la demanda marshalliana" title="" id="182" name="Picture"/>
             <a:graphic>
               <a:graphicData uri="http://schemas.openxmlformats.org/drawingml/2006/picture">
                 <pic:pic>
@@ -42389,13 +42061,7 @@
           <w:rPr>
             <w:rStyle w:val="Hyperlink"/>
           </w:rPr>
-          <w:t xml:space="preserve"> </w:t>
-        </w:r>
-        <w:r>
-          <w:rPr>
-            <w:rStyle w:val="Hyperlink"/>
-          </w:rPr>
-          <w:t xml:space="preserve">1957</w:t>
+          <w:t xml:space="preserve">, 1957</w:t>
         </w:r>
       </w:hyperlink>
       <w:r>
@@ -42416,13 +42082,7 @@
           <w:rPr>
             <w:rStyle w:val="Hyperlink"/>
           </w:rPr>
-          <w:t xml:space="preserve"> </w:t>
-        </w:r>
-        <w:r>
-          <w:rPr>
-            <w:rStyle w:val="Hyperlink"/>
-          </w:rPr>
-          <w:t xml:space="preserve">1974</w:t>
+          <w:t xml:space="preserve">, 1974</w:t>
         </w:r>
       </w:hyperlink>
       <w:r>
@@ -42487,13 +42147,7 @@
           <w:rPr>
             <w:rStyle w:val="Hyperlink"/>
           </w:rPr>
-          <w:t xml:space="preserve"> </w:t>
-        </w:r>
-        <w:r>
-          <w:rPr>
-            <w:rStyle w:val="Hyperlink"/>
-          </w:rPr>
-          <w:t xml:space="preserve">1995, párr. 3.I</w:t>
+          <w:t xml:space="preserve">, 1995, párr. 3.I</w:t>
         </w:r>
       </w:hyperlink>
       <w:r>
@@ -44025,7 +43679,7 @@
           <wp:inline>
             <wp:extent cx="3282950" cy="3862134"/>
             <wp:effectExtent b="0" l="0" r="0" t="0"/>
-            <wp:docPr descr="" title="" id="190" name="Picture"/>
+            <wp:docPr descr="Gráfico 11.– Variación compensatoria ante una bajada de p_1: a los precios finales, la renta que devuelve al consumidor a \overline{U}^0" title="" id="190" name="Picture"/>
             <a:graphic>
               <a:graphicData uri="http://schemas.openxmlformats.org/drawingml/2006/picture">
                 <pic:pic>
@@ -45073,7 +44727,7 @@
           <wp:inline>
             <wp:extent cx="3282950" cy="3865321"/>
             <wp:effectExtent b="0" l="0" r="0" t="0"/>
-            <wp:docPr descr="" title="" id="195" name="Picture"/>
+            <wp:docPr descr="Gráfico 12.– Variación equivalente ante una bajada de p_1: a los precios iniciales, la renta que lleva al consumidor a \overline{U}^1" title="" id="195" name="Picture"/>
             <a:graphic>
               <a:graphicData uri="http://schemas.openxmlformats.org/drawingml/2006/picture">
                 <pic:pic>
@@ -45376,7 +45030,7 @@
           <wp:inline>
             <wp:extent cx="3700780" cy="4191280"/>
             <wp:effectExtent b="0" l="0" r="0" t="0"/>
-            <wp:docPr descr="" title="" id="200" name="Picture"/>
+            <wp:docPr descr="Gráfico 13.– Variación compensatoria, variación del excedente del consumidor y variación equivalente ante una bajada del precio de un bien normal" title="" id="200" name="Picture"/>
             <a:graphic>
               <a:graphicData uri="http://schemas.openxmlformats.org/drawingml/2006/picture">
                 <pic:pic>
@@ -45526,13 +45180,7 @@
           <w:rPr>
             <w:rStyle w:val="Hyperlink"/>
           </w:rPr>
-          <w:t xml:space="preserve"> </w:t>
-        </w:r>
-        <w:r>
-          <w:rPr>
-            <w:rStyle w:val="Hyperlink"/>
-          </w:rPr>
-          <w:t xml:space="preserve">1976</w:t>
+          <w:t xml:space="preserve">, 1976</w:t>
         </w:r>
       </w:hyperlink>
       <w:r>
@@ -46206,13 +45854,7 @@
           <w:rPr>
             <w:rStyle w:val="Hyperlink"/>
           </w:rPr>
-          <w:t xml:space="preserve"> </w:t>
-        </w:r>
-        <w:r>
-          <w:rPr>
-            <w:rStyle w:val="Hyperlink"/>
-          </w:rPr>
-          <w:t xml:space="preserve">1995, párr. 3.I</w:t>
+          <w:t xml:space="preserve">, 1995, párr. 3.I</w:t>
         </w:r>
       </w:hyperlink>
       <w:r>
@@ -46471,13 +46113,7 @@
           <w:rPr>
             <w:rStyle w:val="Hyperlink"/>
           </w:rPr>
-          <w:t xml:space="preserve"> </w:t>
-        </w:r>
-        <w:r>
-          <w:rPr>
-            <w:rStyle w:val="Hyperlink"/>
-          </w:rPr>
-          <w:t xml:space="preserve">1995, párr. 3.I</w:t>
+          <w:t xml:space="preserve">, 1995, párr. 3.I</w:t>
         </w:r>
       </w:hyperlink>
       <w:r>
@@ -47460,18 +47096,7 @@
         </m:d>
       </m:oMath>
       <w:r>
-        <w:t xml:space="preserve">.</w:t>
-      </w:r>
-      <m:oMath>
-        <m:r>
-          <m:rPr>
-            <m:sty m:val="p"/>
-          </m:rPr>
-          <m:t>◼</m:t>
-        </m:r>
-      </m:oMath>
-      <w:r>
-        <w:t xml:space="preserve">La diferencia es el</w:t>
+        <w:t xml:space="preserve">. ∎La diferencia es el</w:t>
       </w:r>
       <w:r>
         <w:t xml:space="preserve"> </w:t>
@@ -47643,13 +47268,7 @@
           <w:rPr>
             <w:rStyle w:val="Hyperlink"/>
           </w:rPr>
-          <w:t xml:space="preserve"> </w:t>
-        </w:r>
-        <w:r>
-          <w:rPr>
-            <w:rStyle w:val="Hyperlink"/>
-          </w:rPr>
-          <w:t xml:space="preserve">2015</w:t>
+          <w:t xml:space="preserve">, 2015</w:t>
         </w:r>
       </w:hyperlink>
       <w:r>
@@ -47718,13 +47337,7 @@
           <w:rPr>
             <w:rStyle w:val="Hyperlink"/>
           </w:rPr>
-          <w:t xml:space="preserve"> </w:t>
-        </w:r>
-        <w:r>
-          <w:rPr>
-            <w:rStyle w:val="Hyperlink"/>
-          </w:rPr>
-          <w:t xml:space="preserve">1939</w:t>
+          <w:t xml:space="preserve">, 1939</w:t>
         </w:r>
       </w:hyperlink>
       <w:r>
@@ -48292,13 +47905,7 @@
           <w:rPr>
             <w:rStyle w:val="Hyperlink"/>
           </w:rPr>
-          <w:t xml:space="preserve"> </w:t>
-        </w:r>
-        <w:r>
-          <w:rPr>
-            <w:rStyle w:val="Hyperlink"/>
-          </w:rPr>
-          <w:t xml:space="preserve">1871</w:t>
+          <w:t xml:space="preserve">, 1871</w:t>
         </w:r>
       </w:hyperlink>
       <w:r>
@@ -48319,13 +47926,7 @@
           <w:rPr>
             <w:rStyle w:val="Hyperlink"/>
           </w:rPr>
-          <w:t xml:space="preserve"> </w:t>
-        </w:r>
-        <w:r>
-          <w:rPr>
-            <w:rStyle w:val="Hyperlink"/>
-          </w:rPr>
-          <w:t xml:space="preserve">1874</w:t>
+          <w:t xml:space="preserve">, 1874</w:t>
         </w:r>
       </w:hyperlink>
       <w:r>
@@ -49609,7 +49210,7 @@
           <wp:inline>
             <wp:extent cx="3581400" cy="1982175"/>
             <wp:effectExtent b="0" l="0" r="0" t="0"/>
-            <wp:docPr descr="" title="" id="213" name="Picture"/>
+            <wp:docPr descr="Gráfico 14.– Índice verdadero de coste de la vida (Konüs) frente al índice de Laspeyres: el sesgo de sustitución" title="" id="213" name="Picture"/>
             <a:graphic>
               <a:graphicData uri="http://schemas.openxmlformats.org/drawingml/2006/picture">
                 <pic:pic>
@@ -50130,7 +49731,7 @@
           <w:rPr>
             <w:rStyle w:val="Hyperlink"/>
           </w:rPr>
-          <w:t xml:space="preserve">et al. 1996</w:t>
+          <w:t xml:space="preserve">et al., 1996</w:t>
         </w:r>
       </w:hyperlink>
       <w:r>
@@ -50151,13 +49752,7 @@
           <w:rPr>
             <w:rStyle w:val="Hyperlink"/>
           </w:rPr>
-          <w:t xml:space="preserve"> </w:t>
-        </w:r>
-        <w:r>
-          <w:rPr>
-            <w:rStyle w:val="Hyperlink"/>
-          </w:rPr>
-          <w:t xml:space="preserve">2006</w:t>
+          <w:t xml:space="preserve">, 2006</w:t>
         </w:r>
       </w:hyperlink>
       <w:r>
@@ -50283,13 +49878,7 @@
           <w:rPr>
             <w:rStyle w:val="Hyperlink"/>
           </w:rPr>
-          <w:t xml:space="preserve"> </w:t>
-        </w:r>
-        <w:r>
-          <w:rPr>
-            <w:rStyle w:val="Hyperlink"/>
-          </w:rPr>
-          <w:t xml:space="preserve">2026</w:t>
+          <w:t xml:space="preserve">, 2026</w:t>
         </w:r>
       </w:hyperlink>
       <w:r>
@@ -50310,13 +49899,7 @@
           <w:rPr>
             <w:rStyle w:val="Hyperlink"/>
           </w:rPr>
-          <w:t xml:space="preserve"> </w:t>
-        </w:r>
-        <w:r>
-          <w:rPr>
-            <w:rStyle w:val="Hyperlink"/>
-          </w:rPr>
-          <w:t xml:space="preserve">2021</w:t>
+          <w:t xml:space="preserve">, 2021</w:t>
         </w:r>
       </w:hyperlink>
       <w:r>
@@ -50775,13 +50358,7 @@
           <w:rPr>
             <w:rStyle w:val="Hyperlink"/>
           </w:rPr>
-          <w:t xml:space="preserve"> </w:t>
-        </w:r>
-        <w:r>
-          <w:rPr>
-            <w:rStyle w:val="Hyperlink"/>
-          </w:rPr>
-          <w:t xml:space="preserve">2026b, 5, 8</w:t>
+          <w:t xml:space="preserve">, 2026b, 5, 8</w:t>
         </w:r>
       </w:hyperlink>
       <w:r>
@@ -50811,13 +50388,7 @@
           <w:rPr>
             <w:rStyle w:val="Hyperlink"/>
           </w:rPr>
-          <w:t xml:space="preserve"> </w:t>
-        </w:r>
-        <w:r>
-          <w:rPr>
-            <w:rStyle w:val="Hyperlink"/>
-          </w:rPr>
-          <w:t xml:space="preserve">2026a</w:t>
+          <w:t xml:space="preserve">, 2026a</w:t>
         </w:r>
       </w:hyperlink>
       <w:r>
@@ -51347,13 +50918,7 @@
           <w:rPr>
             <w:rStyle w:val="Hyperlink"/>
           </w:rPr>
-          <w:t xml:space="preserve"> </w:t>
-        </w:r>
-        <w:r>
-          <w:rPr>
-            <w:rStyle w:val="Hyperlink"/>
-          </w:rPr>
-          <w:t xml:space="preserve">2013</w:t>
+          <w:t xml:space="preserve">, 2013</w:t>
         </w:r>
       </w:hyperlink>
       <w:r>
@@ -51380,13 +50945,7 @@
           <w:rPr>
             <w:rStyle w:val="Hyperlink"/>
           </w:rPr>
-          <w:t xml:space="preserve"> </w:t>
-        </w:r>
-        <w:r>
-          <w:rPr>
-            <w:rStyle w:val="Hyperlink"/>
-          </w:rPr>
-          <w:t xml:space="preserve">2026e</w:t>
+          <w:t xml:space="preserve">, 2026e</w:t>
         </w:r>
       </w:hyperlink>
       <w:r>
@@ -55944,7 +55503,7 @@
           <w:rPr>
             <w:rStyle w:val="Hyperlink"/>
           </w:rPr>
-          <w:t xml:space="preserve">et al. 2008, cap. 3</w:t>
+          <w:t xml:space="preserve">et al., 2008, cap. 3</w:t>
         </w:r>
       </w:hyperlink>
       <w:r>
@@ -56752,16 +56311,8 @@
         <w:t xml:space="preserve"> </w:t>
       </w:r>
       <w:r>
-        <w:t xml:space="preserve">en utilidad.</w:t>
-      </w:r>
-      <m:oMath>
-        <m:r>
-          <m:rPr>
-            <m:sty m:val="p"/>
-          </m:rPr>
-          <m:t>◼</m:t>
-        </m:r>
-      </m:oMath>
+        <w:t xml:space="preserve">en utilidad. ∎</w:t>
+      </w:r>
     </w:p>
     <w:p>
       <w:pPr>
@@ -57524,29 +57075,15 @@
           <w:rPr>
             <w:rStyle w:val="Hyperlink"/>
           </w:rPr>
-          <w:t xml:space="preserve"> </w:t>
-        </w:r>
-        <w:r>
-          <w:rPr>
-            <w:rStyle w:val="Hyperlink"/>
-          </w:rPr>
-          <w:t xml:space="preserve">1995</w:t>
+          <w:t xml:space="preserve">, 1995</w:t>
         </w:r>
       </w:hyperlink>
       <w:r>
         <w:t xml:space="preserve">, prop. 3.G.4)</w:t>
       </w:r>
       <w:r>
-        <w:t xml:space="preserve">.</w:t>
-      </w:r>
-      <m:oMath>
-        <m:r>
-          <m:rPr>
-            <m:sty m:val="p"/>
-          </m:rPr>
-          <m:t>◼</m:t>
-        </m:r>
-      </m:oMath>
+        <w:t xml:space="preserve">. ∎</w:t>
+      </w:r>
     </w:p>
     <w:bookmarkEnd w:id="227"/>
     <w:bookmarkStart w:id="228" w:name="der_shephard"/>
@@ -58142,14 +57679,9 @@
           <w:numId w:val="1000"/>
         </w:numPr>
       </w:pPr>
-      <m:oMath>
-        <m:r>
-          <m:rPr>
-            <m:sty m:val="p"/>
-          </m:rPr>
-          <m:t>◼</m:t>
-        </m:r>
-      </m:oMath>
+      <w:r>
+        <w:t xml:space="preserve"> ∎</w:t>
+      </w:r>
     </w:p>
     <w:p>
       <w:pPr>
@@ -58749,29 +58281,15 @@
           <w:rPr>
             <w:rStyle w:val="Hyperlink"/>
           </w:rPr>
-          <w:t xml:space="preserve"> </w:t>
-        </w:r>
-        <w:r>
-          <w:rPr>
-            <w:rStyle w:val="Hyperlink"/>
-          </w:rPr>
-          <w:t xml:space="preserve">1995</w:t>
+          <w:t xml:space="preserve">, 1995</w:t>
         </w:r>
       </w:hyperlink>
       <w:r>
         <w:t xml:space="preserve">, prop. 3.G.1)</w:t>
       </w:r>
       <w:r>
-        <w:t xml:space="preserve">.</w:t>
-      </w:r>
-      <m:oMath>
-        <m:r>
-          <m:rPr>
-            <m:sty m:val="p"/>
-          </m:rPr>
-          <m:t>◼</m:t>
-        </m:r>
-      </m:oMath>
+        <w:t xml:space="preserve">. ∎</w:t>
+      </w:r>
     </w:p>
     <w:p>
       <w:pPr>
@@ -59720,7 +59238,7 @@
           <w:rPr>
             <w:rStyle w:val="Hyperlink"/>
           </w:rPr>
-          <w:t xml:space="preserve">et al. 2008, cap. 1</w:t>
+          <w:t xml:space="preserve">et al., 2008, cap. 1</w:t>
         </w:r>
       </w:hyperlink>
       <w:r>
@@ -59991,13 +59509,7 @@
           <w:rPr>
             <w:rStyle w:val="Hyperlink"/>
           </w:rPr>
-          <w:t xml:space="preserve"> </w:t>
-        </w:r>
-        <w:r>
-          <w:rPr>
-            <w:rStyle w:val="Hyperlink"/>
-          </w:rPr>
-          <w:t xml:space="preserve">1961</w:t>
+          <w:t xml:space="preserve">, 1961</w:t>
         </w:r>
       </w:hyperlink>
       <w:r>
@@ -60654,16 +60166,8 @@
         </m:r>
       </m:oMath>
       <w:r>
-        <w:t xml:space="preserve">.</w:t>
-      </w:r>
-      <m:oMath>
-        <m:r>
-          <m:rPr>
-            <m:sty m:val="p"/>
-          </m:rPr>
-          <m:t>◼</m:t>
-        </m:r>
-      </m:oMath>
+        <w:t xml:space="preserve">. ∎</w:t>
+      </w:r>
     </w:p>
     <w:p>
       <w:pPr>
@@ -60911,16 +60415,8 @@
         </m:r>
       </m:oMath>
       <w:r>
-        <w:t xml:space="preserve">.</w:t>
-      </w:r>
-      <m:oMath>
-        <m:r>
-          <m:rPr>
-            <m:sty m:val="p"/>
-          </m:rPr>
-          <m:t>◼</m:t>
-        </m:r>
-      </m:oMath>
+        <w:t xml:space="preserve">. ∎</w:t>
+      </w:r>
     </w:p>
     <w:p>
       <w:pPr>
@@ -61476,16 +60972,8 @@
         </m:r>
       </m:oMath>
       <w:r>
-        <w:t xml:space="preserve">. Para un bien inferior, las desigualdades se invierten.</w:t>
-      </w:r>
-      <m:oMath>
-        <m:r>
-          <m:rPr>
-            <m:sty m:val="p"/>
-          </m:rPr>
-          <m:t>◼</m:t>
-        </m:r>
-      </m:oMath>
+        <w:t xml:space="preserve">. Para un bien inferior, las desigualdades se invierten. ∎</w:t>
+      </w:r>
     </w:p>
     <w:p>
       <w:pPr>
@@ -61781,16 +61269,8 @@
         </m:r>
       </m:oMath>
       <w:r>
-        <w:t xml:space="preserve">.</w:t>
-      </w:r>
-      <m:oMath>
-        <m:r>
-          <m:rPr>
-            <m:sty m:val="p"/>
-          </m:rPr>
-          <m:t>◼</m:t>
-        </m:r>
-      </m:oMath>
+        <w:t xml:space="preserve">. ∎</w:t>
+      </w:r>
     </w:p>
     <w:p>
       <w:pPr>
@@ -64227,16 +63707,8 @@
         </w:r>
       </w:hyperlink>
       <w:r>
-        <w:t xml:space="preserve">); del mismo modo para la VE.</w:t>
-      </w:r>
-      <m:oMath>
-        <m:r>
-          <m:rPr>
-            <m:sty m:val="p"/>
-          </m:rPr>
-          <m:t>◼</m:t>
-        </m:r>
-      </m:oMath>
+        <w:t xml:space="preserve">); del mismo modo para la VE. ∎</w:t>
+      </w:r>
     </w:p>
     <w:p>
       <w:pPr>
@@ -65377,7 +64849,7 @@
       </w:pPr>
     </w:p>
     <w:bookmarkEnd w:id="235"/>
-    <w:bookmarkStart w:id="370" w:name="bibliography"/>
+    <w:bookmarkStart w:id="370" w:name="bibliografia"/>
     <w:p>
       <w:pPr>
         <w:pStyle w:val="Heading1"/>
@@ -65393,7 +64865,7 @@
         <w:pStyle w:val="Bibliography"/>
       </w:pPr>
       <w:r>
-        <w:t xml:space="preserve">Afriat, Sydney N. 1967.</w:t>
+        <w:t xml:space="preserve">Afriat, Sydney N. (1967).</w:t>
       </w:r>
       <w:r>
         <w:t xml:space="preserve"> </w:t>
@@ -65442,7 +64914,7 @@
         <w:pStyle w:val="Bibliography"/>
       </w:pPr>
       <w:r>
-        <w:t xml:space="preserve">Aguilar García, Eduardo y Carolina Mateos Bustamante. 2015.</w:t>
+        <w:t xml:space="preserve">Aguilar García, Eduardo y Carolina Mateos Bustamante (2015).</w:t>
       </w:r>
       <w:r>
         <w:t xml:space="preserve"> </w:t>
@@ -65488,7 +64960,7 @@
         <w:pStyle w:val="Bibliography"/>
       </w:pPr>
       <w:r>
-        <w:t xml:space="preserve">Antonelli, Giovanni Battista. 1886.</w:t>
+        <w:t xml:space="preserve">Antonelli, Giovanni Battista (1886).</w:t>
       </w:r>
       <w:r>
         <w:t xml:space="preserve"> </w:t>
@@ -65511,7 +64983,7 @@
         <w:pStyle w:val="Bibliography"/>
       </w:pPr>
       <w:r>
-        <w:t xml:space="preserve">Arrow, Kenneth J. y Alain C. Enthoven. 1961.</w:t>
+        <w:t xml:space="preserve">Arrow, Kenneth J. y Alain C. Enthoven (1961).</w:t>
       </w:r>
       <w:r>
         <w:t xml:space="preserve"> </w:t>
@@ -65546,7 +65018,7 @@
         <w:pStyle w:val="Bibliography"/>
       </w:pPr>
       <w:r>
-        <w:t xml:space="preserve">Banks, James, Richard Blundell y Arthur Lewbel. 1997.</w:t>
+        <w:t xml:space="preserve">Banks, James, Richard Blundell y Arthur Lewbel (1997).</w:t>
       </w:r>
       <w:r>
         <w:t xml:space="preserve"> </w:t>
@@ -65595,7 +65067,7 @@
         <w:pStyle w:val="Bibliography"/>
       </w:pPr>
       <w:r>
-        <w:t xml:space="preserve">Barten, Anton P. 1964.</w:t>
+        <w:t xml:space="preserve">Barten, Anton P. (1964).</w:t>
       </w:r>
       <w:r>
         <w:t xml:space="preserve"> </w:t>
@@ -65644,7 +65116,7 @@
         <w:pStyle w:val="Bibliography"/>
       </w:pPr>
       <w:r>
-        <w:t xml:space="preserve">———. 1967.</w:t>
+        <w:t xml:space="preserve">Barten, Anton P. (1967).</w:t>
       </w:r>
       <w:r>
         <w:t xml:space="preserve"> </w:t>
@@ -65693,7 +65165,7 @@
         <w:pStyle w:val="Bibliography"/>
       </w:pPr>
       <w:r>
-        <w:t xml:space="preserve">———. 1969.</w:t>
+        <w:t xml:space="preserve">Barten, Anton P. (1969).</w:t>
       </w:r>
       <w:r>
         <w:t xml:space="preserve"> </w:t>
@@ -65742,7 +65214,7 @@
         <w:pStyle w:val="Bibliography"/>
       </w:pPr>
       <w:r>
-        <w:t xml:space="preserve">Blume, Lawrence E. 2008.</w:t>
+        <w:t xml:space="preserve">Blume, Lawrence E. (2008).</w:t>
       </w:r>
       <w:r>
         <w:t xml:space="preserve"> </w:t>
@@ -65788,7 +65260,7 @@
         <w:pStyle w:val="Bibliography"/>
       </w:pPr>
       <w:r>
-        <w:t xml:space="preserve">Blundell, Richard, Martin Browning y Ian Crawford. 2003.</w:t>
+        <w:t xml:space="preserve">Blundell, Richard, Martin Browning y Ian Crawford (2003).</w:t>
       </w:r>
       <w:r>
         <w:t xml:space="preserve"> </w:t>
@@ -65849,7 +65321,7 @@
         <w:pStyle w:val="Bibliography"/>
       </w:pPr>
       <w:r>
-        <w:t xml:space="preserve">Boskin, Michael J., Ellen R. Dulberger, Robert J. Gordon, Zvi Griliches y Dale W. Jorgenson. 1996.</w:t>
+        <w:t xml:space="preserve">Boskin, Michael J., Ellen R. Dulberger, Robert J. Gordon, Zvi Griliches y Dale W. Jorgenson (1996).</w:t>
       </w:r>
       <w:r>
         <w:t xml:space="preserve"> </w:t>
@@ -65868,7 +65340,7 @@
         <w:pStyle w:val="Bibliography"/>
       </w:pPr>
       <w:r>
-        <w:t xml:space="preserve">Christensen, Laurits R., Dale W. Jorgenson y Lawrence J. Lau. 1975.</w:t>
+        <w:t xml:space="preserve">Christensen, Laurits R., Dale W. Jorgenson y Lawrence J. Lau (1975).</w:t>
       </w:r>
       <w:r>
         <w:t xml:space="preserve"> </w:t>
@@ -65903,7 +65375,7 @@
         <w:pStyle w:val="Bibliography"/>
       </w:pPr>
       <w:r>
-        <w:t xml:space="preserve">Cobb, Charles W. y Paul H. Douglas. 1928.</w:t>
+        <w:t xml:space="preserve">Cobb, Charles W. y Paul H. Douglas (1928).</w:t>
       </w:r>
       <w:r>
         <w:t xml:space="preserve"> </w:t>
@@ -65938,7 +65410,7 @@
         <w:pStyle w:val="Bibliography"/>
       </w:pPr>
       <w:r>
-        <w:t xml:space="preserve">Deaton, Angus. 1974.</w:t>
+        <w:t xml:space="preserve">Deaton, Angus (1974).</w:t>
       </w:r>
       <w:r>
         <w:t xml:space="preserve"> </w:t>
@@ -65987,7 +65459,7 @@
         <w:pStyle w:val="Bibliography"/>
       </w:pPr>
       <w:r>
-        <w:t xml:space="preserve">———. 1997.</w:t>
+        <w:t xml:space="preserve">Deaton, Angus (1997).</w:t>
       </w:r>
       <w:r>
         <w:t xml:space="preserve"> </w:t>
@@ -66024,7 +65496,7 @@
         <w:pStyle w:val="Bibliography"/>
       </w:pPr>
       <w:r>
-        <w:t xml:space="preserve">Deaton, Angus y John Muellbauer. 1980a.</w:t>
+        <w:t xml:space="preserve">Deaton, Angus y John Muellbauer (1980a).</w:t>
       </w:r>
       <w:r>
         <w:t xml:space="preserve"> </w:t>
@@ -66059,7 +65531,7 @@
         <w:pStyle w:val="Bibliography"/>
       </w:pPr>
       <w:r>
-        <w:t xml:space="preserve">———. 1980b.</w:t>
+        <w:t xml:space="preserve">Deaton, Angus y John Muellbauer (1980b).</w:t>
       </w:r>
       <w:r>
         <w:t xml:space="preserve"> </w:t>
@@ -66082,7 +65554,7 @@
         <w:pStyle w:val="Bibliography"/>
       </w:pPr>
       <w:r>
-        <w:t xml:space="preserve">Diewert, W. Erwin. 1974.</w:t>
+        <w:t xml:space="preserve">Diewert, W. Erwin (1974).</w:t>
       </w:r>
       <w:r>
         <w:t xml:space="preserve"> </w:t>
@@ -66114,7 +65586,7 @@
         <w:pStyle w:val="Bibliography"/>
       </w:pPr>
       <w:r>
-        <w:t xml:space="preserve">———. 1976.</w:t>
+        <w:t xml:space="preserve">Diewert, W. Erwin (1976).</w:t>
       </w:r>
       <w:r>
         <w:t xml:space="preserve"> </w:t>
@@ -66163,7 +65635,7 @@
         <w:pStyle w:val="Bibliography"/>
       </w:pPr>
       <w:r>
-        <w:t xml:space="preserve">Douglas, Paul H. 1976.</w:t>
+        <w:t xml:space="preserve">Douglas, Paul H. (1976).</w:t>
       </w:r>
       <w:r>
         <w:t xml:space="preserve"> </w:t>
@@ -66212,7 +65684,7 @@
         <w:pStyle w:val="Bibliography"/>
       </w:pPr>
       <w:r>
-        <w:t xml:space="preserve">Dupuit, Jules. 1844.</w:t>
+        <w:t xml:space="preserve">Dupuit, Jules (1844).</w:t>
       </w:r>
       <w:r>
         <w:t xml:space="preserve"> </w:t>
@@ -66244,7 +65716,7 @@
         <w:pStyle w:val="Bibliography"/>
       </w:pPr>
       <w:r>
-        <w:t xml:space="preserve">Geary, Roy C. 1950.</w:t>
+        <w:t xml:space="preserve">Geary, Roy C. (1950).</w:t>
       </w:r>
       <w:r>
         <w:t xml:space="preserve"> </w:t>
@@ -66293,7 +65765,7 @@
         <w:pStyle w:val="Bibliography"/>
       </w:pPr>
       <w:r>
-        <w:t xml:space="preserve">Gordon, Robert J. 2006.</w:t>
+        <w:t xml:space="preserve">Gordon, Robert J. (2006).</w:t>
       </w:r>
       <w:r>
         <w:t xml:space="preserve"> </w:t>
@@ -66326,7 +65798,7 @@
         <w:pStyle w:val="Bibliography"/>
       </w:pPr>
       <w:r>
-        <w:t xml:space="preserve">Gorman, William M. 1959.</w:t>
+        <w:t xml:space="preserve">Gorman, William M. (1959).</w:t>
       </w:r>
       <w:r>
         <w:t xml:space="preserve"> </w:t>
@@ -66375,7 +65847,7 @@
         <w:pStyle w:val="Bibliography"/>
       </w:pPr>
       <w:r>
-        <w:t xml:space="preserve">———. 1981.</w:t>
+        <w:t xml:space="preserve">Gorman, William M. (1981).</w:t>
       </w:r>
       <w:r>
         <w:t xml:space="preserve"> </w:t>
@@ -66433,7 +65905,7 @@
         <w:pStyle w:val="Bibliography"/>
       </w:pPr>
       <w:r>
-        <w:t xml:space="preserve">Hausman, Jerry A. 1981.</w:t>
+        <w:t xml:space="preserve">Hausman, Jerry A. (1981).</w:t>
       </w:r>
       <w:r>
         <w:t xml:space="preserve"> </w:t>
@@ -66468,7 +65940,7 @@
         <w:pStyle w:val="Bibliography"/>
       </w:pPr>
       <w:r>
-        <w:t xml:space="preserve">Hicks, John R. 1939.</w:t>
+        <w:t xml:space="preserve">Hicks, John R. (1939).</w:t>
       </w:r>
       <w:r>
         <w:t xml:space="preserve"> </w:t>
@@ -66491,7 +65963,7 @@
         <w:pStyle w:val="Bibliography"/>
       </w:pPr>
       <w:r>
-        <w:t xml:space="preserve">———. 1941.</w:t>
+        <w:t xml:space="preserve">Hicks, John R. (1941).</w:t>
       </w:r>
       <w:r>
         <w:t xml:space="preserve"> </w:t>
@@ -66540,7 +66012,7 @@
         <w:pStyle w:val="Bibliography"/>
       </w:pPr>
       <w:r>
-        <w:t xml:space="preserve">———. 1943.</w:t>
+        <w:t xml:space="preserve">Hicks, John R. (1943).</w:t>
       </w:r>
       <w:r>
         <w:t xml:space="preserve"> </w:t>
@@ -66589,7 +66061,7 @@
         <w:pStyle w:val="Bibliography"/>
       </w:pPr>
       <w:r>
-        <w:t xml:space="preserve">———. 1956.</w:t>
+        <w:t xml:space="preserve">Hicks, John R. (1956).</w:t>
       </w:r>
       <w:r>
         <w:t xml:space="preserve"> </w:t>
@@ -66612,7 +66084,7 @@
         <w:pStyle w:val="Bibliography"/>
       </w:pPr>
       <w:r>
-        <w:t xml:space="preserve">Hicks, John R. y Roy G. D. Allen. 1934.</w:t>
+        <w:t xml:space="preserve">Hicks, John R. y Roy G. D. Allen (1934).</w:t>
       </w:r>
       <w:r>
         <w:t xml:space="preserve"> </w:t>
@@ -66661,7 +66133,7 @@
         <w:pStyle w:val="Bibliography"/>
       </w:pPr>
       <w:r>
-        <w:t xml:space="preserve">Hotelling, Harold. 1932.</w:t>
+        <w:t xml:space="preserve">Hotelling, Harold (1932).</w:t>
       </w:r>
       <w:r>
         <w:t xml:space="preserve"> </w:t>
@@ -66710,7 +66182,7 @@
         <w:pStyle w:val="Bibliography"/>
       </w:pPr>
       <w:r>
-        <w:t xml:space="preserve">Houthakker, Hendrik S. 1950.</w:t>
+        <w:t xml:space="preserve">Houthakker, Hendrik S. (1950).</w:t>
       </w:r>
       <w:r>
         <w:t xml:space="preserve"> </w:t>
@@ -66759,7 +66231,7 @@
         <w:pStyle w:val="Bibliography"/>
       </w:pPr>
       <w:r>
-        <w:t xml:space="preserve">Hurwicz, Leonid y Hirofumi Uzawa. 1971.</w:t>
+        <w:t xml:space="preserve">Hurwicz, Leonid y Hirofumi Uzawa (1971).</w:t>
       </w:r>
       <w:r>
         <w:t xml:space="preserve"> </w:t>
@@ -66791,7 +66263,7 @@
         <w:pStyle w:val="Bibliography"/>
       </w:pPr>
       <w:r>
-        <w:t xml:space="preserve">Instituto Nacional de Estadística. 2008.</w:t>
+        <w:t xml:space="preserve">Instituto Nacional de Estadística (2008).</w:t>
       </w:r>
       <w:r>
         <w:t xml:space="preserve"> </w:t>
@@ -66824,7 +66296,7 @@
         <w:pStyle w:val="Bibliography"/>
       </w:pPr>
       <w:r>
-        <w:t xml:space="preserve">———. 2026a.</w:t>
+        <w:t xml:space="preserve">Instituto Nacional de Estadística (2026a).</w:t>
       </w:r>
       <w:r>
         <w:t xml:space="preserve"> </w:t>
@@ -66857,7 +66329,7 @@
         <w:pStyle w:val="Bibliography"/>
       </w:pPr>
       <w:r>
-        <w:t xml:space="preserve">———. 2026b.</w:t>
+        <w:t xml:space="preserve">Instituto Nacional de Estadística (2026b).</w:t>
       </w:r>
       <w:r>
         <w:t xml:space="preserve"> </w:t>
@@ -66890,7 +66362,7 @@
         <w:pStyle w:val="Bibliography"/>
       </w:pPr>
       <w:r>
-        <w:t xml:space="preserve">———. 2026c.</w:t>
+        <w:t xml:space="preserve">Instituto Nacional de Estadística (2026c).</w:t>
       </w:r>
       <w:r>
         <w:t xml:space="preserve"> </w:t>
@@ -66923,7 +66395,7 @@
         <w:pStyle w:val="Bibliography"/>
       </w:pPr>
       <w:r>
-        <w:t xml:space="preserve">———. 2026d.</w:t>
+        <w:t xml:space="preserve">Instituto Nacional de Estadística (2026d).</w:t>
       </w:r>
       <w:r>
         <w:t xml:space="preserve"> </w:t>
@@ -66956,7 +66428,7 @@
         <w:pStyle w:val="Bibliography"/>
       </w:pPr>
       <w:r>
-        <w:t xml:space="preserve">———. 2026e.</w:t>
+        <w:t xml:space="preserve">Instituto Nacional de Estadística (2026e).</w:t>
       </w:r>
       <w:r>
         <w:t xml:space="preserve"> </w:t>
@@ -66989,7 +66461,7 @@
         <w:pStyle w:val="Bibliography"/>
       </w:pPr>
       <w:r>
-        <w:t xml:space="preserve">———. s. f.</w:t>
+        <w:t xml:space="preserve">Instituto Nacional de Estadística (s. f.).</w:t>
       </w:r>
       <w:r>
         <w:t xml:space="preserve"> </w:t>
@@ -67022,7 +66494,7 @@
         <w:pStyle w:val="Bibliography"/>
       </w:pPr>
       <w:r>
-        <w:t xml:space="preserve">Jehle, Geoffrey A. y Philip J. Reny. 2011.</w:t>
+        <w:t xml:space="preserve">Jehle, Geoffrey A. y Philip J. Reny (2011).</w:t>
       </w:r>
       <w:r>
         <w:t xml:space="preserve"> </w:t>
@@ -67045,7 +66517,7 @@
         <w:pStyle w:val="Bibliography"/>
       </w:pPr>
       <w:r>
-        <w:t xml:space="preserve">Kihlstrom, Richard, Andreu Mas-Colell y Hugo Sonnenschein. 1976.</w:t>
+        <w:t xml:space="preserve">Kihlstrom, Richard, Andreu Mas-Colell y Hugo Sonnenschein (1976).</w:t>
       </w:r>
       <w:r>
         <w:t xml:space="preserve"> </w:t>
@@ -67094,7 +66566,7 @@
         <w:pStyle w:val="Bibliography"/>
       </w:pPr>
       <w:r>
-        <w:t xml:space="preserve">Klein, Lawrence R. y Herman Rubin. 1947.</w:t>
+        <w:t xml:space="preserve">Klein, Lawrence R. y Herman Rubin (1947).</w:t>
       </w:r>
       <w:r>
         <w:t xml:space="preserve"> </w:t>
@@ -67143,7 +66615,7 @@
         <w:pStyle w:val="Bibliography"/>
       </w:pPr>
       <w:r>
-        <w:t xml:space="preserve">Klick, Joshua. 2021.</w:t>
+        <w:t xml:space="preserve">Klick, Joshua (2021).</w:t>
       </w:r>
       <w:r>
         <w:t xml:space="preserve"> </w:t>
@@ -67189,7 +66661,7 @@
         <w:pStyle w:val="Bibliography"/>
       </w:pPr>
       <w:r>
-        <w:t xml:space="preserve">Konüs, Alexander A. 1939.</w:t>
+        <w:t xml:space="preserve">Konüs, Alexander A. (1939).</w:t>
       </w:r>
       <w:r>
         <w:t xml:space="preserve"> </w:t>
@@ -67238,7 +66710,7 @@
         <w:pStyle w:val="Bibliography"/>
       </w:pPr>
       <w:r>
-        <w:t xml:space="preserve">Laspeyres, Étienne. 1871.</w:t>
+        <w:t xml:space="preserve">Laspeyres, Étienne (1871).</w:t>
       </w:r>
       <w:r>
         <w:t xml:space="preserve"> </w:t>
@@ -67273,7 +66745,7 @@
         <w:pStyle w:val="Bibliography"/>
       </w:pPr>
       <w:r>
-        <w:t xml:space="preserve">Leser, Conrad E. V. 1963.</w:t>
+        <w:t xml:space="preserve">Leser, Conrad E. V. (1963).</w:t>
       </w:r>
       <w:r>
         <w:t xml:space="preserve"> </w:t>
@@ -67334,7 +66806,7 @@
         <w:pStyle w:val="Bibliography"/>
       </w:pPr>
       <w:r>
-        <w:t xml:space="preserve">Manser, Marilyn E. y Richard J. McDonald. 1988.</w:t>
+        <w:t xml:space="preserve">Manser, Marilyn E. y Richard J. McDonald (1988).</w:t>
       </w:r>
       <w:r>
         <w:t xml:space="preserve"> </w:t>
@@ -67383,7 +66855,7 @@
         <w:pStyle w:val="Bibliography"/>
       </w:pPr>
       <w:r>
-        <w:t xml:space="preserve">Marco Tulio Cicerón. s. f.</w:t>
+        <w:t xml:space="preserve">Marco Tulio Cicerón (s. f.).</w:t>
       </w:r>
       <w:r>
         <w:t xml:space="preserve"> </w:t>
@@ -67420,7 +66892,7 @@
         <w:pStyle w:val="Bibliography"/>
       </w:pPr>
       <w:r>
-        <w:t xml:space="preserve">Marshall, Alfred. 1890.</w:t>
+        <w:t xml:space="preserve">Marshall, Alfred (1890).</w:t>
       </w:r>
       <w:r>
         <w:t xml:space="preserve"> </w:t>
@@ -67457,7 +66929,7 @@
         <w:pStyle w:val="Bibliography"/>
       </w:pPr>
       <w:r>
-        <w:t xml:space="preserve">Mas-Colell, Andreu, Michael D. Whinston y Jerry R. Green. 1995.</w:t>
+        <w:t xml:space="preserve">Mas-Colell, Andreu, Michael D. Whinston y Jerry R. Green (1995).</w:t>
       </w:r>
       <w:r>
         <w:t xml:space="preserve"> </w:t>
@@ -67480,7 +66952,7 @@
         <w:pStyle w:val="Bibliography"/>
       </w:pPr>
       <w:r>
-        <w:t xml:space="preserve">Maté García, Jorge Juan y Carlos Pérez Domínguez. 2007.</w:t>
+        <w:t xml:space="preserve">Maté García, Jorge Juan y Carlos Pérez Domínguez (2007).</w:t>
       </w:r>
       <w:r>
         <w:t xml:space="preserve"> </w:t>
@@ -67503,7 +66975,7 @@
         <w:pStyle w:val="Bibliography"/>
       </w:pPr>
       <w:r>
-        <w:t xml:space="preserve">McKenzie, Lionel. 1957.</w:t>
+        <w:t xml:space="preserve">McKenzie, Lionel (1957).</w:t>
       </w:r>
       <w:r>
         <w:t xml:space="preserve"> </w:t>
@@ -67552,7 +67024,7 @@
         <w:pStyle w:val="Bibliography"/>
       </w:pPr>
       <w:r>
-        <w:t xml:space="preserve">Ministerio de Empleo y Seguridad Social. 2015.</w:t>
+        <w:t xml:space="preserve">Ministerio de Empleo y Seguridad Social (2015).</w:t>
       </w:r>
       <w:r>
         <w:t xml:space="preserve"> </w:t>
@@ -67585,7 +67057,7 @@
         <w:pStyle w:val="Bibliography"/>
       </w:pPr>
       <w:r>
-        <w:t xml:space="preserve">Ministerio de Inclusión, Seguridad Social y Migraciones. 2025.</w:t>
+        <w:t xml:space="preserve">Ministerio de Inclusión, Seguridad Social y Migraciones (2025).</w:t>
       </w:r>
       <w:r>
         <w:t xml:space="preserve"> </w:t>
@@ -67618,7 +67090,7 @@
         <w:pStyle w:val="Bibliography"/>
       </w:pPr>
       <w:r>
-        <w:t xml:space="preserve">Muellbauer, John. 1975.</w:t>
+        <w:t xml:space="preserve">Muellbauer, John (1975).</w:t>
       </w:r>
       <w:r>
         <w:t xml:space="preserve"> </w:t>
@@ -67667,7 +67139,7 @@
         <w:pStyle w:val="Bibliography"/>
       </w:pPr>
       <w:r>
-        <w:t xml:space="preserve">———. 1976.</w:t>
+        <w:t xml:space="preserve">Muellbauer, John (1976).</w:t>
       </w:r>
       <w:r>
         <w:t xml:space="preserve"> </w:t>
@@ -67716,7 +67188,7 @@
         <w:pStyle w:val="Bibliography"/>
       </w:pPr>
       <w:r>
-        <w:t xml:space="preserve">Paasche, Hermann. 1874.</w:t>
+        <w:t xml:space="preserve">Paasche, Hermann (1874).</w:t>
       </w:r>
       <w:r>
         <w:t xml:space="preserve"> </w:t>
@@ -67751,7 +67223,7 @@
         <w:pStyle w:val="Bibliography"/>
       </w:pPr>
       <w:r>
-        <w:t xml:space="preserve">Pollak, Robert A. y Terence J. Wales. 1981.</w:t>
+        <w:t xml:space="preserve">Pollak, Robert A. y Terence J. Wales (1981).</w:t>
       </w:r>
       <w:r>
         <w:t xml:space="preserve"> </w:t>
@@ -67800,7 +67272,7 @@
         <w:pStyle w:val="Bibliography"/>
       </w:pPr>
       <w:r>
-        <w:t xml:space="preserve">Rodríguez López, J. L. 2018.</w:t>
+        <w:t xml:space="preserve">Rodríguez López, J. L. (2018).</w:t>
       </w:r>
       <w:r>
         <w:t xml:space="preserve"> </w:t>
@@ -67819,7 +67291,7 @@
         <w:pStyle w:val="Bibliography"/>
       </w:pPr>
       <w:r>
-        <w:t xml:space="preserve">Roy, René. 1947.</w:t>
+        <w:t xml:space="preserve">Roy, René (1947).</w:t>
       </w:r>
       <w:r>
         <w:t xml:space="preserve"> </w:t>
@@ -67868,7 +67340,7 @@
         <w:pStyle w:val="Bibliography"/>
       </w:pPr>
       <w:r>
-        <w:t xml:space="preserve">Samuelson, Paul A. 1938.</w:t>
+        <w:t xml:space="preserve">Samuelson, Paul A. (1938).</w:t>
       </w:r>
       <w:r>
         <w:t xml:space="preserve"> </w:t>
@@ -67917,7 +67389,7 @@
         <w:pStyle w:val="Bibliography"/>
       </w:pPr>
       <w:r>
-        <w:t xml:space="preserve">———. 1948.</w:t>
+        <w:t xml:space="preserve">Samuelson, Paul A. (1948).</w:t>
       </w:r>
       <w:r>
         <w:t xml:space="preserve"> </w:t>
@@ -67966,7 +67438,7 @@
         <w:pStyle w:val="Bibliography"/>
       </w:pPr>
       <w:r>
-        <w:t xml:space="preserve">———. 1974.</w:t>
+        <w:t xml:space="preserve">Samuelson, Paul A. (1974).</w:t>
       </w:r>
       <w:r>
         <w:t xml:space="preserve"> </w:t>
@@ -68001,7 +67473,7 @@
         <w:pStyle w:val="Bibliography"/>
       </w:pPr>
       <w:r>
-        <w:t xml:space="preserve">Sanz-Sanz, José Félix y Desiderio Romero-Jordán. 2012.</w:t>
+        <w:t xml:space="preserve">Sanz-Sanz, José Félix y Desiderio Romero-Jordán (2012).</w:t>
       </w:r>
       <w:r>
         <w:t xml:space="preserve"> </w:t>
@@ -68047,7 +67519,7 @@
         <w:pStyle w:val="Bibliography"/>
       </w:pPr>
       <w:r>
-        <w:t xml:space="preserve">Shephard, Ronald W. 1953.</w:t>
+        <w:t xml:space="preserve">Shephard, Ronald W. (1953).</w:t>
       </w:r>
       <w:r>
         <w:t xml:space="preserve"> </w:t>
@@ -68070,7 +67542,7 @@
         <w:pStyle w:val="Bibliography"/>
       </w:pPr>
       <w:r>
-        <w:t xml:space="preserve">Slutsky, Eugen. 1915.</w:t>
+        <w:t xml:space="preserve">Slutsky, Eugen (1915).</w:t>
       </w:r>
       <w:r>
         <w:t xml:space="preserve"> </w:t>
@@ -68105,7 +67577,7 @@
         <w:pStyle w:val="Bibliography"/>
       </w:pPr>
       <w:r>
-        <w:t xml:space="preserve">Stone, Richard. 1954.</w:t>
+        <w:t xml:space="preserve">Stone, Richard (1954).</w:t>
       </w:r>
       <w:r>
         <w:t xml:space="preserve"> </w:t>
@@ -68154,7 +67626,7 @@
         <w:pStyle w:val="Bibliography"/>
       </w:pPr>
       <w:r>
-        <w:t xml:space="preserve">Strotz, Robert H. 1957.</w:t>
+        <w:t xml:space="preserve">Strotz, Robert H. (1957).</w:t>
       </w:r>
       <w:r>
         <w:t xml:space="preserve"> </w:t>
@@ -68203,7 +67675,7 @@
         <w:pStyle w:val="Bibliography"/>
       </w:pPr>
       <w:r>
-        <w:t xml:space="preserve">Sydsæter, Knut, Peter Hammond, Atle Seierstad y Arne Strøm. 2008.</w:t>
+        <w:t xml:space="preserve">Sydsæter, Knut, Peter Hammond, Atle Seierstad y Arne Strøm (2008).</w:t>
       </w:r>
       <w:r>
         <w:t xml:space="preserve"> </w:t>
@@ -68226,7 +67698,7 @@
         <w:pStyle w:val="Bibliography"/>
       </w:pPr>
       <w:r>
-        <w:t xml:space="preserve">The Nobel Prize. 2015.</w:t>
+        <w:t xml:space="preserve">The Nobel Prize (2015).</w:t>
       </w:r>
       <w:r>
         <w:t xml:space="preserve"> </w:t>
@@ -68259,7 +67731,7 @@
         <w:pStyle w:val="Bibliography"/>
       </w:pPr>
       <w:r>
-        <w:t xml:space="preserve">Theil, Henri. 1965.</w:t>
+        <w:t xml:space="preserve">Theil, Henri (1965).</w:t>
       </w:r>
       <w:r>
         <w:t xml:space="preserve"> </w:t>
@@ -68308,7 +67780,7 @@
         <w:pStyle w:val="Bibliography"/>
       </w:pPr>
       <w:r>
-        <w:t xml:space="preserve">Unión Europea. 2013.</w:t>
+        <w:t xml:space="preserve">Unión Europea (2013).</w:t>
       </w:r>
       <w:r>
         <w:t xml:space="preserve"> </w:t>
@@ -68341,7 +67813,7 @@
         <w:pStyle w:val="Bibliography"/>
       </w:pPr>
       <w:r>
-        <w:t xml:space="preserve">U.S. Bureau of Labor Statistics. 2026.</w:t>
+        <w:t xml:space="preserve">U.S. Bureau of Labor Statistics (2026).</w:t>
       </w:r>
       <w:r>
         <w:t xml:space="preserve"> </w:t>
@@ -68374,7 +67846,7 @@
         <w:pStyle w:val="Bibliography"/>
       </w:pPr>
       <w:r>
-        <w:t xml:space="preserve">Uzawa, Hirofumi. 1964.</w:t>
+        <w:t xml:space="preserve">Uzawa, Hirofumi (1964).</w:t>
       </w:r>
       <w:r>
         <w:t xml:space="preserve"> </w:t>
@@ -68423,7 +67895,7 @@
         <w:pStyle w:val="Bibliography"/>
       </w:pPr>
       <w:r>
-        <w:t xml:space="preserve">Veblen, Thorstein. 1899.</w:t>
+        <w:t xml:space="preserve">Veblen, Thorstein (1899).</w:t>
       </w:r>
       <w:r>
         <w:t xml:space="preserve"> </w:t>
@@ -68446,7 +67918,7 @@
         <w:pStyle w:val="Bibliography"/>
       </w:pPr>
       <w:r>
-        <w:t xml:space="preserve">Willig, Robert D. 1976.</w:t>
+        <w:t xml:space="preserve">Willig, Robert D. (1976).</w:t>
       </w:r>
       <w:r>
         <w:t xml:space="preserve"> </w:t>
@@ -68481,7 +67953,7 @@
         <w:pStyle w:val="Bibliography"/>
       </w:pPr>
       <w:r>
-        <w:t xml:space="preserve">Working, Holbrook. 1943.</w:t>
+        <w:t xml:space="preserve">Working, Holbrook (1943).</w:t>
       </w:r>
       <w:r>
         <w:t xml:space="preserve"> </w:t>
@@ -69873,16 +69345,8 @@
         </m:r>
       </m:oMath>
       <w:r>
-        <w:t xml:space="preserve">.</w:t>
-      </w:r>
-      <m:oMath>
-        <m:r>
-          <m:rPr>
-            <m:sty m:val="p"/>
-          </m:rPr>
-          <m:t>◼</m:t>
-        </m:r>
-      </m:oMath>
+        <w:t xml:space="preserve">. ∎</w:t>
+      </w:r>
     </w:p>
   </w:footnote>
   <w:footnote w:id="69">
@@ -71191,13 +70655,7 @@
           <w:rPr>
             <w:rStyle w:val="Hyperlink"/>
           </w:rPr>
-          <w:t xml:space="preserve"> </w:t>
-        </w:r>
-        <w:r>
-          <w:rPr>
-            <w:rStyle w:val="Hyperlink"/>
-          </w:rPr>
-          <w:t xml:space="preserve">1976</w:t>
+          <w:t xml:space="preserve">, 1976</w:t>
         </w:r>
       </w:hyperlink>
       <w:r>
@@ -71433,18 +70891,7 @@
         </m:sSub>
       </m:oMath>
       <w:r>
-        <w:t xml:space="preserve">.</w:t>
-      </w:r>
-      <m:oMath>
-        <m:r>
-          <m:rPr>
-            <m:sty m:val="p"/>
-          </m:rPr>
-          <m:t>◼</m:t>
-        </m:r>
-      </m:oMath>
-      <w:r>
-        <w:t xml:space="preserve">La integrabilidad solo restringe de verdad con tres bienes o más.</w:t>
+        <w:t xml:space="preserve">. ∎La integrabilidad solo restringe de verdad con tres bienes o más.</w:t>
       </w:r>
     </w:p>
   </w:footnote>
@@ -72304,16 +71751,8 @@
         </m:sSub>
       </m:oMath>
       <w:r>
-        <w:t xml:space="preserve">.</w:t>
-      </w:r>
-      <m:oMath>
-        <m:r>
-          <m:rPr>
-            <m:sty m:val="p"/>
-          </m:rPr>
-          <m:t>◼</m:t>
-        </m:r>
-      </m:oMath>
+        <w:t xml:space="preserve">. ∎</w:t>
+      </w:r>
     </w:p>
   </w:footnote>
   <w:footnote w:id="168">
@@ -73029,16 +72468,8 @@
         </m:d>
       </m:oMath>
       <w:r>
-        <w:t xml:space="preserve">: ignorar la sustitución lleva a subestimar el encarecimiento medido con la utilidad final.</w:t>
-      </w:r>
-      <m:oMath>
-        <m:r>
-          <m:rPr>
-            <m:sty m:val="p"/>
-          </m:rPr>
-          <m:t>◼</m:t>
-        </m:r>
-      </m:oMath>
+        <w:t xml:space="preserve">: ignorar la sustitución lleva a subestimar el encarecimiento medido con la utilidad final. ∎</w:t>
+      </w:r>
     </w:p>
   </w:footnote>
   <w:footnote w:id="211">
@@ -73221,16 +72652,8 @@
         </m:r>
       </m:oMath>
       <w:r>
-        <w:t xml:space="preserve">, y no queda ningún efecto sustitución.</w:t>
-      </w:r>
-      <m:oMath>
-        <m:r>
-          <m:rPr>
-            <m:sty m:val="p"/>
-          </m:rPr>
-          <m:t>◼</m:t>
-        </m:r>
-      </m:oMath>
+        <w:t xml:space="preserve">, y no queda ningún efecto sustitución. ∎</w:t>
+      </w:r>
     </w:p>
   </w:footnote>
 </w:footnotes>
@@ -74467,7 +73890,6 @@
       <w:keepNext/>
       <w:keepLines/>
       <w:spacing w:after="120" w:before="280"/>
-      <w:jc w:val="left"/>
       <w:outlineLvl w:val="0"/>
       <w:shd w:color="auto" w:fill="5F2987" w:val="clear"/>
     </w:pPr>
@@ -74494,7 +73916,6 @@
       <w:keepNext/>
       <w:keepLines/>
       <w:spacing w:after="80" w:before="240"/>
-      <w:jc w:val="left"/>
       <w:outlineLvl w:val="1"/>
       <w:pBdr>
         <w:bottom w:color="5F2987" w:space="1" w:sz="4" w:val="single"/>
@@ -74524,7 +73945,6 @@
       <w:keepLines/>
       <w:spacing w:after="80" w:before="160"/>
       <w:ind w:left="283"/>
-      <w:jc w:val="left"/>
       <w:outlineLvl w:val="2"/>
     </w:pPr>
     <w:rPr>
@@ -74551,7 +73971,6 @@
       <w:keepLines/>
       <w:spacing w:after="40" w:before="80"/>
       <w:ind w:left="567"/>
-      <w:jc w:val="left"/>
       <w:outlineLvl w:val="3"/>
     </w:pPr>
     <w:rPr>
@@ -74578,7 +73997,6 @@
       <w:keepLines/>
       <w:spacing w:after="40" w:before="80"/>
       <w:ind w:left="567"/>
-      <w:jc w:val="left"/>
       <w:outlineLvl w:val="4"/>
     </w:pPr>
     <w:rPr>
@@ -74604,7 +74022,6 @@
       <w:keepLines/>
       <w:spacing w:after="0" w:before="40"/>
       <w:ind w:left="567"/>
-      <w:jc w:val="left"/>
       <w:outlineLvl w:val="5"/>
     </w:pPr>
     <w:rPr>
@@ -75209,6 +74626,139 @@
       <w:sz w:val="20"/>
     </w:rPr>
   </w:style>
+  <w:style w:customStyle="1" w:styleId="Celdatceegrisclaro" w:type="paragraph">
+    <w:name w:val="Celda tceegrisclaro"/>
+    <w:basedOn w:val="Normal"/>
+    <w:qFormat/>
+    <w:pPr>
+      <w:spacing w:after="0"/>
+      <w:jc w:val="center"/>
+      <w:shd w:color="auto" w:fill="E7E6E6" w:val="clear"/>
+    </w:pPr>
+    <w:rPr>
+      <w:rFonts w:ascii="Palatino Linotype" w:cs="Palatino Linotype" w:eastAsia="Palatino Linotype" w:hAnsi="Palatino Linotype"/>
+      <w:sz w:val="20"/>
+    </w:rPr>
+  </w:style>
+  <w:style w:customStyle="1" w:styleId="Celdatceecrema" w:type="paragraph">
+    <w:name w:val="Celda tceecrema"/>
+    <w:basedOn w:val="Normal"/>
+    <w:qFormat/>
+    <w:pPr>
+      <w:spacing w:after="0"/>
+      <w:jc w:val="center"/>
+      <w:shd w:color="auto" w:fill="FAF9F6" w:val="clear"/>
+    </w:pPr>
+    <w:rPr>
+      <w:rFonts w:ascii="Palatino Linotype" w:cs="Palatino Linotype" w:eastAsia="Palatino Linotype" w:hAnsi="Palatino Linotype"/>
+      <w:sz w:val="20"/>
+    </w:rPr>
+  </w:style>
+  <w:style w:customStyle="1" w:styleId="Celdatceemorado" w:type="paragraph">
+    <w:name w:val="Celda tceemorado"/>
+    <w:basedOn w:val="Normal"/>
+    <w:qFormat/>
+    <w:pPr>
+      <w:spacing w:after="0"/>
+      <w:jc w:val="center"/>
+      <w:shd w:color="auto" w:fill="5F2987" w:val="clear"/>
+    </w:pPr>
+    <w:rPr>
+      <w:rFonts w:ascii="Palatino Linotype" w:cs="Palatino Linotype" w:eastAsia="Palatino Linotype" w:hAnsi="Palatino Linotype"/>
+      <w:color w:val="FFFFFF"/>
+      <w:sz w:val="20"/>
+    </w:rPr>
+  </w:style>
+  <w:style w:customStyle="1" w:styleId="Celdatceeverde" w:type="paragraph">
+    <w:name w:val="Celda tceeverde"/>
+    <w:basedOn w:val="Normal"/>
+    <w:qFormat/>
+    <w:pPr>
+      <w:spacing w:after="0"/>
+      <w:jc w:val="center"/>
+      <w:shd w:color="auto" w:fill="3C7D3A" w:val="clear"/>
+    </w:pPr>
+    <w:rPr>
+      <w:rFonts w:ascii="Palatino Linotype" w:cs="Palatino Linotype" w:eastAsia="Palatino Linotype" w:hAnsi="Palatino Linotype"/>
+      <w:color w:val="FFFFFF"/>
+      <w:sz w:val="20"/>
+    </w:rPr>
+  </w:style>
+  <w:style w:customStyle="1" w:styleId="Celdatceeazul" w:type="paragraph">
+    <w:name w:val="Celda tceeazul"/>
+    <w:basedOn w:val="Normal"/>
+    <w:qFormat/>
+    <w:pPr>
+      <w:spacing w:after="0"/>
+      <w:jc w:val="center"/>
+      <w:shd w:color="auto" w:fill="1F5F99" w:val="clear"/>
+    </w:pPr>
+    <w:rPr>
+      <w:rFonts w:ascii="Palatino Linotype" w:cs="Palatino Linotype" w:eastAsia="Palatino Linotype" w:hAnsi="Palatino Linotype"/>
+      <w:color w:val="FFFFFF"/>
+      <w:sz w:val="20"/>
+    </w:rPr>
+  </w:style>
+  <w:style w:customStyle="1" w:styleId="Celdatceerojo" w:type="paragraph">
+    <w:name w:val="Celda tceerojo"/>
+    <w:basedOn w:val="Normal"/>
+    <w:qFormat/>
+    <w:pPr>
+      <w:spacing w:after="0"/>
+      <w:jc w:val="center"/>
+      <w:shd w:color="auto" w:fill="B22222" w:val="clear"/>
+    </w:pPr>
+    <w:rPr>
+      <w:rFonts w:ascii="Palatino Linotype" w:cs="Palatino Linotype" w:eastAsia="Palatino Linotype" w:hAnsi="Palatino Linotype"/>
+      <w:color w:val="FFFFFF"/>
+      <w:sz w:val="20"/>
+    </w:rPr>
+  </w:style>
+  <w:style w:customStyle="1" w:styleId="Celdatceedorado" w:type="paragraph">
+    <w:name w:val="Celda tceedorado"/>
+    <w:basedOn w:val="Normal"/>
+    <w:qFormat/>
+    <w:pPr>
+      <w:spacing w:after="0"/>
+      <w:jc w:val="center"/>
+      <w:shd w:color="auto" w:fill="B8860B" w:val="clear"/>
+    </w:pPr>
+    <w:rPr>
+      <w:rFonts w:ascii="Palatino Linotype" w:cs="Palatino Linotype" w:eastAsia="Palatino Linotype" w:hAnsi="Palatino Linotype"/>
+      <w:color w:val="FFFFFF"/>
+      <w:sz w:val="20"/>
+    </w:rPr>
+  </w:style>
+  <w:style w:customStyle="1" w:styleId="Celdatceenaranja" w:type="paragraph">
+    <w:name w:val="Celda tceenaranja"/>
+    <w:basedOn w:val="Normal"/>
+    <w:qFormat/>
+    <w:pPr>
+      <w:spacing w:after="0"/>
+      <w:jc w:val="center"/>
+      <w:shd w:color="auto" w:fill="E07B28" w:val="clear"/>
+    </w:pPr>
+    <w:rPr>
+      <w:rFonts w:ascii="Palatino Linotype" w:cs="Palatino Linotype" w:eastAsia="Palatino Linotype" w:hAnsi="Palatino Linotype"/>
+      <w:color w:val="FFFFFF"/>
+      <w:sz w:val="20"/>
+    </w:rPr>
+  </w:style>
+  <w:style w:customStyle="1" w:styleId="Celdatceegris" w:type="paragraph">
+    <w:name w:val="Celda tceegris"/>
+    <w:basedOn w:val="Normal"/>
+    <w:qFormat/>
+    <w:pPr>
+      <w:spacing w:after="0"/>
+      <w:jc w:val="center"/>
+      <w:shd w:color="auto" w:fill="767171" w:val="clear"/>
+    </w:pPr>
+    <w:rPr>
+      <w:rFonts w:ascii="Palatino Linotype" w:cs="Palatino Linotype" w:eastAsia="Palatino Linotype" w:hAnsi="Palatino Linotype"/>
+      <w:color w:val="FFFFFF"/>
+      <w:sz w:val="20"/>
+    </w:rPr>
+  </w:style>
   <w:style w:customStyle="1" w:styleId="Textomorado" w:type="character">
     <w:name w:val="Texto morado"/>
     <w:rPr>

</xml_diff>

<commit_message>
Refranes en el 3.A.9, el 3.A.11, el 3.A.12 y el 3.A.15 (enganche e idea final)
A falta de pan, buenas son tortas; la unión hace la fuerza frente a muchas
manos en un plato; la práctica hace al maestro; hazlo tú mismo frente a
zapatero, a tus zapatos.

Co-Authored-By: Claude Opus 5.5 <noreply@anthropic.com>
Claude-Session: https://claude.ai/code/session_01PWJgAjs4PN1Rvp3aLA4tqT
</commit_message>
<xml_diff>
--- a/oposicion/temario/tercer-ejercicio/3A09.docx
+++ b/oposicion/temario/tercer-ejercicio/3A09.docx
@@ -83,6 +83,17 @@
       </w:r>
       <w:r>
         <w:t xml:space="preserve">:</w:t>
+      </w:r>
+    </w:p>
+    <w:p>
+      <w:pPr>
+        <w:numPr>
+          <w:ilvl w:val="1"/>
+          <w:numId w:val="1002"/>
+        </w:numPr>
+      </w:pPr>
+      <w:r>
+        <w:t xml:space="preserve">«A falta de pan, buenas son tortas», dice el refrán: cuando algo falta o se encarece, uno se apaña con otra cosa y puede quedar casi igual de bien.</w:t>
       </w:r>
     </w:p>
     <w:p>
@@ -51600,7 +51611,7 @@
         <w:t xml:space="preserve"> </w:t>
       </w:r>
       <w:r>
-        <w:t xml:space="preserve">ignora que el consumidor sustituye lo que se encarece; si es distinta, puede quedarse corta, y la compensación exacta es la variación compensatoria. Lo que esa traducción no permite es sumar el bienestar de personas distintas: para eso hacen falta juicios de valor, y ahí empieza la economía del bienestar.</w:t>
+        <w:t xml:space="preserve">ignora que el consumidor sustituye lo que se encarece: a falta de pan, buenas son tortas; si es distinta, puede quedarse corta, y la compensación exacta es la variación compensatoria. Lo que esa traducción no permite es sumar el bienestar de personas distintas: para eso hacen falta juicios de valor, y ahí empieza la economía del bienestar.</w:t>
       </w:r>
     </w:p>
     <w:p>

</xml_diff>

<commit_message>
3.A.20 con el Word de Víctor (antiguo 3.A.25) y «§» bien en HTML y Word
- 3.A.20: se integra el Word original de Víctor (su antiguo 3.A.25, «Teoría
  de la regulación. Implicación sobre la liberalización de los sectores») en
  la estructura ya revisada, por decisión suya: motivos de la regulación con
  la tabla de Baldwin, Cave y Lodge, su algoritmo de Braeutigam, liberalización
  e industrias de red (CTC, ECPR, 5 formas de separación vertical con
  Exolum, ADIF-Renfe, Aena y Telefónica al día) y un anexo con sus notas de
  economía del bienestar que no están en el 3.A.23. Se conservan sus fuentes,
  buscadas a fondo; las no identificadas, en «Dudas abiertas». 43 págs. de tema.
- latex/tcee.csl: «§» en los localizadores ya no sale «párr.» en HTML y Word;
  reconstruidos los 17 temas revisados (0 errores).
- Canon: mapa del 3.A.20 con fuente «otro-titulo».

Co-Authored-By: Claude Opus 5.5 <noreply@anthropic.com>
Claude-Session: https://claude.ai/code/session_01GHmnmpZ4KoguEZPymyjyrT
</commit_message>
<xml_diff>
--- a/oposicion/temario/tercer-ejercicio/3A09.docx
+++ b/oposicion/temario/tercer-ejercicio/3A09.docx
@@ -31683,7 +31683,7 @@
           <w:rPr>
             <w:rStyle w:val="Hyperlink"/>
           </w:rPr>
-          <w:t xml:space="preserve">, 1995, párr. 3.H</w:t>
+          <w:t xml:space="preserve">, 1995, § 3.H</w:t>
         </w:r>
       </w:hyperlink>
       <w:r>
@@ -33402,7 +33402,7 @@
           <w:rPr>
             <w:rStyle w:val="Hyperlink"/>
           </w:rPr>
-          <w:t xml:space="preserve">, 1995, párr. 3.H</w:t>
+          <w:t xml:space="preserve">, 1995, § 3.H</w:t>
         </w:r>
       </w:hyperlink>
       <w:r>
@@ -34293,7 +34293,7 @@
           <w:rPr>
             <w:rStyle w:val="Hyperlink"/>
           </w:rPr>
-          <w:t xml:space="preserve">, 1995, párr. 3.H</w:t>
+          <w:t xml:space="preserve">, 1995, § 3.H</w:t>
         </w:r>
       </w:hyperlink>
       <w:r>
@@ -34467,7 +34467,7 @@
           <w:rPr>
             <w:rStyle w:val="Hyperlink"/>
           </w:rPr>
-          <w:t xml:space="preserve">1995, párr. 3.H</w:t>
+          <w:t xml:space="preserve">1995, § 3.H</w:t>
         </w:r>
       </w:hyperlink>
       <w:r>
@@ -38733,7 +38733,7 @@
             <w:i/>
             <w:iCs/>
           </w:rPr>
-          <w:t xml:space="preserve">1995, párr. 2.E</w:t>
+          <w:t xml:space="preserve">1995, § 2.E</w:t>
         </w:r>
       </w:hyperlink>
       <w:r>
@@ -40888,7 +40888,7 @@
             <w:i/>
             <w:iCs/>
           </w:rPr>
-          <w:t xml:space="preserve">1995, párr. 3.G</w:t>
+          <w:t xml:space="preserve">1995, § 3.G</w:t>
         </w:r>
       </w:hyperlink>
       <w:r>
@@ -42638,7 +42638,7 @@
           <w:rPr>
             <w:rStyle w:val="Hyperlink"/>
           </w:rPr>
-          <w:t xml:space="preserve">1995, párr. 3.I</w:t>
+          <w:t xml:space="preserve">1995, § 3.I</w:t>
         </w:r>
       </w:hyperlink>
       <w:r>
@@ -43213,7 +43213,7 @@
           <w:rPr>
             <w:rStyle w:val="Hyperlink"/>
           </w:rPr>
-          <w:t xml:space="preserve">, 1995, párr. 3.I</w:t>
+          <w:t xml:space="preserve">, 1995, § 3.I</w:t>
         </w:r>
       </w:hyperlink>
       <w:r>
@@ -44838,7 +44838,7 @@
           <w:rPr>
             <w:rStyle w:val="Hyperlink"/>
           </w:rPr>
-          <w:t xml:space="preserve">1995, párr. 3.I</w:t>
+          <w:t xml:space="preserve">1995, § 3.I</w:t>
         </w:r>
       </w:hyperlink>
       <w:r>
@@ -45886,7 +45886,7 @@
           <w:rPr>
             <w:rStyle w:val="Hyperlink"/>
           </w:rPr>
-          <w:t xml:space="preserve">1995, párr. 3.I</w:t>
+          <w:t xml:space="preserve">1995, § 3.I</w:t>
         </w:r>
       </w:hyperlink>
       <w:r>
@@ -46189,7 +46189,7 @@
           <w:rPr>
             <w:rStyle w:val="Hyperlink"/>
           </w:rPr>
-          <w:t xml:space="preserve">1995, párr. 3.I</w:t>
+          <w:t xml:space="preserve">1995, § 3.I</w:t>
         </w:r>
       </w:hyperlink>
       <w:r>
@@ -46920,7 +46920,7 @@
           <w:rPr>
             <w:rStyle w:val="Hyperlink"/>
           </w:rPr>
-          <w:t xml:space="preserve">, 1995, párr. 3.I</w:t>
+          <w:t xml:space="preserve">, 1995, § 3.I</w:t>
         </w:r>
       </w:hyperlink>
       <w:r>
@@ -47180,7 +47180,7 @@
           <w:rPr>
             <w:rStyle w:val="Hyperlink"/>
           </w:rPr>
-          <w:t xml:space="preserve">, 1995, párr. 3.I</w:t>
+          <w:t xml:space="preserve">, 1995, § 3.I</w:t>
         </w:r>
       </w:hyperlink>
       <w:r>
@@ -50370,7 +50370,7 @@
           <w:rPr>
             <w:rStyle w:val="Hyperlink"/>
           </w:rPr>
-          <w:t xml:space="preserve">1995, párr. 3.I</w:t>
+          <w:t xml:space="preserve">1995, § 3.I</w:t>
         </w:r>
       </w:hyperlink>
       <w:r>
@@ -54911,7 +54911,7 @@
             <w:i/>
             <w:iCs/>
           </w:rPr>
-          <w:t xml:space="preserve">1995, párr. 3.D</w:t>
+          <w:t xml:space="preserve">1995, § 3.D</w:t>
         </w:r>
       </w:hyperlink>
       <w:r>
@@ -63736,7 +63736,7 @@
             <w:i/>
             <w:iCs/>
           </w:rPr>
-          <w:t xml:space="preserve">1995, párr. 3.I</w:t>
+          <w:t xml:space="preserve">1995, § 3.I</w:t>
         </w:r>
       </w:hyperlink>
       <w:r>

</xml_diff>

<commit_message>
Temas revisados 3.A.8–3.A.24 reconstruidos como materiales exclusivos: aviso de uso personal en la portada, pie en todas las páginas y metadatos de derechos en PDF, ficha, HTML y Word (sin licencia CC); el Word recibe el aviso y el pie (retocar_docx con exclusivo)
Co-Authored-By: Claude Fable 5.1 <noreply@anthropic.com>
Claude-Session: https://claude.ai/code/session_01Dzabsd2LJUK2frr82oAaU7
</commit_message>
<xml_diff>
--- a/oposicion/temario/tercer-ejercicio/3A09.docx
+++ b/oposicion/temario/tercer-ejercicio/3A09.docx
@@ -20,6 +20,28 @@
       </w:r>
       <w:r>
         <w:t xml:space="preserve">en estudios empíricos. Medidas de cambio en el bienestar.</w:t>
+      </w:r>
+    </w:p>
+    <w:p>
+      <w:pPr>
+        <w:spacing w:before="0" w:after="200"/>
+      </w:pPr>
+      <w:r>
+        <w:rPr>
+          <w:b/>
+          <w:smallCaps/>
+          <w:color w:val="5F2987"/>
+          <w:sz w:val="16"/>
+        </w:rPr>
+        <w:t xml:space="preserve">Exclusivo · uso personal. </w:t>
+      </w:r>
+      <w:r>
+        <w:rPr>
+          <w:i/>
+          <w:color w:val="767171"/>
+          <w:sz w:val="16"/>
+        </w:rPr>
+        <w:t xml:space="preserve">Material exclusivo de victorgutierrezmarcos.es y la app Oposición TCEE · DCE. Puedes usarlo libremente para tu estudio personal. No se autoriza su incorporación a otras plataformas, aplicaciones o servicios. Condiciones: https://www.victorgutierrezmarcos.es/condiciones-materiales.html</w:t>
       </w:r>
     </w:p>
     <w:p>
@@ -69297,7 +69319,7 @@
         <w:color w:val="767171"/>
         <w:sz w:val="14"/>
       </w:rPr>
-      <w:t xml:space="preserve">© 2026 Víctor Gutiérrez Marcos · CC BY-NC-ND 4.0</w:t>
+      <w:t xml:space="preserve">© 2026 Víctor Gutiérrez Marcos · Exclusivo de victorgutierrezmarcos.es y la app Oposición TCEE · DCE</w:t>
     </w:r>
     <w:r>
       <w:tab/>
@@ -69355,7 +69377,7 @@
         <w:color w:val="767171"/>
         <w:sz w:val="14"/>
       </w:rPr>
-      <w:t xml:space="preserve">© 2026 Víctor Gutiérrez Marcos · CC BY-NC-ND 4.0</w:t>
+      <w:t xml:space="preserve">© 2026 Víctor Gutiérrez Marcos · Exclusivo de victorgutierrezmarcos.es y la app Oposición TCEE · DCE</w:t>
     </w:r>
     <w:r>
       <w:tab/>
@@ -69421,7 +69443,7 @@
         <w:color w:val="767171"/>
         <w:sz w:val="14"/>
       </w:rPr>
-      <w:t xml:space="preserve">© 2026 Víctor Gutiérrez Marcos · CC BY-NC-ND 4.0</w:t>
+      <w:t xml:space="preserve">© 2026 Víctor Gutiérrez Marcos · Exclusivo de victorgutierrezmarcos.es y la app Oposición TCEE · DCE</w:t>
     </w:r>
     <w:r>
       <w:tab/>

</xml_diff>